<commit_message>
Worked on Idea 2 for curve comparison
</commit_message>
<xml_diff>
--- a/Results/Mitosections/results_report_mitochondria_alcohol_mitosections.docx
+++ b/Results/Mitosections/results_report_mitochondria_alcohol_mitosections.docx
@@ -65,19 +65,13 @@
       <w:r>
         <w:t xml:space="preserve">Dahlmanns</w:t>
       </w:r>
-      <w:r>
-        <w:t xml:space="preserve"> </w:t>
-      </w:r>
-      <w:r>
-        <w:t xml:space="preserve">2</w:t>
-      </w:r>
     </w:p>
     <w:p>
       <w:pPr>
         <w:pStyle w:val="Datum"/>
       </w:pPr>
       <w:r>
-        <w:t xml:space="preserve">2023-03-31</w:t>
+        <w:t xml:space="preserve">2023-04-06</w:t>
       </w:r>
     </w:p>
     <w:bookmarkStart w:id="28" w:name="introduction"/>
@@ -92,6 +86,14 @@
     <w:p>
       <w:pPr>
         <w:pStyle w:val="FirstParagraph"/>
+      </w:pPr>
+      <w:r>
+        <w:t xml:space="preserve">[1]</w:t>
+      </w:r>
+    </w:p>
+    <w:p>
+      <w:pPr>
+        <w:pStyle w:val="Textkrper"/>
       </w:pPr>
       <w:r>
         <w:t xml:space="preserve">We analyzed the distribution of mitochondria in the soma of neurons. We used dissociated neuronal cultures that were treated under different conditions prior to fixation, staining and imaging (</w:t>
@@ -268,12 +270,12 @@
     <w:tbl>
       <w:tblPr>
         <w:tblStyle w:val="Table"/>
-        <w:tblW w:type="auto" w:w="0"/>
+        <w:tblW w:type="pct" w:w="2014"/>
         <w:tblLook w:firstRow="1" w:lastRow="0" w:firstColumn="0" w:lastColumn="0" w:noHBand="0" w:noVBand="0" w:val="0020"/>
       </w:tblPr>
       <w:tblGrid>
-        <w:gridCol w:w="3960"/>
-        <w:gridCol w:w="3960"/>
+        <w:gridCol w:w="2750"/>
+        <w:gridCol w:w="440"/>
       </w:tblGrid>
       <w:tr>
         <w:trPr>
@@ -284,7 +286,7 @@
           <w:p>
             <w:pPr>
               <w:pStyle w:val="Compact"/>
-              <w:jc w:val="left"/>
+              <w:jc w:val="center"/>
             </w:pPr>
             <w:r>
               <w:t xml:space="preserve">condition</w:t>
@@ -296,7 +298,7 @@
           <w:p>
             <w:pPr>
               <w:pStyle w:val="Compact"/>
-              <w:jc w:val="right"/>
+              <w:jc w:val="center"/>
             </w:pPr>
             <w:r>
               <w:t xml:space="preserve">n</w:t>
@@ -310,7 +312,7 @@
           <w:p>
             <w:pPr>
               <w:pStyle w:val="Compact"/>
-              <w:jc w:val="left"/>
+              <w:jc w:val="center"/>
             </w:pPr>
             <w:r>
               <w:t xml:space="preserve">Activin 50ng/ml 14days</w:t>
@@ -322,7 +324,7 @@
           <w:p>
             <w:pPr>
               <w:pStyle w:val="Compact"/>
-              <w:jc w:val="right"/>
+              <w:jc w:val="center"/>
             </w:pPr>
             <w:r>
               <w:t xml:space="preserve">5</w:t>
@@ -336,7 +338,7 @@
           <w:p>
             <w:pPr>
               <w:pStyle w:val="Compact"/>
-              <w:jc w:val="left"/>
+              <w:jc w:val="center"/>
             </w:pPr>
             <w:r>
               <w:t xml:space="preserve">Activin 50ng/ml 2days</w:t>
@@ -348,7 +350,7 @@
           <w:p>
             <w:pPr>
               <w:pStyle w:val="Compact"/>
-              <w:jc w:val="right"/>
+              <w:jc w:val="center"/>
             </w:pPr>
             <w:r>
               <w:t xml:space="preserve">5</w:t>
@@ -362,7 +364,7 @@
           <w:p>
             <w:pPr>
               <w:pStyle w:val="Compact"/>
-              <w:jc w:val="left"/>
+              <w:jc w:val="center"/>
             </w:pPr>
             <w:r>
               <w:t xml:space="preserve">Control 14days</w:t>
@@ -374,7 +376,7 @@
           <w:p>
             <w:pPr>
               <w:pStyle w:val="Compact"/>
-              <w:jc w:val="right"/>
+              <w:jc w:val="center"/>
             </w:pPr>
             <w:r>
               <w:t xml:space="preserve">5</w:t>
@@ -627,7 +629,7 @@
       </w:r>
     </w:p>
     <w:bookmarkEnd w:id="40"/>
-    <w:bookmarkStart w:id="49" w:name="statistical-comparison"/>
+    <w:bookmarkStart w:id="52" w:name="statistical-comparison"/>
     <w:p>
       <w:pPr>
         <w:pStyle w:val="berschrift2"/>
@@ -762,7 +764,7 @@
       </w:r>
     </w:p>
     <w:bookmarkEnd w:id="47"/>
-    <w:bookmarkStart w:id="48" w:name="idea2"/>
+    <w:bookmarkStart w:id="51" w:name="idea2"/>
     <w:p>
       <w:pPr>
         <w:pStyle w:val="berschrift3"/>
@@ -776,22 +778,1643 @@
         <w:pStyle w:val="FirstParagraph"/>
       </w:pPr>
       <w:r>
-        <w:t xml:space="preserve">Asses the distribution shape through correlation and the mitochondria density through t-test/anova of the local maxima or through residuals</w:t>
+        <w:t xml:space="preserve">The original paper compared the different distributions by dividing them up into 10 sections (0-0.1 distance from the nucleus, 0.1-0.2, 0.2-0.3,…). Within each section, values are averaged and statistically compared through t-test or anova.</w:t>
       </w:r>
     </w:p>
-    <w:bookmarkEnd w:id="48"/>
-    <w:bookmarkEnd w:id="49"/>
-    <w:bookmarkStart w:id="53" w:name="references"/>
     <w:p>
       <w:pPr>
+        <w:pStyle w:val="CaptionedFigure"/>
+      </w:pPr>
+      <w:r>
+        <w:drawing>
+          <wp:inline>
+            <wp:extent cx="5969000" cy="4178300"/>
+            <wp:effectExtent b="0" l="0" r="0" t="0"/>
+            <wp:docPr descr="Correlation of the different curves" title="" id="49" name="Picture"/>
+            <a:graphic>
+              <a:graphicData uri="http://schemas.openxmlformats.org/drawingml/2006/picture">
+                <pic:pic>
+                  <pic:nvPicPr>
+                    <pic:cNvPr descr="results_report_mitochondria_alcohol_mitosections_files/figure-docx/comparison_of_curve_sections-1.png" id="50" name="Picture"/>
+                    <pic:cNvPicPr>
+                      <a:picLocks noChangeArrowheads="1" noChangeAspect="1"/>
+                    </pic:cNvPicPr>
+                  </pic:nvPicPr>
+                  <pic:blipFill>
+                    <a:blip r:embed="rId48"/>
+                    <a:stretch>
+                      <a:fillRect/>
+                    </a:stretch>
+                  </pic:blipFill>
+                  <pic:spPr bwMode="auto">
+                    <a:xfrm>
+                      <a:off x="0" y="0"/>
+                      <a:ext cx="5969000" cy="4178300"/>
+                    </a:xfrm>
+                    <a:prstGeom prst="rect">
+                      <a:avLst/>
+                    </a:prstGeom>
+                    <a:noFill/>
+                    <a:ln w="9525">
+                      <a:noFill/>
+                      <a:headEnd/>
+                      <a:tailEnd/>
+                    </a:ln>
+                  </pic:spPr>
+                </pic:pic>
+              </a:graphicData>
+            </a:graphic>
+          </wp:inline>
+        </w:drawing>
+      </w:r>
+    </w:p>
+    <w:p>
+      <w:pPr>
+        <w:pStyle w:val="ImageCaption"/>
+      </w:pPr>
+      <w:r>
+        <w:t xml:space="preserve">Correlation of the different curves</w:t>
+      </w:r>
+    </w:p>
+    <w:tbl>
+      <w:tblPr>
+        <w:tblStyle w:val="Table"/>
+        <w:tblW w:type="pct" w:w="4236"/>
+        <w:tblLook w:firstRow="1" w:lastRow="0" w:firstColumn="0" w:lastColumn="0" w:noHBand="0" w:noVBand="0" w:val="0020"/>
+      </w:tblPr>
+      <w:tblGrid>
+        <w:gridCol w:w="1100"/>
+        <w:gridCol w:w="3410"/>
+        <w:gridCol w:w="1100"/>
+        <w:gridCol w:w="1100"/>
+      </w:tblGrid>
+      <w:tr>
+        <w:trPr>
+          <w:tblHeader w:val="true"/>
+        </w:trPr>
+        <w:tc>
+          <w:tcPr/>
+          <w:p>
+            <w:pPr>
+              <w:pStyle w:val="Compact"/>
+              <w:jc w:val="center"/>
+            </w:pPr>
+            <w:r>
+              <w:t xml:space="preserve">section</w:t>
+            </w:r>
+          </w:p>
+        </w:tc>
+        <w:tc>
+          <w:tcPr/>
+          <w:p>
+            <w:pPr>
+              <w:pStyle w:val="Compact"/>
+              <w:jc w:val="center"/>
+            </w:pPr>
+            <w:r>
+              <w:t xml:space="preserve">condition</w:t>
+            </w:r>
+          </w:p>
+        </w:tc>
+        <w:tc>
+          <w:tcPr/>
+          <w:p>
+            <w:pPr>
+              <w:pStyle w:val="Compact"/>
+              <w:jc w:val="center"/>
+            </w:pPr>
+            <w:r>
+              <w:t xml:space="preserve">mean</w:t>
+            </w:r>
+          </w:p>
+        </w:tc>
+        <w:tc>
+          <w:tcPr/>
+          <w:p>
+            <w:pPr>
+              <w:pStyle w:val="Compact"/>
+              <w:jc w:val="center"/>
+            </w:pPr>
+            <w:r>
+              <w:t xml:space="preserve">sd</w:t>
+            </w:r>
+          </w:p>
+        </w:tc>
+      </w:tr>
+      <w:tr>
+        <w:tc>
+          <w:tcPr/>
+          <w:p>
+            <w:pPr>
+              <w:pStyle w:val="Compact"/>
+              <w:jc w:val="center"/>
+            </w:pPr>
+            <w:r>
+              <w:t xml:space="preserve">1</w:t>
+            </w:r>
+          </w:p>
+        </w:tc>
+        <w:tc>
+          <w:tcPr/>
+          <w:p>
+            <w:pPr>
+              <w:pStyle w:val="Compact"/>
+              <w:jc w:val="center"/>
+            </w:pPr>
+            <w:r>
+              <w:t xml:space="preserve">Activin 50ng/ml 14days (n=5)</w:t>
+            </w:r>
+          </w:p>
+        </w:tc>
+        <w:tc>
+          <w:tcPr/>
+          <w:p>
+            <w:pPr>
+              <w:pStyle w:val="Compact"/>
+              <w:jc w:val="center"/>
+            </w:pPr>
+            <w:r>
+              <w:t xml:space="preserve">0.5769</w:t>
+            </w:r>
+          </w:p>
+        </w:tc>
+        <w:tc>
+          <w:tcPr/>
+          <w:p>
+            <w:pPr>
+              <w:pStyle w:val="Compact"/>
+              <w:jc w:val="center"/>
+            </w:pPr>
+            <w:r>
+              <w:t xml:space="preserve">0.0311</w:t>
+            </w:r>
+          </w:p>
+        </w:tc>
+      </w:tr>
+      <w:tr>
+        <w:tc>
+          <w:tcPr/>
+          <w:p>
+            <w:pPr>
+              <w:pStyle w:val="Compact"/>
+              <w:jc w:val="center"/>
+            </w:pPr>
+            <w:r>
+              <w:t xml:space="preserve">1</w:t>
+            </w:r>
+          </w:p>
+        </w:tc>
+        <w:tc>
+          <w:tcPr/>
+          <w:p>
+            <w:pPr>
+              <w:pStyle w:val="Compact"/>
+              <w:jc w:val="center"/>
+            </w:pPr>
+            <w:r>
+              <w:t xml:space="preserve">Activin 50ng/ml 2days (n=5)</w:t>
+            </w:r>
+          </w:p>
+        </w:tc>
+        <w:tc>
+          <w:tcPr/>
+          <w:p>
+            <w:pPr>
+              <w:pStyle w:val="Compact"/>
+              <w:jc w:val="center"/>
+            </w:pPr>
+            <w:r>
+              <w:t xml:space="preserve">0.4855</w:t>
+            </w:r>
+          </w:p>
+        </w:tc>
+        <w:tc>
+          <w:tcPr/>
+          <w:p>
+            <w:pPr>
+              <w:pStyle w:val="Compact"/>
+              <w:jc w:val="center"/>
+            </w:pPr>
+            <w:r>
+              <w:t xml:space="preserve">0.1093</w:t>
+            </w:r>
+          </w:p>
+        </w:tc>
+      </w:tr>
+      <w:tr>
+        <w:tc>
+          <w:tcPr/>
+          <w:p>
+            <w:pPr>
+              <w:pStyle w:val="Compact"/>
+              <w:jc w:val="center"/>
+            </w:pPr>
+            <w:r>
+              <w:t xml:space="preserve">1</w:t>
+            </w:r>
+          </w:p>
+        </w:tc>
+        <w:tc>
+          <w:tcPr/>
+          <w:p>
+            <w:pPr>
+              <w:pStyle w:val="Compact"/>
+              <w:jc w:val="center"/>
+            </w:pPr>
+            <w:r>
+              <w:t xml:space="preserve">Control 14days (n=5)</w:t>
+            </w:r>
+          </w:p>
+        </w:tc>
+        <w:tc>
+          <w:tcPr/>
+          <w:p>
+            <w:pPr>
+              <w:pStyle w:val="Compact"/>
+              <w:jc w:val="center"/>
+            </w:pPr>
+            <w:r>
+              <w:t xml:space="preserve">0.5815</w:t>
+            </w:r>
+          </w:p>
+        </w:tc>
+        <w:tc>
+          <w:tcPr/>
+          <w:p>
+            <w:pPr>
+              <w:pStyle w:val="Compact"/>
+              <w:jc w:val="center"/>
+            </w:pPr>
+            <w:r>
+              <w:t xml:space="preserve">0.112</w:t>
+            </w:r>
+          </w:p>
+        </w:tc>
+      </w:tr>
+      <w:tr>
+        <w:tc>
+          <w:tcPr/>
+          <w:p>
+            <w:pPr>
+              <w:pStyle w:val="Compact"/>
+              <w:jc w:val="center"/>
+            </w:pPr>
+            <w:r>
+              <w:t xml:space="preserve">2</w:t>
+            </w:r>
+          </w:p>
+        </w:tc>
+        <w:tc>
+          <w:tcPr/>
+          <w:p>
+            <w:pPr>
+              <w:pStyle w:val="Compact"/>
+              <w:jc w:val="center"/>
+            </w:pPr>
+            <w:r>
+              <w:t xml:space="preserve">Activin 50ng/ml 14days (n=5)</w:t>
+            </w:r>
+          </w:p>
+        </w:tc>
+        <w:tc>
+          <w:tcPr/>
+          <w:p>
+            <w:pPr>
+              <w:pStyle w:val="Compact"/>
+              <w:jc w:val="center"/>
+            </w:pPr>
+            <w:r>
+              <w:t xml:space="preserve">0.6648</w:t>
+            </w:r>
+          </w:p>
+        </w:tc>
+        <w:tc>
+          <w:tcPr/>
+          <w:p>
+            <w:pPr>
+              <w:pStyle w:val="Compact"/>
+              <w:jc w:val="center"/>
+            </w:pPr>
+            <w:r>
+              <w:t xml:space="preserve">0.08714</w:t>
+            </w:r>
+          </w:p>
+        </w:tc>
+      </w:tr>
+      <w:tr>
+        <w:tc>
+          <w:tcPr/>
+          <w:p>
+            <w:pPr>
+              <w:pStyle w:val="Compact"/>
+              <w:jc w:val="center"/>
+            </w:pPr>
+            <w:r>
+              <w:t xml:space="preserve">2</w:t>
+            </w:r>
+          </w:p>
+        </w:tc>
+        <w:tc>
+          <w:tcPr/>
+          <w:p>
+            <w:pPr>
+              <w:pStyle w:val="Compact"/>
+              <w:jc w:val="center"/>
+            </w:pPr>
+            <w:r>
+              <w:t xml:space="preserve">Activin 50ng/ml 2days (n=5)</w:t>
+            </w:r>
+          </w:p>
+        </w:tc>
+        <w:tc>
+          <w:tcPr/>
+          <w:p>
+            <w:pPr>
+              <w:pStyle w:val="Compact"/>
+              <w:jc w:val="center"/>
+            </w:pPr>
+            <w:r>
+              <w:t xml:space="preserve">0.4952</w:t>
+            </w:r>
+          </w:p>
+        </w:tc>
+        <w:tc>
+          <w:tcPr/>
+          <w:p>
+            <w:pPr>
+              <w:pStyle w:val="Compact"/>
+              <w:jc w:val="center"/>
+            </w:pPr>
+            <w:r>
+              <w:t xml:space="preserve">0.1386</w:t>
+            </w:r>
+          </w:p>
+        </w:tc>
+      </w:tr>
+      <w:tr>
+        <w:tc>
+          <w:tcPr/>
+          <w:p>
+            <w:pPr>
+              <w:pStyle w:val="Compact"/>
+              <w:jc w:val="center"/>
+            </w:pPr>
+            <w:r>
+              <w:t xml:space="preserve">2</w:t>
+            </w:r>
+          </w:p>
+        </w:tc>
+        <w:tc>
+          <w:tcPr/>
+          <w:p>
+            <w:pPr>
+              <w:pStyle w:val="Compact"/>
+              <w:jc w:val="center"/>
+            </w:pPr>
+            <w:r>
+              <w:t xml:space="preserve">Control 14days (n=5)</w:t>
+            </w:r>
+          </w:p>
+        </w:tc>
+        <w:tc>
+          <w:tcPr/>
+          <w:p>
+            <w:pPr>
+              <w:pStyle w:val="Compact"/>
+              <w:jc w:val="center"/>
+            </w:pPr>
+            <w:r>
+              <w:t xml:space="preserve">0.6363</w:t>
+            </w:r>
+          </w:p>
+        </w:tc>
+        <w:tc>
+          <w:tcPr/>
+          <w:p>
+            <w:pPr>
+              <w:pStyle w:val="Compact"/>
+              <w:jc w:val="center"/>
+            </w:pPr>
+            <w:r>
+              <w:t xml:space="preserve">0.1068</w:t>
+            </w:r>
+          </w:p>
+        </w:tc>
+      </w:tr>
+      <w:tr>
+        <w:tc>
+          <w:tcPr/>
+          <w:p>
+            <w:pPr>
+              <w:pStyle w:val="Compact"/>
+              <w:jc w:val="center"/>
+            </w:pPr>
+            <w:r>
+              <w:t xml:space="preserve">3</w:t>
+            </w:r>
+          </w:p>
+        </w:tc>
+        <w:tc>
+          <w:tcPr/>
+          <w:p>
+            <w:pPr>
+              <w:pStyle w:val="Compact"/>
+              <w:jc w:val="center"/>
+            </w:pPr>
+            <w:r>
+              <w:t xml:space="preserve">Activin 50ng/ml 14days (n=5)</w:t>
+            </w:r>
+          </w:p>
+        </w:tc>
+        <w:tc>
+          <w:tcPr/>
+          <w:p>
+            <w:pPr>
+              <w:pStyle w:val="Compact"/>
+              <w:jc w:val="center"/>
+            </w:pPr>
+            <w:r>
+              <w:t xml:space="preserve">0.5985</w:t>
+            </w:r>
+          </w:p>
+        </w:tc>
+        <w:tc>
+          <w:tcPr/>
+          <w:p>
+            <w:pPr>
+              <w:pStyle w:val="Compact"/>
+              <w:jc w:val="center"/>
+            </w:pPr>
+            <w:r>
+              <w:t xml:space="preserve">0.06922</w:t>
+            </w:r>
+          </w:p>
+        </w:tc>
+      </w:tr>
+      <w:tr>
+        <w:tc>
+          <w:tcPr/>
+          <w:p>
+            <w:pPr>
+              <w:pStyle w:val="Compact"/>
+              <w:jc w:val="center"/>
+            </w:pPr>
+            <w:r>
+              <w:t xml:space="preserve">3</w:t>
+            </w:r>
+          </w:p>
+        </w:tc>
+        <w:tc>
+          <w:tcPr/>
+          <w:p>
+            <w:pPr>
+              <w:pStyle w:val="Compact"/>
+              <w:jc w:val="center"/>
+            </w:pPr>
+            <w:r>
+              <w:t xml:space="preserve">Activin 50ng/ml 2days (n=5)</w:t>
+            </w:r>
+          </w:p>
+        </w:tc>
+        <w:tc>
+          <w:tcPr/>
+          <w:p>
+            <w:pPr>
+              <w:pStyle w:val="Compact"/>
+              <w:jc w:val="center"/>
+            </w:pPr>
+            <w:r>
+              <w:t xml:space="preserve">0.4933</w:t>
+            </w:r>
+          </w:p>
+        </w:tc>
+        <w:tc>
+          <w:tcPr/>
+          <w:p>
+            <w:pPr>
+              <w:pStyle w:val="Compact"/>
+              <w:jc w:val="center"/>
+            </w:pPr>
+            <w:r>
+              <w:t xml:space="preserve">0.09656</w:t>
+            </w:r>
+          </w:p>
+        </w:tc>
+      </w:tr>
+      <w:tr>
+        <w:tc>
+          <w:tcPr/>
+          <w:p>
+            <w:pPr>
+              <w:pStyle w:val="Compact"/>
+              <w:jc w:val="center"/>
+            </w:pPr>
+            <w:r>
+              <w:t xml:space="preserve">3</w:t>
+            </w:r>
+          </w:p>
+        </w:tc>
+        <w:tc>
+          <w:tcPr/>
+          <w:p>
+            <w:pPr>
+              <w:pStyle w:val="Compact"/>
+              <w:jc w:val="center"/>
+            </w:pPr>
+            <w:r>
+              <w:t xml:space="preserve">Control 14days (n=5)</w:t>
+            </w:r>
+          </w:p>
+        </w:tc>
+        <w:tc>
+          <w:tcPr/>
+          <w:p>
+            <w:pPr>
+              <w:pStyle w:val="Compact"/>
+              <w:jc w:val="center"/>
+            </w:pPr>
+            <w:r>
+              <w:t xml:space="preserve">0.6464</w:t>
+            </w:r>
+          </w:p>
+        </w:tc>
+        <w:tc>
+          <w:tcPr/>
+          <w:p>
+            <w:pPr>
+              <w:pStyle w:val="Compact"/>
+              <w:jc w:val="center"/>
+            </w:pPr>
+            <w:r>
+              <w:t xml:space="preserve">0.1258</w:t>
+            </w:r>
+          </w:p>
+        </w:tc>
+      </w:tr>
+      <w:tr>
+        <w:tc>
+          <w:tcPr/>
+          <w:p>
+            <w:pPr>
+              <w:pStyle w:val="Compact"/>
+              <w:jc w:val="center"/>
+            </w:pPr>
+            <w:r>
+              <w:t xml:space="preserve">4</w:t>
+            </w:r>
+          </w:p>
+        </w:tc>
+        <w:tc>
+          <w:tcPr/>
+          <w:p>
+            <w:pPr>
+              <w:pStyle w:val="Compact"/>
+              <w:jc w:val="center"/>
+            </w:pPr>
+            <w:r>
+              <w:t xml:space="preserve">Activin 50ng/ml 14days (n=5)</w:t>
+            </w:r>
+          </w:p>
+        </w:tc>
+        <w:tc>
+          <w:tcPr/>
+          <w:p>
+            <w:pPr>
+              <w:pStyle w:val="Compact"/>
+              <w:jc w:val="center"/>
+            </w:pPr>
+            <w:r>
+              <w:t xml:space="preserve">0.5328</w:t>
+            </w:r>
+          </w:p>
+        </w:tc>
+        <w:tc>
+          <w:tcPr/>
+          <w:p>
+            <w:pPr>
+              <w:pStyle w:val="Compact"/>
+              <w:jc w:val="center"/>
+            </w:pPr>
+            <w:r>
+              <w:t xml:space="preserve">0.04306</w:t>
+            </w:r>
+          </w:p>
+        </w:tc>
+      </w:tr>
+      <w:tr>
+        <w:tc>
+          <w:tcPr/>
+          <w:p>
+            <w:pPr>
+              <w:pStyle w:val="Compact"/>
+              <w:jc w:val="center"/>
+            </w:pPr>
+            <w:r>
+              <w:t xml:space="preserve">4</w:t>
+            </w:r>
+          </w:p>
+        </w:tc>
+        <w:tc>
+          <w:tcPr/>
+          <w:p>
+            <w:pPr>
+              <w:pStyle w:val="Compact"/>
+              <w:jc w:val="center"/>
+            </w:pPr>
+            <w:r>
+              <w:t xml:space="preserve">Activin 50ng/ml 2days (n=5)</w:t>
+            </w:r>
+          </w:p>
+        </w:tc>
+        <w:tc>
+          <w:tcPr/>
+          <w:p>
+            <w:pPr>
+              <w:pStyle w:val="Compact"/>
+              <w:jc w:val="center"/>
+            </w:pPr>
+            <w:r>
+              <w:t xml:space="preserve">0.4509</w:t>
+            </w:r>
+          </w:p>
+        </w:tc>
+        <w:tc>
+          <w:tcPr/>
+          <w:p>
+            <w:pPr>
+              <w:pStyle w:val="Compact"/>
+              <w:jc w:val="center"/>
+            </w:pPr>
+            <w:r>
+              <w:t xml:space="preserve">0.07605</w:t>
+            </w:r>
+          </w:p>
+        </w:tc>
+      </w:tr>
+      <w:tr>
+        <w:tc>
+          <w:tcPr/>
+          <w:p>
+            <w:pPr>
+              <w:pStyle w:val="Compact"/>
+              <w:jc w:val="center"/>
+            </w:pPr>
+            <w:r>
+              <w:t xml:space="preserve">4</w:t>
+            </w:r>
+          </w:p>
+        </w:tc>
+        <w:tc>
+          <w:tcPr/>
+          <w:p>
+            <w:pPr>
+              <w:pStyle w:val="Compact"/>
+              <w:jc w:val="center"/>
+            </w:pPr>
+            <w:r>
+              <w:t xml:space="preserve">Control 14days (n=5)</w:t>
+            </w:r>
+          </w:p>
+        </w:tc>
+        <w:tc>
+          <w:tcPr/>
+          <w:p>
+            <w:pPr>
+              <w:pStyle w:val="Compact"/>
+              <w:jc w:val="center"/>
+            </w:pPr>
+            <w:r>
+              <w:t xml:space="preserve">0.6256</w:t>
+            </w:r>
+          </w:p>
+        </w:tc>
+        <w:tc>
+          <w:tcPr/>
+          <w:p>
+            <w:pPr>
+              <w:pStyle w:val="Compact"/>
+              <w:jc w:val="center"/>
+            </w:pPr>
+            <w:r>
+              <w:t xml:space="preserve">0.1254</w:t>
+            </w:r>
+          </w:p>
+        </w:tc>
+      </w:tr>
+      <w:tr>
+        <w:tc>
+          <w:tcPr/>
+          <w:p>
+            <w:pPr>
+              <w:pStyle w:val="Compact"/>
+              <w:jc w:val="center"/>
+            </w:pPr>
+            <w:r>
+              <w:t xml:space="preserve">5</w:t>
+            </w:r>
+          </w:p>
+        </w:tc>
+        <w:tc>
+          <w:tcPr/>
+          <w:p>
+            <w:pPr>
+              <w:pStyle w:val="Compact"/>
+              <w:jc w:val="center"/>
+            </w:pPr>
+            <w:r>
+              <w:t xml:space="preserve">Activin 50ng/ml 14days (n=5)</w:t>
+            </w:r>
+          </w:p>
+        </w:tc>
+        <w:tc>
+          <w:tcPr/>
+          <w:p>
+            <w:pPr>
+              <w:pStyle w:val="Compact"/>
+              <w:jc w:val="center"/>
+            </w:pPr>
+            <w:r>
+              <w:t xml:space="preserve">0.4296</w:t>
+            </w:r>
+          </w:p>
+        </w:tc>
+        <w:tc>
+          <w:tcPr/>
+          <w:p>
+            <w:pPr>
+              <w:pStyle w:val="Compact"/>
+              <w:jc w:val="center"/>
+            </w:pPr>
+            <w:r>
+              <w:t xml:space="preserve">0.04905</w:t>
+            </w:r>
+          </w:p>
+        </w:tc>
+      </w:tr>
+      <w:tr>
+        <w:tc>
+          <w:tcPr/>
+          <w:p>
+            <w:pPr>
+              <w:pStyle w:val="Compact"/>
+              <w:jc w:val="center"/>
+            </w:pPr>
+            <w:r>
+              <w:t xml:space="preserve">5</w:t>
+            </w:r>
+          </w:p>
+        </w:tc>
+        <w:tc>
+          <w:tcPr/>
+          <w:p>
+            <w:pPr>
+              <w:pStyle w:val="Compact"/>
+              <w:jc w:val="center"/>
+            </w:pPr>
+            <w:r>
+              <w:t xml:space="preserve">Activin 50ng/ml 2days (n=5)</w:t>
+            </w:r>
+          </w:p>
+        </w:tc>
+        <w:tc>
+          <w:tcPr/>
+          <w:p>
+            <w:pPr>
+              <w:pStyle w:val="Compact"/>
+              <w:jc w:val="center"/>
+            </w:pPr>
+            <w:r>
+              <w:t xml:space="preserve">0.4129</w:t>
+            </w:r>
+          </w:p>
+        </w:tc>
+        <w:tc>
+          <w:tcPr/>
+          <w:p>
+            <w:pPr>
+              <w:pStyle w:val="Compact"/>
+              <w:jc w:val="center"/>
+            </w:pPr>
+            <w:r>
+              <w:t xml:space="preserve">0.07299</w:t>
+            </w:r>
+          </w:p>
+        </w:tc>
+      </w:tr>
+      <w:tr>
+        <w:tc>
+          <w:tcPr/>
+          <w:p>
+            <w:pPr>
+              <w:pStyle w:val="Compact"/>
+              <w:jc w:val="center"/>
+            </w:pPr>
+            <w:r>
+              <w:t xml:space="preserve">5</w:t>
+            </w:r>
+          </w:p>
+        </w:tc>
+        <w:tc>
+          <w:tcPr/>
+          <w:p>
+            <w:pPr>
+              <w:pStyle w:val="Compact"/>
+              <w:jc w:val="center"/>
+            </w:pPr>
+            <w:r>
+              <w:t xml:space="preserve">Control 14days (n=5)</w:t>
+            </w:r>
+          </w:p>
+        </w:tc>
+        <w:tc>
+          <w:tcPr/>
+          <w:p>
+            <w:pPr>
+              <w:pStyle w:val="Compact"/>
+              <w:jc w:val="center"/>
+            </w:pPr>
+            <w:r>
+              <w:t xml:space="preserve">0.5461</w:t>
+            </w:r>
+          </w:p>
+        </w:tc>
+        <w:tc>
+          <w:tcPr/>
+          <w:p>
+            <w:pPr>
+              <w:pStyle w:val="Compact"/>
+              <w:jc w:val="center"/>
+            </w:pPr>
+            <w:r>
+              <w:t xml:space="preserve">0.1919</w:t>
+            </w:r>
+          </w:p>
+        </w:tc>
+      </w:tr>
+      <w:tr>
+        <w:tc>
+          <w:tcPr/>
+          <w:p>
+            <w:pPr>
+              <w:pStyle w:val="Compact"/>
+              <w:jc w:val="center"/>
+            </w:pPr>
+            <w:r>
+              <w:t xml:space="preserve">6</w:t>
+            </w:r>
+          </w:p>
+        </w:tc>
+        <w:tc>
+          <w:tcPr/>
+          <w:p>
+            <w:pPr>
+              <w:pStyle w:val="Compact"/>
+              <w:jc w:val="center"/>
+            </w:pPr>
+            <w:r>
+              <w:t xml:space="preserve">Activin 50ng/ml 14days (n=5)</w:t>
+            </w:r>
+          </w:p>
+        </w:tc>
+        <w:tc>
+          <w:tcPr/>
+          <w:p>
+            <w:pPr>
+              <w:pStyle w:val="Compact"/>
+              <w:jc w:val="center"/>
+            </w:pPr>
+            <w:r>
+              <w:t xml:space="preserve">0.3498</w:t>
+            </w:r>
+          </w:p>
+        </w:tc>
+        <w:tc>
+          <w:tcPr/>
+          <w:p>
+            <w:pPr>
+              <w:pStyle w:val="Compact"/>
+              <w:jc w:val="center"/>
+            </w:pPr>
+            <w:r>
+              <w:t xml:space="preserve">0.08917</w:t>
+            </w:r>
+          </w:p>
+        </w:tc>
+      </w:tr>
+      <w:tr>
+        <w:tc>
+          <w:tcPr/>
+          <w:p>
+            <w:pPr>
+              <w:pStyle w:val="Compact"/>
+              <w:jc w:val="center"/>
+            </w:pPr>
+            <w:r>
+              <w:t xml:space="preserve">6</w:t>
+            </w:r>
+          </w:p>
+        </w:tc>
+        <w:tc>
+          <w:tcPr/>
+          <w:p>
+            <w:pPr>
+              <w:pStyle w:val="Compact"/>
+              <w:jc w:val="center"/>
+            </w:pPr>
+            <w:r>
+              <w:t xml:space="preserve">Activin 50ng/ml 2days (n=5)</w:t>
+            </w:r>
+          </w:p>
+        </w:tc>
+        <w:tc>
+          <w:tcPr/>
+          <w:p>
+            <w:pPr>
+              <w:pStyle w:val="Compact"/>
+              <w:jc w:val="center"/>
+            </w:pPr>
+            <w:r>
+              <w:t xml:space="preserve">0.392</w:t>
+            </w:r>
+          </w:p>
+        </w:tc>
+        <w:tc>
+          <w:tcPr/>
+          <w:p>
+            <w:pPr>
+              <w:pStyle w:val="Compact"/>
+              <w:jc w:val="center"/>
+            </w:pPr>
+            <w:r>
+              <w:t xml:space="preserve">0.1203</w:t>
+            </w:r>
+          </w:p>
+        </w:tc>
+      </w:tr>
+      <w:tr>
+        <w:tc>
+          <w:tcPr/>
+          <w:p>
+            <w:pPr>
+              <w:pStyle w:val="Compact"/>
+              <w:jc w:val="center"/>
+            </w:pPr>
+            <w:r>
+              <w:t xml:space="preserve">6</w:t>
+            </w:r>
+          </w:p>
+        </w:tc>
+        <w:tc>
+          <w:tcPr/>
+          <w:p>
+            <w:pPr>
+              <w:pStyle w:val="Compact"/>
+              <w:jc w:val="center"/>
+            </w:pPr>
+            <w:r>
+              <w:t xml:space="preserve">Control 14days (n=5)</w:t>
+            </w:r>
+          </w:p>
+        </w:tc>
+        <w:tc>
+          <w:tcPr/>
+          <w:p>
+            <w:pPr>
+              <w:pStyle w:val="Compact"/>
+              <w:jc w:val="center"/>
+            </w:pPr>
+            <w:r>
+              <w:t xml:space="preserve">0.4624</w:t>
+            </w:r>
+          </w:p>
+        </w:tc>
+        <w:tc>
+          <w:tcPr/>
+          <w:p>
+            <w:pPr>
+              <w:pStyle w:val="Compact"/>
+              <w:jc w:val="center"/>
+            </w:pPr>
+            <w:r>
+              <w:t xml:space="preserve">0.1765</w:t>
+            </w:r>
+          </w:p>
+        </w:tc>
+      </w:tr>
+      <w:tr>
+        <w:tc>
+          <w:tcPr/>
+          <w:p>
+            <w:pPr>
+              <w:pStyle w:val="Compact"/>
+              <w:jc w:val="center"/>
+            </w:pPr>
+            <w:r>
+              <w:t xml:space="preserve">7</w:t>
+            </w:r>
+          </w:p>
+        </w:tc>
+        <w:tc>
+          <w:tcPr/>
+          <w:p>
+            <w:pPr>
+              <w:pStyle w:val="Compact"/>
+              <w:jc w:val="center"/>
+            </w:pPr>
+            <w:r>
+              <w:t xml:space="preserve">Activin 50ng/ml 14days (n=5)</w:t>
+            </w:r>
+          </w:p>
+        </w:tc>
+        <w:tc>
+          <w:tcPr/>
+          <w:p>
+            <w:pPr>
+              <w:pStyle w:val="Compact"/>
+              <w:jc w:val="center"/>
+            </w:pPr>
+            <w:r>
+              <w:t xml:space="preserve">0.3337</w:t>
+            </w:r>
+          </w:p>
+        </w:tc>
+        <w:tc>
+          <w:tcPr/>
+          <w:p>
+            <w:pPr>
+              <w:pStyle w:val="Compact"/>
+              <w:jc w:val="center"/>
+            </w:pPr>
+            <w:r>
+              <w:t xml:space="preserve">0.1421</w:t>
+            </w:r>
+          </w:p>
+        </w:tc>
+      </w:tr>
+      <w:tr>
+        <w:tc>
+          <w:tcPr/>
+          <w:p>
+            <w:pPr>
+              <w:pStyle w:val="Compact"/>
+              <w:jc w:val="center"/>
+            </w:pPr>
+            <w:r>
+              <w:t xml:space="preserve">7</w:t>
+            </w:r>
+          </w:p>
+        </w:tc>
+        <w:tc>
+          <w:tcPr/>
+          <w:p>
+            <w:pPr>
+              <w:pStyle w:val="Compact"/>
+              <w:jc w:val="center"/>
+            </w:pPr>
+            <w:r>
+              <w:t xml:space="preserve">Activin 50ng/ml 2days (n=5)</w:t>
+            </w:r>
+          </w:p>
+        </w:tc>
+        <w:tc>
+          <w:tcPr/>
+          <w:p>
+            <w:pPr>
+              <w:pStyle w:val="Compact"/>
+              <w:jc w:val="center"/>
+            </w:pPr>
+            <w:r>
+              <w:t xml:space="preserve">0.3357</w:t>
+            </w:r>
+          </w:p>
+        </w:tc>
+        <w:tc>
+          <w:tcPr/>
+          <w:p>
+            <w:pPr>
+              <w:pStyle w:val="Compact"/>
+              <w:jc w:val="center"/>
+            </w:pPr>
+            <w:r>
+              <w:t xml:space="preserve">0.09613</w:t>
+            </w:r>
+          </w:p>
+        </w:tc>
+      </w:tr>
+      <w:tr>
+        <w:tc>
+          <w:tcPr/>
+          <w:p>
+            <w:pPr>
+              <w:pStyle w:val="Compact"/>
+              <w:jc w:val="center"/>
+            </w:pPr>
+            <w:r>
+              <w:t xml:space="preserve">7</w:t>
+            </w:r>
+          </w:p>
+        </w:tc>
+        <w:tc>
+          <w:tcPr/>
+          <w:p>
+            <w:pPr>
+              <w:pStyle w:val="Compact"/>
+              <w:jc w:val="center"/>
+            </w:pPr>
+            <w:r>
+              <w:t xml:space="preserve">Control 14days (n=5)</w:t>
+            </w:r>
+          </w:p>
+        </w:tc>
+        <w:tc>
+          <w:tcPr/>
+          <w:p>
+            <w:pPr>
+              <w:pStyle w:val="Compact"/>
+              <w:jc w:val="center"/>
+            </w:pPr>
+            <w:r>
+              <w:t xml:space="preserve">0.4713</w:t>
+            </w:r>
+          </w:p>
+        </w:tc>
+        <w:tc>
+          <w:tcPr/>
+          <w:p>
+            <w:pPr>
+              <w:pStyle w:val="Compact"/>
+              <w:jc w:val="center"/>
+            </w:pPr>
+            <w:r>
+              <w:t xml:space="preserve">0.1801</w:t>
+            </w:r>
+          </w:p>
+        </w:tc>
+      </w:tr>
+      <w:tr>
+        <w:tc>
+          <w:tcPr/>
+          <w:p>
+            <w:pPr>
+              <w:pStyle w:val="Compact"/>
+              <w:jc w:val="center"/>
+            </w:pPr>
+            <w:r>
+              <w:t xml:space="preserve">8</w:t>
+            </w:r>
+          </w:p>
+        </w:tc>
+        <w:tc>
+          <w:tcPr/>
+          <w:p>
+            <w:pPr>
+              <w:pStyle w:val="Compact"/>
+              <w:jc w:val="center"/>
+            </w:pPr>
+            <w:r>
+              <w:t xml:space="preserve">Activin 50ng/ml 14days (n=5)</w:t>
+            </w:r>
+          </w:p>
+        </w:tc>
+        <w:tc>
+          <w:tcPr/>
+          <w:p>
+            <w:pPr>
+              <w:pStyle w:val="Compact"/>
+              <w:jc w:val="center"/>
+            </w:pPr>
+            <w:r>
+              <w:t xml:space="preserve">0.2915</w:t>
+            </w:r>
+          </w:p>
+        </w:tc>
+        <w:tc>
+          <w:tcPr/>
+          <w:p>
+            <w:pPr>
+              <w:pStyle w:val="Compact"/>
+              <w:jc w:val="center"/>
+            </w:pPr>
+            <w:r>
+              <w:t xml:space="preserve">0.1502</w:t>
+            </w:r>
+          </w:p>
+        </w:tc>
+      </w:tr>
+      <w:tr>
+        <w:tc>
+          <w:tcPr/>
+          <w:p>
+            <w:pPr>
+              <w:pStyle w:val="Compact"/>
+              <w:jc w:val="center"/>
+            </w:pPr>
+            <w:r>
+              <w:t xml:space="preserve">8</w:t>
+            </w:r>
+          </w:p>
+        </w:tc>
+        <w:tc>
+          <w:tcPr/>
+          <w:p>
+            <w:pPr>
+              <w:pStyle w:val="Compact"/>
+              <w:jc w:val="center"/>
+            </w:pPr>
+            <w:r>
+              <w:t xml:space="preserve">Activin 50ng/ml 2days (n=5)</w:t>
+            </w:r>
+          </w:p>
+        </w:tc>
+        <w:tc>
+          <w:tcPr/>
+          <w:p>
+            <w:pPr>
+              <w:pStyle w:val="Compact"/>
+              <w:jc w:val="center"/>
+            </w:pPr>
+            <w:r>
+              <w:t xml:space="preserve">0.2828</w:t>
+            </w:r>
+          </w:p>
+        </w:tc>
+        <w:tc>
+          <w:tcPr/>
+          <w:p>
+            <w:pPr>
+              <w:pStyle w:val="Compact"/>
+              <w:jc w:val="center"/>
+            </w:pPr>
+            <w:r>
+              <w:t xml:space="preserve">0.08893</w:t>
+            </w:r>
+          </w:p>
+        </w:tc>
+      </w:tr>
+      <w:tr>
+        <w:tc>
+          <w:tcPr/>
+          <w:p>
+            <w:pPr>
+              <w:pStyle w:val="Compact"/>
+              <w:jc w:val="center"/>
+            </w:pPr>
+            <w:r>
+              <w:t xml:space="preserve">8</w:t>
+            </w:r>
+          </w:p>
+        </w:tc>
+        <w:tc>
+          <w:tcPr/>
+          <w:p>
+            <w:pPr>
+              <w:pStyle w:val="Compact"/>
+              <w:jc w:val="center"/>
+            </w:pPr>
+            <w:r>
+              <w:t xml:space="preserve">Control 14days (n=5)</w:t>
+            </w:r>
+          </w:p>
+        </w:tc>
+        <w:tc>
+          <w:tcPr/>
+          <w:p>
+            <w:pPr>
+              <w:pStyle w:val="Compact"/>
+              <w:jc w:val="center"/>
+            </w:pPr>
+            <w:r>
+              <w:t xml:space="preserve">0.3819</w:t>
+            </w:r>
+          </w:p>
+        </w:tc>
+        <w:tc>
+          <w:tcPr/>
+          <w:p>
+            <w:pPr>
+              <w:pStyle w:val="Compact"/>
+              <w:jc w:val="center"/>
+            </w:pPr>
+            <w:r>
+              <w:t xml:space="preserve">0.1656</w:t>
+            </w:r>
+          </w:p>
+        </w:tc>
+      </w:tr>
+      <w:tr>
+        <w:tc>
+          <w:tcPr/>
+          <w:p>
+            <w:pPr>
+              <w:pStyle w:val="Compact"/>
+              <w:jc w:val="center"/>
+            </w:pPr>
+            <w:r>
+              <w:t xml:space="preserve">9</w:t>
+            </w:r>
+          </w:p>
+        </w:tc>
+        <w:tc>
+          <w:tcPr/>
+          <w:p>
+            <w:pPr>
+              <w:pStyle w:val="Compact"/>
+              <w:jc w:val="center"/>
+            </w:pPr>
+            <w:r>
+              <w:t xml:space="preserve">Activin 50ng/ml 14days (n=5)</w:t>
+            </w:r>
+          </w:p>
+        </w:tc>
+        <w:tc>
+          <w:tcPr/>
+          <w:p>
+            <w:pPr>
+              <w:pStyle w:val="Compact"/>
+              <w:jc w:val="center"/>
+            </w:pPr>
+            <w:r>
+              <w:t xml:space="preserve">0.2011</w:t>
+            </w:r>
+          </w:p>
+        </w:tc>
+        <w:tc>
+          <w:tcPr/>
+          <w:p>
+            <w:pPr>
+              <w:pStyle w:val="Compact"/>
+              <w:jc w:val="center"/>
+            </w:pPr>
+            <w:r>
+              <w:t xml:space="preserve">0.1121</w:t>
+            </w:r>
+          </w:p>
+        </w:tc>
+      </w:tr>
+      <w:tr>
+        <w:tc>
+          <w:tcPr/>
+          <w:p>
+            <w:pPr>
+              <w:pStyle w:val="Compact"/>
+              <w:jc w:val="center"/>
+            </w:pPr>
+            <w:r>
+              <w:t xml:space="preserve">9</w:t>
+            </w:r>
+          </w:p>
+        </w:tc>
+        <w:tc>
+          <w:tcPr/>
+          <w:p>
+            <w:pPr>
+              <w:pStyle w:val="Compact"/>
+              <w:jc w:val="center"/>
+            </w:pPr>
+            <w:r>
+              <w:t xml:space="preserve">Activin 50ng/ml 2days (n=5)</w:t>
+            </w:r>
+          </w:p>
+        </w:tc>
+        <w:tc>
+          <w:tcPr/>
+          <w:p>
+            <w:pPr>
+              <w:pStyle w:val="Compact"/>
+              <w:jc w:val="center"/>
+            </w:pPr>
+            <w:r>
+              <w:t xml:space="preserve">0.2273</w:t>
+            </w:r>
+          </w:p>
+        </w:tc>
+        <w:tc>
+          <w:tcPr/>
+          <w:p>
+            <w:pPr>
+              <w:pStyle w:val="Compact"/>
+              <w:jc w:val="center"/>
+            </w:pPr>
+            <w:r>
+              <w:t xml:space="preserve">0.129</w:t>
+            </w:r>
+          </w:p>
+        </w:tc>
+      </w:tr>
+      <w:tr>
+        <w:tc>
+          <w:tcPr/>
+          <w:p>
+            <w:pPr>
+              <w:pStyle w:val="Compact"/>
+              <w:jc w:val="center"/>
+            </w:pPr>
+            <w:r>
+              <w:t xml:space="preserve">9</w:t>
+            </w:r>
+          </w:p>
+        </w:tc>
+        <w:tc>
+          <w:tcPr/>
+          <w:p>
+            <w:pPr>
+              <w:pStyle w:val="Compact"/>
+              <w:jc w:val="center"/>
+            </w:pPr>
+            <w:r>
+              <w:t xml:space="preserve">Control 14days (n=5)</w:t>
+            </w:r>
+          </w:p>
+        </w:tc>
+        <w:tc>
+          <w:tcPr/>
+          <w:p>
+            <w:pPr>
+              <w:pStyle w:val="Compact"/>
+              <w:jc w:val="center"/>
+            </w:pPr>
+            <w:r>
+              <w:t xml:space="preserve">0.3226</w:t>
+            </w:r>
+          </w:p>
+        </w:tc>
+        <w:tc>
+          <w:tcPr/>
+          <w:p>
+            <w:pPr>
+              <w:pStyle w:val="Compact"/>
+              <w:jc w:val="center"/>
+            </w:pPr>
+            <w:r>
+              <w:t xml:space="preserve">0.1672</w:t>
+            </w:r>
+          </w:p>
+        </w:tc>
+      </w:tr>
+      <w:tr>
+        <w:tc>
+          <w:tcPr/>
+          <w:p>
+            <w:pPr>
+              <w:pStyle w:val="Compact"/>
+              <w:jc w:val="center"/>
+            </w:pPr>
+            <w:r>
+              <w:t xml:space="preserve">10</w:t>
+            </w:r>
+          </w:p>
+        </w:tc>
+        <w:tc>
+          <w:tcPr/>
+          <w:p>
+            <w:pPr>
+              <w:pStyle w:val="Compact"/>
+              <w:jc w:val="center"/>
+            </w:pPr>
+            <w:r>
+              <w:t xml:space="preserve">Activin 50ng/ml 14days (n=5)</w:t>
+            </w:r>
+          </w:p>
+        </w:tc>
+        <w:tc>
+          <w:tcPr/>
+          <w:p>
+            <w:pPr>
+              <w:pStyle w:val="Compact"/>
+              <w:jc w:val="center"/>
+            </w:pPr>
+            <w:r>
+              <w:t xml:space="preserve">0.08703</w:t>
+            </w:r>
+          </w:p>
+        </w:tc>
+        <w:tc>
+          <w:tcPr/>
+          <w:p>
+            <w:pPr>
+              <w:pStyle w:val="Compact"/>
+              <w:jc w:val="center"/>
+            </w:pPr>
+            <w:r>
+              <w:t xml:space="preserve">0.02915</w:t>
+            </w:r>
+          </w:p>
+        </w:tc>
+      </w:tr>
+      <w:tr>
+        <w:tc>
+          <w:tcPr/>
+          <w:p>
+            <w:pPr>
+              <w:pStyle w:val="Compact"/>
+              <w:jc w:val="center"/>
+            </w:pPr>
+            <w:r>
+              <w:t xml:space="preserve">10</w:t>
+            </w:r>
+          </w:p>
+        </w:tc>
+        <w:tc>
+          <w:tcPr/>
+          <w:p>
+            <w:pPr>
+              <w:pStyle w:val="Compact"/>
+              <w:jc w:val="center"/>
+            </w:pPr>
+            <w:r>
+              <w:t xml:space="preserve">Activin 50ng/ml 2days (n=5)</w:t>
+            </w:r>
+          </w:p>
+        </w:tc>
+        <w:tc>
+          <w:tcPr/>
+          <w:p>
+            <w:pPr>
+              <w:pStyle w:val="Compact"/>
+              <w:jc w:val="center"/>
+            </w:pPr>
+            <w:r>
+              <w:t xml:space="preserve">0.2306</w:t>
+            </w:r>
+          </w:p>
+        </w:tc>
+        <w:tc>
+          <w:tcPr/>
+          <w:p>
+            <w:pPr>
+              <w:pStyle w:val="Compact"/>
+              <w:jc w:val="center"/>
+            </w:pPr>
+            <w:r>
+              <w:t xml:space="preserve">0.1209</w:t>
+            </w:r>
+          </w:p>
+        </w:tc>
+      </w:tr>
+      <w:tr>
+        <w:tc>
+          <w:tcPr/>
+          <w:p>
+            <w:pPr>
+              <w:pStyle w:val="Compact"/>
+              <w:jc w:val="center"/>
+            </w:pPr>
+            <w:r>
+              <w:t xml:space="preserve">10</w:t>
+            </w:r>
+          </w:p>
+        </w:tc>
+        <w:tc>
+          <w:tcPr/>
+          <w:p>
+            <w:pPr>
+              <w:pStyle w:val="Compact"/>
+              <w:jc w:val="center"/>
+            </w:pPr>
+            <w:r>
+              <w:t xml:space="preserve">Control 14days (n=5)</w:t>
+            </w:r>
+          </w:p>
+        </w:tc>
+        <w:tc>
+          <w:tcPr/>
+          <w:p>
+            <w:pPr>
+              <w:pStyle w:val="Compact"/>
+              <w:jc w:val="center"/>
+            </w:pPr>
+            <w:r>
+              <w:t xml:space="preserve">0.1504</w:t>
+            </w:r>
+          </w:p>
+        </w:tc>
+        <w:tc>
+          <w:tcPr/>
+          <w:p>
+            <w:pPr>
+              <w:pStyle w:val="Compact"/>
+              <w:jc w:val="center"/>
+            </w:pPr>
+            <w:r>
+              <w:t xml:space="preserve">0.08223</w:t>
+            </w:r>
+          </w:p>
+        </w:tc>
+      </w:tr>
+    </w:tbl>
+    <w:bookmarkEnd w:id="51"/>
+    <w:bookmarkEnd w:id="52"/>
+    <w:bookmarkStart w:id="56" w:name="references"/>
+    <w:p>
+      <w:pPr>
         <w:pStyle w:val="berschrift2"/>
       </w:pPr>
       <w:r>
         <w:t xml:space="preserve">References</w:t>
       </w:r>
     </w:p>
-    <w:bookmarkStart w:id="52" w:name="refs"/>
-    <w:bookmarkStart w:id="51" w:name="X4175f2d6a880cff244f25bc9442830b9798b728"/>
+    <w:bookmarkStart w:id="55" w:name="refs"/>
+    <w:bookmarkStart w:id="54" w:name="X4175f2d6a880cff244f25bc9442830b9798b728"/>
     <w:p>
       <w:pPr>
         <w:pStyle w:val="Literaturverzeichnis"/>
@@ -811,7 +2434,7 @@
       <w:r>
         <w:t xml:space="preserve"> </w:t>
       </w:r>
-      <w:hyperlink r:id="rId50">
+      <w:hyperlink r:id="rId53">
         <w:r>
           <w:rPr>
             <w:rStyle w:val="Hyperlink"/>
@@ -823,10 +2446,10 @@
         <w:t xml:space="preserve">.</w:t>
       </w:r>
     </w:p>
-    <w:bookmarkEnd w:id="51"/>
-    <w:bookmarkEnd w:id="52"/>
-    <w:bookmarkEnd w:id="53"/>
-    <w:bookmarkStart w:id="54" w:name="methods-section-to-copy"/>
+    <w:bookmarkEnd w:id="54"/>
+    <w:bookmarkEnd w:id="55"/>
+    <w:bookmarkEnd w:id="56"/>
+    <w:bookmarkStart w:id="57" w:name="methods-section-to-copy"/>
     <w:p>
       <w:pPr>
         <w:pStyle w:val="berschrift2"/>
@@ -843,7 +2466,7 @@
         <w:t xml:space="preserve">TBA</w:t>
       </w:r>
     </w:p>
-    <w:bookmarkEnd w:id="54"/>
+    <w:bookmarkEnd w:id="57"/>
     <w:sectPr>
       <w:pgSz w:h="15840" w:w="12240"/>
       <w:pgMar w:bottom="1134" w:footer="720" w:gutter="0" w:header="720" w:left="1417" w:right="1417" w:top="1417"/>

</xml_diff>

<commit_message>
Added imaging data, fixed citation problem
</commit_message>
<xml_diff>
--- a/Results/Mitosections/results_report_mitochondria_alcohol_mitosections.docx
+++ b/Results/Mitosections/results_report_mitochondria_alcohol_mitosections.docx
@@ -71,7 +71,7 @@
         <w:pStyle w:val="Datum"/>
       </w:pPr>
       <w:r>
-        <w:t xml:space="preserve">2023-04-06</w:t>
+        <w:t xml:space="preserve">2023-04-12</w:t>
       </w:r>
     </w:p>
     <w:bookmarkStart w:id="28" w:name="introduction"/>
@@ -264,7 +264,7 @@
         <w:pStyle w:val="FirstParagraph"/>
       </w:pPr>
       <w:r>
-        <w:t xml:space="preserve">The number of analyzed images is currently 15 and is divided into different experimental conditions as follows:</w:t>
+        <w:t xml:space="preserve">The number of analyzed images is currently 16 and is divided into different experimental conditions as follows:</w:t>
       </w:r>
     </w:p>
     <w:tbl>
@@ -380,6 +380,32 @@
             </w:pPr>
             <w:r>
               <w:t xml:space="preserve">5</w:t>
+            </w:r>
+          </w:p>
+        </w:tc>
+      </w:tr>
+      <w:tr>
+        <w:tc>
+          <w:tcPr/>
+          <w:p>
+            <w:pPr>
+              <w:pStyle w:val="Compact"/>
+              <w:jc w:val="center"/>
+            </w:pPr>
+            <w:r>
+              <w:t xml:space="preserve">Control 7days</w:t>
+            </w:r>
+          </w:p>
+        </w:tc>
+        <w:tc>
+          <w:tcPr/>
+          <w:p>
+            <w:pPr>
+              <w:pStyle w:val="Compact"/>
+              <w:jc w:val="center"/>
+            </w:pPr>
+            <w:r>
+              <w:t xml:space="preserve">1</w:t>
             </w:r>
           </w:p>
         </w:tc>
@@ -629,7 +655,7 @@
       </w:r>
     </w:p>
     <w:bookmarkEnd w:id="40"/>
-    <w:bookmarkStart w:id="52" w:name="statistical-comparison"/>
+    <w:bookmarkStart w:id="55" w:name="statistical-comparison"/>
     <w:p>
       <w:pPr>
         <w:pStyle w:val="berschrift2"/>
@@ -764,7 +790,7 @@
       </w:r>
     </w:p>
     <w:bookmarkEnd w:id="47"/>
-    <w:bookmarkStart w:id="51" w:name="idea2"/>
+    <w:bookmarkStart w:id="54" w:name="idea2"/>
     <w:p>
       <w:pPr>
         <w:pStyle w:val="berschrift3"/>
@@ -783,7 +809,7 @@
     </w:p>
     <w:p>
       <w:pPr>
-        <w:pStyle w:val="CaptionedFigure"/>
+        <w:pStyle w:val="Textkrper"/>
       </w:pPr>
       <w:r>
         <w:drawing>
@@ -827,13 +853,47 @@
           </wp:inline>
         </w:drawing>
       </w:r>
-    </w:p>
-    <w:p>
-      <w:pPr>
-        <w:pStyle w:val="ImageCaption"/>
-      </w:pPr>
-      <w:r>
-        <w:t xml:space="preserve">Correlation of the different curves</w:t>
+      <w:r>
+        <w:drawing>
+          <wp:inline>
+            <wp:extent cx="5969000" cy="4178300"/>
+            <wp:effectExtent b="0" l="0" r="0" t="0"/>
+            <wp:docPr descr="Correlation of the different curves" title="" id="52" name="Picture"/>
+            <a:graphic>
+              <a:graphicData uri="http://schemas.openxmlformats.org/drawingml/2006/picture">
+                <pic:pic>
+                  <pic:nvPicPr>
+                    <pic:cNvPr descr="results_report_mitochondria_alcohol_mitosections_files/figure-docx/comparison_of_curve_sections-2.png" id="53" name="Picture"/>
+                    <pic:cNvPicPr>
+                      <a:picLocks noChangeArrowheads="1" noChangeAspect="1"/>
+                    </pic:cNvPicPr>
+                  </pic:nvPicPr>
+                  <pic:blipFill>
+                    <a:blip r:embed="rId51"/>
+                    <a:stretch>
+                      <a:fillRect/>
+                    </a:stretch>
+                  </pic:blipFill>
+                  <pic:spPr bwMode="auto">
+                    <a:xfrm>
+                      <a:off x="0" y="0"/>
+                      <a:ext cx="5969000" cy="4178300"/>
+                    </a:xfrm>
+                    <a:prstGeom prst="rect">
+                      <a:avLst/>
+                    </a:prstGeom>
+                    <a:noFill/>
+                    <a:ln w="9525">
+                      <a:noFill/>
+                      <a:headEnd/>
+                      <a:tailEnd/>
+                    </a:ln>
+                  </pic:spPr>
+                </pic:pic>
+              </a:graphicData>
+            </a:graphic>
+          </wp:inline>
+        </w:drawing>
       </w:r>
     </w:p>
     <w:tbl>
@@ -1060,43 +1120,43 @@
               <w:jc w:val="center"/>
             </w:pPr>
             <w:r>
-              <w:t xml:space="preserve">2</w:t>
-            </w:r>
-          </w:p>
-        </w:tc>
-        <w:tc>
-          <w:tcPr/>
-          <w:p>
-            <w:pPr>
-              <w:pStyle w:val="Compact"/>
-              <w:jc w:val="center"/>
-            </w:pPr>
-            <w:r>
-              <w:t xml:space="preserve">Activin 50ng/ml 14days (n=5)</w:t>
-            </w:r>
-          </w:p>
-        </w:tc>
-        <w:tc>
-          <w:tcPr/>
-          <w:p>
-            <w:pPr>
-              <w:pStyle w:val="Compact"/>
-              <w:jc w:val="center"/>
-            </w:pPr>
-            <w:r>
-              <w:t xml:space="preserve">0.6648</w:t>
-            </w:r>
-          </w:p>
-        </w:tc>
-        <w:tc>
-          <w:tcPr/>
-          <w:p>
-            <w:pPr>
-              <w:pStyle w:val="Compact"/>
-              <w:jc w:val="center"/>
-            </w:pPr>
-            <w:r>
-              <w:t xml:space="preserve">0.08714</w:t>
+              <w:t xml:space="preserve">1</w:t>
+            </w:r>
+          </w:p>
+        </w:tc>
+        <w:tc>
+          <w:tcPr/>
+          <w:p>
+            <w:pPr>
+              <w:pStyle w:val="Compact"/>
+              <w:jc w:val="center"/>
+            </w:pPr>
+            <w:r>
+              <w:t xml:space="preserve">Control 7days (n=1)</w:t>
+            </w:r>
+          </w:p>
+        </w:tc>
+        <w:tc>
+          <w:tcPr/>
+          <w:p>
+            <w:pPr>
+              <w:pStyle w:val="Compact"/>
+              <w:jc w:val="center"/>
+            </w:pPr>
+            <w:r>
+              <w:t xml:space="preserve">0.6897</w:t>
+            </w:r>
+          </w:p>
+        </w:tc>
+        <w:tc>
+          <w:tcPr/>
+          <w:p>
+            <w:pPr>
+              <w:pStyle w:val="Compact"/>
+              <w:jc w:val="center"/>
+            </w:pPr>
+            <w:r>
+              <w:t xml:space="preserve">0</w:t>
             </w:r>
           </w:p>
         </w:tc>
@@ -1122,31 +1182,31 @@
               <w:jc w:val="center"/>
             </w:pPr>
             <w:r>
-              <w:t xml:space="preserve">Activin 50ng/ml 2days (n=5)</w:t>
-            </w:r>
-          </w:p>
-        </w:tc>
-        <w:tc>
-          <w:tcPr/>
-          <w:p>
-            <w:pPr>
-              <w:pStyle w:val="Compact"/>
-              <w:jc w:val="center"/>
-            </w:pPr>
-            <w:r>
-              <w:t xml:space="preserve">0.4952</w:t>
-            </w:r>
-          </w:p>
-        </w:tc>
-        <w:tc>
-          <w:tcPr/>
-          <w:p>
-            <w:pPr>
-              <w:pStyle w:val="Compact"/>
-              <w:jc w:val="center"/>
-            </w:pPr>
-            <w:r>
-              <w:t xml:space="preserve">0.1386</w:t>
+              <w:t xml:space="preserve">Activin 50ng/ml 14days (n=5)</w:t>
+            </w:r>
+          </w:p>
+        </w:tc>
+        <w:tc>
+          <w:tcPr/>
+          <w:p>
+            <w:pPr>
+              <w:pStyle w:val="Compact"/>
+              <w:jc w:val="center"/>
+            </w:pPr>
+            <w:r>
+              <w:t xml:space="preserve">0.6648</w:t>
+            </w:r>
+          </w:p>
+        </w:tc>
+        <w:tc>
+          <w:tcPr/>
+          <w:p>
+            <w:pPr>
+              <w:pStyle w:val="Compact"/>
+              <w:jc w:val="center"/>
+            </w:pPr>
+            <w:r>
+              <w:t xml:space="preserve">0.08714</w:t>
             </w:r>
           </w:p>
         </w:tc>
@@ -1172,31 +1232,31 @@
               <w:jc w:val="center"/>
             </w:pPr>
             <w:r>
-              <w:t xml:space="preserve">Control 14days (n=5)</w:t>
-            </w:r>
-          </w:p>
-        </w:tc>
-        <w:tc>
-          <w:tcPr/>
-          <w:p>
-            <w:pPr>
-              <w:pStyle w:val="Compact"/>
-              <w:jc w:val="center"/>
-            </w:pPr>
-            <w:r>
-              <w:t xml:space="preserve">0.6363</w:t>
-            </w:r>
-          </w:p>
-        </w:tc>
-        <w:tc>
-          <w:tcPr/>
-          <w:p>
-            <w:pPr>
-              <w:pStyle w:val="Compact"/>
-              <w:jc w:val="center"/>
-            </w:pPr>
-            <w:r>
-              <w:t xml:space="preserve">0.1068</w:t>
+              <w:t xml:space="preserve">Activin 50ng/ml 2days (n=5)</w:t>
+            </w:r>
+          </w:p>
+        </w:tc>
+        <w:tc>
+          <w:tcPr/>
+          <w:p>
+            <w:pPr>
+              <w:pStyle w:val="Compact"/>
+              <w:jc w:val="center"/>
+            </w:pPr>
+            <w:r>
+              <w:t xml:space="preserve">0.4952</w:t>
+            </w:r>
+          </w:p>
+        </w:tc>
+        <w:tc>
+          <w:tcPr/>
+          <w:p>
+            <w:pPr>
+              <w:pStyle w:val="Compact"/>
+              <w:jc w:val="center"/>
+            </w:pPr>
+            <w:r>
+              <w:t xml:space="preserve">0.1386</w:t>
             </w:r>
           </w:p>
         </w:tc>
@@ -1210,43 +1270,43 @@
               <w:jc w:val="center"/>
             </w:pPr>
             <w:r>
-              <w:t xml:space="preserve">3</w:t>
-            </w:r>
-          </w:p>
-        </w:tc>
-        <w:tc>
-          <w:tcPr/>
-          <w:p>
-            <w:pPr>
-              <w:pStyle w:val="Compact"/>
-              <w:jc w:val="center"/>
-            </w:pPr>
-            <w:r>
-              <w:t xml:space="preserve">Activin 50ng/ml 14days (n=5)</w:t>
-            </w:r>
-          </w:p>
-        </w:tc>
-        <w:tc>
-          <w:tcPr/>
-          <w:p>
-            <w:pPr>
-              <w:pStyle w:val="Compact"/>
-              <w:jc w:val="center"/>
-            </w:pPr>
-            <w:r>
-              <w:t xml:space="preserve">0.5985</w:t>
-            </w:r>
-          </w:p>
-        </w:tc>
-        <w:tc>
-          <w:tcPr/>
-          <w:p>
-            <w:pPr>
-              <w:pStyle w:val="Compact"/>
-              <w:jc w:val="center"/>
-            </w:pPr>
-            <w:r>
-              <w:t xml:space="preserve">0.06922</w:t>
+              <w:t xml:space="preserve">2</w:t>
+            </w:r>
+          </w:p>
+        </w:tc>
+        <w:tc>
+          <w:tcPr/>
+          <w:p>
+            <w:pPr>
+              <w:pStyle w:val="Compact"/>
+              <w:jc w:val="center"/>
+            </w:pPr>
+            <w:r>
+              <w:t xml:space="preserve">Control 14days (n=5)</w:t>
+            </w:r>
+          </w:p>
+        </w:tc>
+        <w:tc>
+          <w:tcPr/>
+          <w:p>
+            <w:pPr>
+              <w:pStyle w:val="Compact"/>
+              <w:jc w:val="center"/>
+            </w:pPr>
+            <w:r>
+              <w:t xml:space="preserve">0.6363</w:t>
+            </w:r>
+          </w:p>
+        </w:tc>
+        <w:tc>
+          <w:tcPr/>
+          <w:p>
+            <w:pPr>
+              <w:pStyle w:val="Compact"/>
+              <w:jc w:val="center"/>
+            </w:pPr>
+            <w:r>
+              <w:t xml:space="preserve">0.1068</w:t>
             </w:r>
           </w:p>
         </w:tc>
@@ -1260,43 +1320,43 @@
               <w:jc w:val="center"/>
             </w:pPr>
             <w:r>
-              <w:t xml:space="preserve">3</w:t>
-            </w:r>
-          </w:p>
-        </w:tc>
-        <w:tc>
-          <w:tcPr/>
-          <w:p>
-            <w:pPr>
-              <w:pStyle w:val="Compact"/>
-              <w:jc w:val="center"/>
-            </w:pPr>
-            <w:r>
-              <w:t xml:space="preserve">Activin 50ng/ml 2days (n=5)</w:t>
-            </w:r>
-          </w:p>
-        </w:tc>
-        <w:tc>
-          <w:tcPr/>
-          <w:p>
-            <w:pPr>
-              <w:pStyle w:val="Compact"/>
-              <w:jc w:val="center"/>
-            </w:pPr>
-            <w:r>
-              <w:t xml:space="preserve">0.4933</w:t>
-            </w:r>
-          </w:p>
-        </w:tc>
-        <w:tc>
-          <w:tcPr/>
-          <w:p>
-            <w:pPr>
-              <w:pStyle w:val="Compact"/>
-              <w:jc w:val="center"/>
-            </w:pPr>
-            <w:r>
-              <w:t xml:space="preserve">0.09656</w:t>
+              <w:t xml:space="preserve">2</w:t>
+            </w:r>
+          </w:p>
+        </w:tc>
+        <w:tc>
+          <w:tcPr/>
+          <w:p>
+            <w:pPr>
+              <w:pStyle w:val="Compact"/>
+              <w:jc w:val="center"/>
+            </w:pPr>
+            <w:r>
+              <w:t xml:space="preserve">Control 7days (n=1)</w:t>
+            </w:r>
+          </w:p>
+        </w:tc>
+        <w:tc>
+          <w:tcPr/>
+          <w:p>
+            <w:pPr>
+              <w:pStyle w:val="Compact"/>
+              <w:jc w:val="center"/>
+            </w:pPr>
+            <w:r>
+              <w:t xml:space="preserve">0.7328</w:t>
+            </w:r>
+          </w:p>
+        </w:tc>
+        <w:tc>
+          <w:tcPr/>
+          <w:p>
+            <w:pPr>
+              <w:pStyle w:val="Compact"/>
+              <w:jc w:val="center"/>
+            </w:pPr>
+            <w:r>
+              <w:t xml:space="preserve">0</w:t>
             </w:r>
           </w:p>
         </w:tc>
@@ -1322,31 +1382,31 @@
               <w:jc w:val="center"/>
             </w:pPr>
             <w:r>
-              <w:t xml:space="preserve">Control 14days (n=5)</w:t>
-            </w:r>
-          </w:p>
-        </w:tc>
-        <w:tc>
-          <w:tcPr/>
-          <w:p>
-            <w:pPr>
-              <w:pStyle w:val="Compact"/>
-              <w:jc w:val="center"/>
-            </w:pPr>
-            <w:r>
-              <w:t xml:space="preserve">0.6464</w:t>
-            </w:r>
-          </w:p>
-        </w:tc>
-        <w:tc>
-          <w:tcPr/>
-          <w:p>
-            <w:pPr>
-              <w:pStyle w:val="Compact"/>
-              <w:jc w:val="center"/>
-            </w:pPr>
-            <w:r>
-              <w:t xml:space="preserve">0.1258</w:t>
+              <w:t xml:space="preserve">Activin 50ng/ml 14days (n=5)</w:t>
+            </w:r>
+          </w:p>
+        </w:tc>
+        <w:tc>
+          <w:tcPr/>
+          <w:p>
+            <w:pPr>
+              <w:pStyle w:val="Compact"/>
+              <w:jc w:val="center"/>
+            </w:pPr>
+            <w:r>
+              <w:t xml:space="preserve">0.5985</w:t>
+            </w:r>
+          </w:p>
+        </w:tc>
+        <w:tc>
+          <w:tcPr/>
+          <w:p>
+            <w:pPr>
+              <w:pStyle w:val="Compact"/>
+              <w:jc w:val="center"/>
+            </w:pPr>
+            <w:r>
+              <w:t xml:space="preserve">0.06922</w:t>
             </w:r>
           </w:p>
         </w:tc>
@@ -1360,43 +1420,43 @@
               <w:jc w:val="center"/>
             </w:pPr>
             <w:r>
-              <w:t xml:space="preserve">4</w:t>
-            </w:r>
-          </w:p>
-        </w:tc>
-        <w:tc>
-          <w:tcPr/>
-          <w:p>
-            <w:pPr>
-              <w:pStyle w:val="Compact"/>
-              <w:jc w:val="center"/>
-            </w:pPr>
-            <w:r>
-              <w:t xml:space="preserve">Activin 50ng/ml 14days (n=5)</w:t>
-            </w:r>
-          </w:p>
-        </w:tc>
-        <w:tc>
-          <w:tcPr/>
-          <w:p>
-            <w:pPr>
-              <w:pStyle w:val="Compact"/>
-              <w:jc w:val="center"/>
-            </w:pPr>
-            <w:r>
-              <w:t xml:space="preserve">0.5328</w:t>
-            </w:r>
-          </w:p>
-        </w:tc>
-        <w:tc>
-          <w:tcPr/>
-          <w:p>
-            <w:pPr>
-              <w:pStyle w:val="Compact"/>
-              <w:jc w:val="center"/>
-            </w:pPr>
-            <w:r>
-              <w:t xml:space="preserve">0.04306</w:t>
+              <w:t xml:space="preserve">3</w:t>
+            </w:r>
+          </w:p>
+        </w:tc>
+        <w:tc>
+          <w:tcPr/>
+          <w:p>
+            <w:pPr>
+              <w:pStyle w:val="Compact"/>
+              <w:jc w:val="center"/>
+            </w:pPr>
+            <w:r>
+              <w:t xml:space="preserve">Activin 50ng/ml 2days (n=5)</w:t>
+            </w:r>
+          </w:p>
+        </w:tc>
+        <w:tc>
+          <w:tcPr/>
+          <w:p>
+            <w:pPr>
+              <w:pStyle w:val="Compact"/>
+              <w:jc w:val="center"/>
+            </w:pPr>
+            <w:r>
+              <w:t xml:space="preserve">0.4933</w:t>
+            </w:r>
+          </w:p>
+        </w:tc>
+        <w:tc>
+          <w:tcPr/>
+          <w:p>
+            <w:pPr>
+              <w:pStyle w:val="Compact"/>
+              <w:jc w:val="center"/>
+            </w:pPr>
+            <w:r>
+              <w:t xml:space="preserve">0.09656</w:t>
             </w:r>
           </w:p>
         </w:tc>
@@ -1410,43 +1470,43 @@
               <w:jc w:val="center"/>
             </w:pPr>
             <w:r>
-              <w:t xml:space="preserve">4</w:t>
-            </w:r>
-          </w:p>
-        </w:tc>
-        <w:tc>
-          <w:tcPr/>
-          <w:p>
-            <w:pPr>
-              <w:pStyle w:val="Compact"/>
-              <w:jc w:val="center"/>
-            </w:pPr>
-            <w:r>
-              <w:t xml:space="preserve">Activin 50ng/ml 2days (n=5)</w:t>
-            </w:r>
-          </w:p>
-        </w:tc>
-        <w:tc>
-          <w:tcPr/>
-          <w:p>
-            <w:pPr>
-              <w:pStyle w:val="Compact"/>
-              <w:jc w:val="center"/>
-            </w:pPr>
-            <w:r>
-              <w:t xml:space="preserve">0.4509</w:t>
-            </w:r>
-          </w:p>
-        </w:tc>
-        <w:tc>
-          <w:tcPr/>
-          <w:p>
-            <w:pPr>
-              <w:pStyle w:val="Compact"/>
-              <w:jc w:val="center"/>
-            </w:pPr>
-            <w:r>
-              <w:t xml:space="preserve">0.07605</w:t>
+              <w:t xml:space="preserve">3</w:t>
+            </w:r>
+          </w:p>
+        </w:tc>
+        <w:tc>
+          <w:tcPr/>
+          <w:p>
+            <w:pPr>
+              <w:pStyle w:val="Compact"/>
+              <w:jc w:val="center"/>
+            </w:pPr>
+            <w:r>
+              <w:t xml:space="preserve">Control 14days (n=5)</w:t>
+            </w:r>
+          </w:p>
+        </w:tc>
+        <w:tc>
+          <w:tcPr/>
+          <w:p>
+            <w:pPr>
+              <w:pStyle w:val="Compact"/>
+              <w:jc w:val="center"/>
+            </w:pPr>
+            <w:r>
+              <w:t xml:space="preserve">0.6464</w:t>
+            </w:r>
+          </w:p>
+        </w:tc>
+        <w:tc>
+          <w:tcPr/>
+          <w:p>
+            <w:pPr>
+              <w:pStyle w:val="Compact"/>
+              <w:jc w:val="center"/>
+            </w:pPr>
+            <w:r>
+              <w:t xml:space="preserve">0.1258</w:t>
             </w:r>
           </w:p>
         </w:tc>
@@ -1460,43 +1520,43 @@
               <w:jc w:val="center"/>
             </w:pPr>
             <w:r>
-              <w:t xml:space="preserve">4</w:t>
-            </w:r>
-          </w:p>
-        </w:tc>
-        <w:tc>
-          <w:tcPr/>
-          <w:p>
-            <w:pPr>
-              <w:pStyle w:val="Compact"/>
-              <w:jc w:val="center"/>
-            </w:pPr>
-            <w:r>
-              <w:t xml:space="preserve">Control 14days (n=5)</w:t>
-            </w:r>
-          </w:p>
-        </w:tc>
-        <w:tc>
-          <w:tcPr/>
-          <w:p>
-            <w:pPr>
-              <w:pStyle w:val="Compact"/>
-              <w:jc w:val="center"/>
-            </w:pPr>
-            <w:r>
-              <w:t xml:space="preserve">0.6256</w:t>
-            </w:r>
-          </w:p>
-        </w:tc>
-        <w:tc>
-          <w:tcPr/>
-          <w:p>
-            <w:pPr>
-              <w:pStyle w:val="Compact"/>
-              <w:jc w:val="center"/>
-            </w:pPr>
-            <w:r>
-              <w:t xml:space="preserve">0.1254</w:t>
+              <w:t xml:space="preserve">3</w:t>
+            </w:r>
+          </w:p>
+        </w:tc>
+        <w:tc>
+          <w:tcPr/>
+          <w:p>
+            <w:pPr>
+              <w:pStyle w:val="Compact"/>
+              <w:jc w:val="center"/>
+            </w:pPr>
+            <w:r>
+              <w:t xml:space="preserve">Control 7days (n=1)</w:t>
+            </w:r>
+          </w:p>
+        </w:tc>
+        <w:tc>
+          <w:tcPr/>
+          <w:p>
+            <w:pPr>
+              <w:pStyle w:val="Compact"/>
+              <w:jc w:val="center"/>
+            </w:pPr>
+            <w:r>
+              <w:t xml:space="preserve">0.5733</w:t>
+            </w:r>
+          </w:p>
+        </w:tc>
+        <w:tc>
+          <w:tcPr/>
+          <w:p>
+            <w:pPr>
+              <w:pStyle w:val="Compact"/>
+              <w:jc w:val="center"/>
+            </w:pPr>
+            <w:r>
+              <w:t xml:space="preserve">0</w:t>
             </w:r>
           </w:p>
         </w:tc>
@@ -1510,7 +1570,7 @@
               <w:jc w:val="center"/>
             </w:pPr>
             <w:r>
-              <w:t xml:space="preserve">5</w:t>
+              <w:t xml:space="preserve">4</w:t>
             </w:r>
           </w:p>
         </w:tc>
@@ -1534,19 +1594,19 @@
               <w:jc w:val="center"/>
             </w:pPr>
             <w:r>
-              <w:t xml:space="preserve">0.4296</w:t>
-            </w:r>
-          </w:p>
-        </w:tc>
-        <w:tc>
-          <w:tcPr/>
-          <w:p>
-            <w:pPr>
-              <w:pStyle w:val="Compact"/>
-              <w:jc w:val="center"/>
-            </w:pPr>
-            <w:r>
-              <w:t xml:space="preserve">0.04905</w:t>
+              <w:t xml:space="preserve">0.5328</w:t>
+            </w:r>
+          </w:p>
+        </w:tc>
+        <w:tc>
+          <w:tcPr/>
+          <w:p>
+            <w:pPr>
+              <w:pStyle w:val="Compact"/>
+              <w:jc w:val="center"/>
+            </w:pPr>
+            <w:r>
+              <w:t xml:space="preserve">0.04306</w:t>
             </w:r>
           </w:p>
         </w:tc>
@@ -1560,7 +1620,7 @@
               <w:jc w:val="center"/>
             </w:pPr>
             <w:r>
-              <w:t xml:space="preserve">5</w:t>
+              <w:t xml:space="preserve">4</w:t>
             </w:r>
           </w:p>
         </w:tc>
@@ -1584,19 +1644,19 @@
               <w:jc w:val="center"/>
             </w:pPr>
             <w:r>
-              <w:t xml:space="preserve">0.4129</w:t>
-            </w:r>
-          </w:p>
-        </w:tc>
-        <w:tc>
-          <w:tcPr/>
-          <w:p>
-            <w:pPr>
-              <w:pStyle w:val="Compact"/>
-              <w:jc w:val="center"/>
-            </w:pPr>
-            <w:r>
-              <w:t xml:space="preserve">0.07299</w:t>
+              <w:t xml:space="preserve">0.4509</w:t>
+            </w:r>
+          </w:p>
+        </w:tc>
+        <w:tc>
+          <w:tcPr/>
+          <w:p>
+            <w:pPr>
+              <w:pStyle w:val="Compact"/>
+              <w:jc w:val="center"/>
+            </w:pPr>
+            <w:r>
+              <w:t xml:space="preserve">0.07605</w:t>
             </w:r>
           </w:p>
         </w:tc>
@@ -1610,7 +1670,7 @@
               <w:jc w:val="center"/>
             </w:pPr>
             <w:r>
-              <w:t xml:space="preserve">5</w:t>
+              <w:t xml:space="preserve">4</w:t>
             </w:r>
           </w:p>
         </w:tc>
@@ -1634,19 +1694,19 @@
               <w:jc w:val="center"/>
             </w:pPr>
             <w:r>
-              <w:t xml:space="preserve">0.5461</w:t>
-            </w:r>
-          </w:p>
-        </w:tc>
-        <w:tc>
-          <w:tcPr/>
-          <w:p>
-            <w:pPr>
-              <w:pStyle w:val="Compact"/>
-              <w:jc w:val="center"/>
-            </w:pPr>
-            <w:r>
-              <w:t xml:space="preserve">0.1919</w:t>
+              <w:t xml:space="preserve">0.6256</w:t>
+            </w:r>
+          </w:p>
+        </w:tc>
+        <w:tc>
+          <w:tcPr/>
+          <w:p>
+            <w:pPr>
+              <w:pStyle w:val="Compact"/>
+              <w:jc w:val="center"/>
+            </w:pPr>
+            <w:r>
+              <w:t xml:space="preserve">0.1254</w:t>
             </w:r>
           </w:p>
         </w:tc>
@@ -1660,43 +1720,43 @@
               <w:jc w:val="center"/>
             </w:pPr>
             <w:r>
-              <w:t xml:space="preserve">6</w:t>
-            </w:r>
-          </w:p>
-        </w:tc>
-        <w:tc>
-          <w:tcPr/>
-          <w:p>
-            <w:pPr>
-              <w:pStyle w:val="Compact"/>
-              <w:jc w:val="center"/>
-            </w:pPr>
-            <w:r>
-              <w:t xml:space="preserve">Activin 50ng/ml 14days (n=5)</w:t>
-            </w:r>
-          </w:p>
-        </w:tc>
-        <w:tc>
-          <w:tcPr/>
-          <w:p>
-            <w:pPr>
-              <w:pStyle w:val="Compact"/>
-              <w:jc w:val="center"/>
-            </w:pPr>
-            <w:r>
-              <w:t xml:space="preserve">0.3498</w:t>
-            </w:r>
-          </w:p>
-        </w:tc>
-        <w:tc>
-          <w:tcPr/>
-          <w:p>
-            <w:pPr>
-              <w:pStyle w:val="Compact"/>
-              <w:jc w:val="center"/>
-            </w:pPr>
-            <w:r>
-              <w:t xml:space="preserve">0.08917</w:t>
+              <w:t xml:space="preserve">4</w:t>
+            </w:r>
+          </w:p>
+        </w:tc>
+        <w:tc>
+          <w:tcPr/>
+          <w:p>
+            <w:pPr>
+              <w:pStyle w:val="Compact"/>
+              <w:jc w:val="center"/>
+            </w:pPr>
+            <w:r>
+              <w:t xml:space="preserve">Control 7days (n=1)</w:t>
+            </w:r>
+          </w:p>
+        </w:tc>
+        <w:tc>
+          <w:tcPr/>
+          <w:p>
+            <w:pPr>
+              <w:pStyle w:val="Compact"/>
+              <w:jc w:val="center"/>
+            </w:pPr>
+            <w:r>
+              <w:t xml:space="preserve">0.5603</w:t>
+            </w:r>
+          </w:p>
+        </w:tc>
+        <w:tc>
+          <w:tcPr/>
+          <w:p>
+            <w:pPr>
+              <w:pStyle w:val="Compact"/>
+              <w:jc w:val="center"/>
+            </w:pPr>
+            <w:r>
+              <w:t xml:space="preserve">0</w:t>
             </w:r>
           </w:p>
         </w:tc>
@@ -1710,43 +1770,43 @@
               <w:jc w:val="center"/>
             </w:pPr>
             <w:r>
-              <w:t xml:space="preserve">6</w:t>
-            </w:r>
-          </w:p>
-        </w:tc>
-        <w:tc>
-          <w:tcPr/>
-          <w:p>
-            <w:pPr>
-              <w:pStyle w:val="Compact"/>
-              <w:jc w:val="center"/>
-            </w:pPr>
-            <w:r>
-              <w:t xml:space="preserve">Activin 50ng/ml 2days (n=5)</w:t>
-            </w:r>
-          </w:p>
-        </w:tc>
-        <w:tc>
-          <w:tcPr/>
-          <w:p>
-            <w:pPr>
-              <w:pStyle w:val="Compact"/>
-              <w:jc w:val="center"/>
-            </w:pPr>
-            <w:r>
-              <w:t xml:space="preserve">0.392</w:t>
-            </w:r>
-          </w:p>
-        </w:tc>
-        <w:tc>
-          <w:tcPr/>
-          <w:p>
-            <w:pPr>
-              <w:pStyle w:val="Compact"/>
-              <w:jc w:val="center"/>
-            </w:pPr>
-            <w:r>
-              <w:t xml:space="preserve">0.1203</w:t>
+              <w:t xml:space="preserve">5</w:t>
+            </w:r>
+          </w:p>
+        </w:tc>
+        <w:tc>
+          <w:tcPr/>
+          <w:p>
+            <w:pPr>
+              <w:pStyle w:val="Compact"/>
+              <w:jc w:val="center"/>
+            </w:pPr>
+            <w:r>
+              <w:t xml:space="preserve">Activin 50ng/ml 14days (n=5)</w:t>
+            </w:r>
+          </w:p>
+        </w:tc>
+        <w:tc>
+          <w:tcPr/>
+          <w:p>
+            <w:pPr>
+              <w:pStyle w:val="Compact"/>
+              <w:jc w:val="center"/>
+            </w:pPr>
+            <w:r>
+              <w:t xml:space="preserve">0.4296</w:t>
+            </w:r>
+          </w:p>
+        </w:tc>
+        <w:tc>
+          <w:tcPr/>
+          <w:p>
+            <w:pPr>
+              <w:pStyle w:val="Compact"/>
+              <w:jc w:val="center"/>
+            </w:pPr>
+            <w:r>
+              <w:t xml:space="preserve">0.04905</w:t>
             </w:r>
           </w:p>
         </w:tc>
@@ -1760,43 +1820,43 @@
               <w:jc w:val="center"/>
             </w:pPr>
             <w:r>
-              <w:t xml:space="preserve">6</w:t>
-            </w:r>
-          </w:p>
-        </w:tc>
-        <w:tc>
-          <w:tcPr/>
-          <w:p>
-            <w:pPr>
-              <w:pStyle w:val="Compact"/>
-              <w:jc w:val="center"/>
-            </w:pPr>
-            <w:r>
-              <w:t xml:space="preserve">Control 14days (n=5)</w:t>
-            </w:r>
-          </w:p>
-        </w:tc>
-        <w:tc>
-          <w:tcPr/>
-          <w:p>
-            <w:pPr>
-              <w:pStyle w:val="Compact"/>
-              <w:jc w:val="center"/>
-            </w:pPr>
-            <w:r>
-              <w:t xml:space="preserve">0.4624</w:t>
-            </w:r>
-          </w:p>
-        </w:tc>
-        <w:tc>
-          <w:tcPr/>
-          <w:p>
-            <w:pPr>
-              <w:pStyle w:val="Compact"/>
-              <w:jc w:val="center"/>
-            </w:pPr>
-            <w:r>
-              <w:t xml:space="preserve">0.1765</w:t>
+              <w:t xml:space="preserve">5</w:t>
+            </w:r>
+          </w:p>
+        </w:tc>
+        <w:tc>
+          <w:tcPr/>
+          <w:p>
+            <w:pPr>
+              <w:pStyle w:val="Compact"/>
+              <w:jc w:val="center"/>
+            </w:pPr>
+            <w:r>
+              <w:t xml:space="preserve">Activin 50ng/ml 2days (n=5)</w:t>
+            </w:r>
+          </w:p>
+        </w:tc>
+        <w:tc>
+          <w:tcPr/>
+          <w:p>
+            <w:pPr>
+              <w:pStyle w:val="Compact"/>
+              <w:jc w:val="center"/>
+            </w:pPr>
+            <w:r>
+              <w:t xml:space="preserve">0.4129</w:t>
+            </w:r>
+          </w:p>
+        </w:tc>
+        <w:tc>
+          <w:tcPr/>
+          <w:p>
+            <w:pPr>
+              <w:pStyle w:val="Compact"/>
+              <w:jc w:val="center"/>
+            </w:pPr>
+            <w:r>
+              <w:t xml:space="preserve">0.07299</w:t>
             </w:r>
           </w:p>
         </w:tc>
@@ -1810,43 +1870,43 @@
               <w:jc w:val="center"/>
             </w:pPr>
             <w:r>
-              <w:t xml:space="preserve">7</w:t>
-            </w:r>
-          </w:p>
-        </w:tc>
-        <w:tc>
-          <w:tcPr/>
-          <w:p>
-            <w:pPr>
-              <w:pStyle w:val="Compact"/>
-              <w:jc w:val="center"/>
-            </w:pPr>
-            <w:r>
-              <w:t xml:space="preserve">Activin 50ng/ml 14days (n=5)</w:t>
-            </w:r>
-          </w:p>
-        </w:tc>
-        <w:tc>
-          <w:tcPr/>
-          <w:p>
-            <w:pPr>
-              <w:pStyle w:val="Compact"/>
-              <w:jc w:val="center"/>
-            </w:pPr>
-            <w:r>
-              <w:t xml:space="preserve">0.3337</w:t>
-            </w:r>
-          </w:p>
-        </w:tc>
-        <w:tc>
-          <w:tcPr/>
-          <w:p>
-            <w:pPr>
-              <w:pStyle w:val="Compact"/>
-              <w:jc w:val="center"/>
-            </w:pPr>
-            <w:r>
-              <w:t xml:space="preserve">0.1421</w:t>
+              <w:t xml:space="preserve">5</w:t>
+            </w:r>
+          </w:p>
+        </w:tc>
+        <w:tc>
+          <w:tcPr/>
+          <w:p>
+            <w:pPr>
+              <w:pStyle w:val="Compact"/>
+              <w:jc w:val="center"/>
+            </w:pPr>
+            <w:r>
+              <w:t xml:space="preserve">Control 14days (n=5)</w:t>
+            </w:r>
+          </w:p>
+        </w:tc>
+        <w:tc>
+          <w:tcPr/>
+          <w:p>
+            <w:pPr>
+              <w:pStyle w:val="Compact"/>
+              <w:jc w:val="center"/>
+            </w:pPr>
+            <w:r>
+              <w:t xml:space="preserve">0.5461</w:t>
+            </w:r>
+          </w:p>
+        </w:tc>
+        <w:tc>
+          <w:tcPr/>
+          <w:p>
+            <w:pPr>
+              <w:pStyle w:val="Compact"/>
+              <w:jc w:val="center"/>
+            </w:pPr>
+            <w:r>
+              <w:t xml:space="preserve">0.1919</w:t>
             </w:r>
           </w:p>
         </w:tc>
@@ -1860,43 +1920,43 @@
               <w:jc w:val="center"/>
             </w:pPr>
             <w:r>
-              <w:t xml:space="preserve">7</w:t>
-            </w:r>
-          </w:p>
-        </w:tc>
-        <w:tc>
-          <w:tcPr/>
-          <w:p>
-            <w:pPr>
-              <w:pStyle w:val="Compact"/>
-              <w:jc w:val="center"/>
-            </w:pPr>
-            <w:r>
-              <w:t xml:space="preserve">Activin 50ng/ml 2days (n=5)</w:t>
-            </w:r>
-          </w:p>
-        </w:tc>
-        <w:tc>
-          <w:tcPr/>
-          <w:p>
-            <w:pPr>
-              <w:pStyle w:val="Compact"/>
-              <w:jc w:val="center"/>
-            </w:pPr>
-            <w:r>
-              <w:t xml:space="preserve">0.3357</w:t>
-            </w:r>
-          </w:p>
-        </w:tc>
-        <w:tc>
-          <w:tcPr/>
-          <w:p>
-            <w:pPr>
-              <w:pStyle w:val="Compact"/>
-              <w:jc w:val="center"/>
-            </w:pPr>
-            <w:r>
-              <w:t xml:space="preserve">0.09613</w:t>
+              <w:t xml:space="preserve">5</w:t>
+            </w:r>
+          </w:p>
+        </w:tc>
+        <w:tc>
+          <w:tcPr/>
+          <w:p>
+            <w:pPr>
+              <w:pStyle w:val="Compact"/>
+              <w:jc w:val="center"/>
+            </w:pPr>
+            <w:r>
+              <w:t xml:space="preserve">Control 7days (n=1)</w:t>
+            </w:r>
+          </w:p>
+        </w:tc>
+        <w:tc>
+          <w:tcPr/>
+          <w:p>
+            <w:pPr>
+              <w:pStyle w:val="Compact"/>
+              <w:jc w:val="center"/>
+            </w:pPr>
+            <w:r>
+              <w:t xml:space="preserve">0.6897</w:t>
+            </w:r>
+          </w:p>
+        </w:tc>
+        <w:tc>
+          <w:tcPr/>
+          <w:p>
+            <w:pPr>
+              <w:pStyle w:val="Compact"/>
+              <w:jc w:val="center"/>
+            </w:pPr>
+            <w:r>
+              <w:t xml:space="preserve">0</w:t>
             </w:r>
           </w:p>
         </w:tc>
@@ -1910,43 +1970,43 @@
               <w:jc w:val="center"/>
             </w:pPr>
             <w:r>
-              <w:t xml:space="preserve">7</w:t>
-            </w:r>
-          </w:p>
-        </w:tc>
-        <w:tc>
-          <w:tcPr/>
-          <w:p>
-            <w:pPr>
-              <w:pStyle w:val="Compact"/>
-              <w:jc w:val="center"/>
-            </w:pPr>
-            <w:r>
-              <w:t xml:space="preserve">Control 14days (n=5)</w:t>
-            </w:r>
-          </w:p>
-        </w:tc>
-        <w:tc>
-          <w:tcPr/>
-          <w:p>
-            <w:pPr>
-              <w:pStyle w:val="Compact"/>
-              <w:jc w:val="center"/>
-            </w:pPr>
-            <w:r>
-              <w:t xml:space="preserve">0.4713</w:t>
-            </w:r>
-          </w:p>
-        </w:tc>
-        <w:tc>
-          <w:tcPr/>
-          <w:p>
-            <w:pPr>
-              <w:pStyle w:val="Compact"/>
-              <w:jc w:val="center"/>
-            </w:pPr>
-            <w:r>
-              <w:t xml:space="preserve">0.1801</w:t>
+              <w:t xml:space="preserve">6</w:t>
+            </w:r>
+          </w:p>
+        </w:tc>
+        <w:tc>
+          <w:tcPr/>
+          <w:p>
+            <w:pPr>
+              <w:pStyle w:val="Compact"/>
+              <w:jc w:val="center"/>
+            </w:pPr>
+            <w:r>
+              <w:t xml:space="preserve">Activin 50ng/ml 14days (n=5)</w:t>
+            </w:r>
+          </w:p>
+        </w:tc>
+        <w:tc>
+          <w:tcPr/>
+          <w:p>
+            <w:pPr>
+              <w:pStyle w:val="Compact"/>
+              <w:jc w:val="center"/>
+            </w:pPr>
+            <w:r>
+              <w:t xml:space="preserve">0.3498</w:t>
+            </w:r>
+          </w:p>
+        </w:tc>
+        <w:tc>
+          <w:tcPr/>
+          <w:p>
+            <w:pPr>
+              <w:pStyle w:val="Compact"/>
+              <w:jc w:val="center"/>
+            </w:pPr>
+            <w:r>
+              <w:t xml:space="preserve">0.08917</w:t>
             </w:r>
           </w:p>
         </w:tc>
@@ -1960,43 +2020,43 @@
               <w:jc w:val="center"/>
             </w:pPr>
             <w:r>
-              <w:t xml:space="preserve">8</w:t>
-            </w:r>
-          </w:p>
-        </w:tc>
-        <w:tc>
-          <w:tcPr/>
-          <w:p>
-            <w:pPr>
-              <w:pStyle w:val="Compact"/>
-              <w:jc w:val="center"/>
-            </w:pPr>
-            <w:r>
-              <w:t xml:space="preserve">Activin 50ng/ml 14days (n=5)</w:t>
-            </w:r>
-          </w:p>
-        </w:tc>
-        <w:tc>
-          <w:tcPr/>
-          <w:p>
-            <w:pPr>
-              <w:pStyle w:val="Compact"/>
-              <w:jc w:val="center"/>
-            </w:pPr>
-            <w:r>
-              <w:t xml:space="preserve">0.2915</w:t>
-            </w:r>
-          </w:p>
-        </w:tc>
-        <w:tc>
-          <w:tcPr/>
-          <w:p>
-            <w:pPr>
-              <w:pStyle w:val="Compact"/>
-              <w:jc w:val="center"/>
-            </w:pPr>
-            <w:r>
-              <w:t xml:space="preserve">0.1502</w:t>
+              <w:t xml:space="preserve">6</w:t>
+            </w:r>
+          </w:p>
+        </w:tc>
+        <w:tc>
+          <w:tcPr/>
+          <w:p>
+            <w:pPr>
+              <w:pStyle w:val="Compact"/>
+              <w:jc w:val="center"/>
+            </w:pPr>
+            <w:r>
+              <w:t xml:space="preserve">Activin 50ng/ml 2days (n=5)</w:t>
+            </w:r>
+          </w:p>
+        </w:tc>
+        <w:tc>
+          <w:tcPr/>
+          <w:p>
+            <w:pPr>
+              <w:pStyle w:val="Compact"/>
+              <w:jc w:val="center"/>
+            </w:pPr>
+            <w:r>
+              <w:t xml:space="preserve">0.392</w:t>
+            </w:r>
+          </w:p>
+        </w:tc>
+        <w:tc>
+          <w:tcPr/>
+          <w:p>
+            <w:pPr>
+              <w:pStyle w:val="Compact"/>
+              <w:jc w:val="center"/>
+            </w:pPr>
+            <w:r>
+              <w:t xml:space="preserve">0.1203</w:t>
             </w:r>
           </w:p>
         </w:tc>
@@ -2010,43 +2070,43 @@
               <w:jc w:val="center"/>
             </w:pPr>
             <w:r>
-              <w:t xml:space="preserve">8</w:t>
-            </w:r>
-          </w:p>
-        </w:tc>
-        <w:tc>
-          <w:tcPr/>
-          <w:p>
-            <w:pPr>
-              <w:pStyle w:val="Compact"/>
-              <w:jc w:val="center"/>
-            </w:pPr>
-            <w:r>
-              <w:t xml:space="preserve">Activin 50ng/ml 2days (n=5)</w:t>
-            </w:r>
-          </w:p>
-        </w:tc>
-        <w:tc>
-          <w:tcPr/>
-          <w:p>
-            <w:pPr>
-              <w:pStyle w:val="Compact"/>
-              <w:jc w:val="center"/>
-            </w:pPr>
-            <w:r>
-              <w:t xml:space="preserve">0.2828</w:t>
-            </w:r>
-          </w:p>
-        </w:tc>
-        <w:tc>
-          <w:tcPr/>
-          <w:p>
-            <w:pPr>
-              <w:pStyle w:val="Compact"/>
-              <w:jc w:val="center"/>
-            </w:pPr>
-            <w:r>
-              <w:t xml:space="preserve">0.08893</w:t>
+              <w:t xml:space="preserve">6</w:t>
+            </w:r>
+          </w:p>
+        </w:tc>
+        <w:tc>
+          <w:tcPr/>
+          <w:p>
+            <w:pPr>
+              <w:pStyle w:val="Compact"/>
+              <w:jc w:val="center"/>
+            </w:pPr>
+            <w:r>
+              <w:t xml:space="preserve">Control 14days (n=5)</w:t>
+            </w:r>
+          </w:p>
+        </w:tc>
+        <w:tc>
+          <w:tcPr/>
+          <w:p>
+            <w:pPr>
+              <w:pStyle w:val="Compact"/>
+              <w:jc w:val="center"/>
+            </w:pPr>
+            <w:r>
+              <w:t xml:space="preserve">0.4624</w:t>
+            </w:r>
+          </w:p>
+        </w:tc>
+        <w:tc>
+          <w:tcPr/>
+          <w:p>
+            <w:pPr>
+              <w:pStyle w:val="Compact"/>
+              <w:jc w:val="center"/>
+            </w:pPr>
+            <w:r>
+              <w:t xml:space="preserve">0.1765</w:t>
             </w:r>
           </w:p>
         </w:tc>
@@ -2060,43 +2120,43 @@
               <w:jc w:val="center"/>
             </w:pPr>
             <w:r>
-              <w:t xml:space="preserve">8</w:t>
-            </w:r>
-          </w:p>
-        </w:tc>
-        <w:tc>
-          <w:tcPr/>
-          <w:p>
-            <w:pPr>
-              <w:pStyle w:val="Compact"/>
-              <w:jc w:val="center"/>
-            </w:pPr>
-            <w:r>
-              <w:t xml:space="preserve">Control 14days (n=5)</w:t>
-            </w:r>
-          </w:p>
-        </w:tc>
-        <w:tc>
-          <w:tcPr/>
-          <w:p>
-            <w:pPr>
-              <w:pStyle w:val="Compact"/>
-              <w:jc w:val="center"/>
-            </w:pPr>
-            <w:r>
-              <w:t xml:space="preserve">0.3819</w:t>
-            </w:r>
-          </w:p>
-        </w:tc>
-        <w:tc>
-          <w:tcPr/>
-          <w:p>
-            <w:pPr>
-              <w:pStyle w:val="Compact"/>
-              <w:jc w:val="center"/>
-            </w:pPr>
-            <w:r>
-              <w:t xml:space="preserve">0.1656</w:t>
+              <w:t xml:space="preserve">6</w:t>
+            </w:r>
+          </w:p>
+        </w:tc>
+        <w:tc>
+          <w:tcPr/>
+          <w:p>
+            <w:pPr>
+              <w:pStyle w:val="Compact"/>
+              <w:jc w:val="center"/>
+            </w:pPr>
+            <w:r>
+              <w:t xml:space="preserve">Control 7days (n=1)</w:t>
+            </w:r>
+          </w:p>
+        </w:tc>
+        <w:tc>
+          <w:tcPr/>
+          <w:p>
+            <w:pPr>
+              <w:pStyle w:val="Compact"/>
+              <w:jc w:val="center"/>
+            </w:pPr>
+            <w:r>
+              <w:t xml:space="preserve">0.6342</w:t>
+            </w:r>
+          </w:p>
+        </w:tc>
+        <w:tc>
+          <w:tcPr/>
+          <w:p>
+            <w:pPr>
+              <w:pStyle w:val="Compact"/>
+              <w:jc w:val="center"/>
+            </w:pPr>
+            <w:r>
+              <w:t xml:space="preserve">0</w:t>
             </w:r>
           </w:p>
         </w:tc>
@@ -2110,7 +2170,7 @@
               <w:jc w:val="center"/>
             </w:pPr>
             <w:r>
-              <w:t xml:space="preserve">9</w:t>
+              <w:t xml:space="preserve">7</w:t>
             </w:r>
           </w:p>
         </w:tc>
@@ -2134,19 +2194,19 @@
               <w:jc w:val="center"/>
             </w:pPr>
             <w:r>
-              <w:t xml:space="preserve">0.2011</w:t>
-            </w:r>
-          </w:p>
-        </w:tc>
-        <w:tc>
-          <w:tcPr/>
-          <w:p>
-            <w:pPr>
-              <w:pStyle w:val="Compact"/>
-              <w:jc w:val="center"/>
-            </w:pPr>
-            <w:r>
-              <w:t xml:space="preserve">0.1121</w:t>
+              <w:t xml:space="preserve">0.3337</w:t>
+            </w:r>
+          </w:p>
+        </w:tc>
+        <w:tc>
+          <w:tcPr/>
+          <w:p>
+            <w:pPr>
+              <w:pStyle w:val="Compact"/>
+              <w:jc w:val="center"/>
+            </w:pPr>
+            <w:r>
+              <w:t xml:space="preserve">0.1421</w:t>
             </w:r>
           </w:p>
         </w:tc>
@@ -2160,7 +2220,7 @@
               <w:jc w:val="center"/>
             </w:pPr>
             <w:r>
-              <w:t xml:space="preserve">9</w:t>
+              <w:t xml:space="preserve">7</w:t>
             </w:r>
           </w:p>
         </w:tc>
@@ -2184,19 +2244,19 @@
               <w:jc w:val="center"/>
             </w:pPr>
             <w:r>
-              <w:t xml:space="preserve">0.2273</w:t>
-            </w:r>
-          </w:p>
-        </w:tc>
-        <w:tc>
-          <w:tcPr/>
-          <w:p>
-            <w:pPr>
-              <w:pStyle w:val="Compact"/>
-              <w:jc w:val="center"/>
-            </w:pPr>
-            <w:r>
-              <w:t xml:space="preserve">0.129</w:t>
+              <w:t xml:space="preserve">0.3357</w:t>
+            </w:r>
+          </w:p>
+        </w:tc>
+        <w:tc>
+          <w:tcPr/>
+          <w:p>
+            <w:pPr>
+              <w:pStyle w:val="Compact"/>
+              <w:jc w:val="center"/>
+            </w:pPr>
+            <w:r>
+              <w:t xml:space="preserve">0.09613</w:t>
             </w:r>
           </w:p>
         </w:tc>
@@ -2210,7 +2270,7 @@
               <w:jc w:val="center"/>
             </w:pPr>
             <w:r>
-              <w:t xml:space="preserve">9</w:t>
+              <w:t xml:space="preserve">7</w:t>
             </w:r>
           </w:p>
         </w:tc>
@@ -2234,19 +2294,19 @@
               <w:jc w:val="center"/>
             </w:pPr>
             <w:r>
-              <w:t xml:space="preserve">0.3226</w:t>
-            </w:r>
-          </w:p>
-        </w:tc>
-        <w:tc>
-          <w:tcPr/>
-          <w:p>
-            <w:pPr>
-              <w:pStyle w:val="Compact"/>
-              <w:jc w:val="center"/>
-            </w:pPr>
-            <w:r>
-              <w:t xml:space="preserve">0.1672</w:t>
+              <w:t xml:space="preserve">0.4713</w:t>
+            </w:r>
+          </w:p>
+        </w:tc>
+        <w:tc>
+          <w:tcPr/>
+          <w:p>
+            <w:pPr>
+              <w:pStyle w:val="Compact"/>
+              <w:jc w:val="center"/>
+            </w:pPr>
+            <w:r>
+              <w:t xml:space="preserve">0.1801</w:t>
             </w:r>
           </w:p>
         </w:tc>
@@ -2260,43 +2320,43 @@
               <w:jc w:val="center"/>
             </w:pPr>
             <w:r>
-              <w:t xml:space="preserve">10</w:t>
-            </w:r>
-          </w:p>
-        </w:tc>
-        <w:tc>
-          <w:tcPr/>
-          <w:p>
-            <w:pPr>
-              <w:pStyle w:val="Compact"/>
-              <w:jc w:val="center"/>
-            </w:pPr>
-            <w:r>
-              <w:t xml:space="preserve">Activin 50ng/ml 14days (n=5)</w:t>
-            </w:r>
-          </w:p>
-        </w:tc>
-        <w:tc>
-          <w:tcPr/>
-          <w:p>
-            <w:pPr>
-              <w:pStyle w:val="Compact"/>
-              <w:jc w:val="center"/>
-            </w:pPr>
-            <w:r>
-              <w:t xml:space="preserve">0.08703</w:t>
-            </w:r>
-          </w:p>
-        </w:tc>
-        <w:tc>
-          <w:tcPr/>
-          <w:p>
-            <w:pPr>
-              <w:pStyle w:val="Compact"/>
-              <w:jc w:val="center"/>
-            </w:pPr>
-            <w:r>
-              <w:t xml:space="preserve">0.02915</w:t>
+              <w:t xml:space="preserve">7</w:t>
+            </w:r>
+          </w:p>
+        </w:tc>
+        <w:tc>
+          <w:tcPr/>
+          <w:p>
+            <w:pPr>
+              <w:pStyle w:val="Compact"/>
+              <w:jc w:val="center"/>
+            </w:pPr>
+            <w:r>
+              <w:t xml:space="preserve">Control 7days (n=1)</w:t>
+            </w:r>
+          </w:p>
+        </w:tc>
+        <w:tc>
+          <w:tcPr/>
+          <w:p>
+            <w:pPr>
+              <w:pStyle w:val="Compact"/>
+              <w:jc w:val="center"/>
+            </w:pPr>
+            <w:r>
+              <w:t xml:space="preserve">0.5293</w:t>
+            </w:r>
+          </w:p>
+        </w:tc>
+        <w:tc>
+          <w:tcPr/>
+          <w:p>
+            <w:pPr>
+              <w:pStyle w:val="Compact"/>
+              <w:jc w:val="center"/>
+            </w:pPr>
+            <w:r>
+              <w:t xml:space="preserve">0</w:t>
             </w:r>
           </w:p>
         </w:tc>
@@ -2310,43 +2370,43 @@
               <w:jc w:val="center"/>
             </w:pPr>
             <w:r>
-              <w:t xml:space="preserve">10</w:t>
-            </w:r>
-          </w:p>
-        </w:tc>
-        <w:tc>
-          <w:tcPr/>
-          <w:p>
-            <w:pPr>
-              <w:pStyle w:val="Compact"/>
-              <w:jc w:val="center"/>
-            </w:pPr>
-            <w:r>
-              <w:t xml:space="preserve">Activin 50ng/ml 2days (n=5)</w:t>
-            </w:r>
-          </w:p>
-        </w:tc>
-        <w:tc>
-          <w:tcPr/>
-          <w:p>
-            <w:pPr>
-              <w:pStyle w:val="Compact"/>
-              <w:jc w:val="center"/>
-            </w:pPr>
-            <w:r>
-              <w:t xml:space="preserve">0.2306</w:t>
-            </w:r>
-          </w:p>
-        </w:tc>
-        <w:tc>
-          <w:tcPr/>
-          <w:p>
-            <w:pPr>
-              <w:pStyle w:val="Compact"/>
-              <w:jc w:val="center"/>
-            </w:pPr>
-            <w:r>
-              <w:t xml:space="preserve">0.1209</w:t>
+              <w:t xml:space="preserve">8</w:t>
+            </w:r>
+          </w:p>
+        </w:tc>
+        <w:tc>
+          <w:tcPr/>
+          <w:p>
+            <w:pPr>
+              <w:pStyle w:val="Compact"/>
+              <w:jc w:val="center"/>
+            </w:pPr>
+            <w:r>
+              <w:t xml:space="preserve">Activin 50ng/ml 14days (n=5)</w:t>
+            </w:r>
+          </w:p>
+        </w:tc>
+        <w:tc>
+          <w:tcPr/>
+          <w:p>
+            <w:pPr>
+              <w:pStyle w:val="Compact"/>
+              <w:jc w:val="center"/>
+            </w:pPr>
+            <w:r>
+              <w:t xml:space="preserve">0.2915</w:t>
+            </w:r>
+          </w:p>
+        </w:tc>
+        <w:tc>
+          <w:tcPr/>
+          <w:p>
+            <w:pPr>
+              <w:pStyle w:val="Compact"/>
+              <w:jc w:val="center"/>
+            </w:pPr>
+            <w:r>
+              <w:t xml:space="preserve">0.1502</w:t>
             </w:r>
           </w:p>
         </w:tc>
@@ -2360,6 +2420,356 @@
               <w:jc w:val="center"/>
             </w:pPr>
             <w:r>
+              <w:t xml:space="preserve">8</w:t>
+            </w:r>
+          </w:p>
+        </w:tc>
+        <w:tc>
+          <w:tcPr/>
+          <w:p>
+            <w:pPr>
+              <w:pStyle w:val="Compact"/>
+              <w:jc w:val="center"/>
+            </w:pPr>
+            <w:r>
+              <w:t xml:space="preserve">Activin 50ng/ml 2days (n=5)</w:t>
+            </w:r>
+          </w:p>
+        </w:tc>
+        <w:tc>
+          <w:tcPr/>
+          <w:p>
+            <w:pPr>
+              <w:pStyle w:val="Compact"/>
+              <w:jc w:val="center"/>
+            </w:pPr>
+            <w:r>
+              <w:t xml:space="preserve">0.2828</w:t>
+            </w:r>
+          </w:p>
+        </w:tc>
+        <w:tc>
+          <w:tcPr/>
+          <w:p>
+            <w:pPr>
+              <w:pStyle w:val="Compact"/>
+              <w:jc w:val="center"/>
+            </w:pPr>
+            <w:r>
+              <w:t xml:space="preserve">0.08893</w:t>
+            </w:r>
+          </w:p>
+        </w:tc>
+      </w:tr>
+      <w:tr>
+        <w:tc>
+          <w:tcPr/>
+          <w:p>
+            <w:pPr>
+              <w:pStyle w:val="Compact"/>
+              <w:jc w:val="center"/>
+            </w:pPr>
+            <w:r>
+              <w:t xml:space="preserve">8</w:t>
+            </w:r>
+          </w:p>
+        </w:tc>
+        <w:tc>
+          <w:tcPr/>
+          <w:p>
+            <w:pPr>
+              <w:pStyle w:val="Compact"/>
+              <w:jc w:val="center"/>
+            </w:pPr>
+            <w:r>
+              <w:t xml:space="preserve">Control 14days (n=5)</w:t>
+            </w:r>
+          </w:p>
+        </w:tc>
+        <w:tc>
+          <w:tcPr/>
+          <w:p>
+            <w:pPr>
+              <w:pStyle w:val="Compact"/>
+              <w:jc w:val="center"/>
+            </w:pPr>
+            <w:r>
+              <w:t xml:space="preserve">0.3819</w:t>
+            </w:r>
+          </w:p>
+        </w:tc>
+        <w:tc>
+          <w:tcPr/>
+          <w:p>
+            <w:pPr>
+              <w:pStyle w:val="Compact"/>
+              <w:jc w:val="center"/>
+            </w:pPr>
+            <w:r>
+              <w:t xml:space="preserve">0.1656</w:t>
+            </w:r>
+          </w:p>
+        </w:tc>
+      </w:tr>
+      <w:tr>
+        <w:tc>
+          <w:tcPr/>
+          <w:p>
+            <w:pPr>
+              <w:pStyle w:val="Compact"/>
+              <w:jc w:val="center"/>
+            </w:pPr>
+            <w:r>
+              <w:t xml:space="preserve">8</w:t>
+            </w:r>
+          </w:p>
+        </w:tc>
+        <w:tc>
+          <w:tcPr/>
+          <w:p>
+            <w:pPr>
+              <w:pStyle w:val="Compact"/>
+              <w:jc w:val="center"/>
+            </w:pPr>
+            <w:r>
+              <w:t xml:space="preserve">Control 7days (n=1)</w:t>
+            </w:r>
+          </w:p>
+        </w:tc>
+        <w:tc>
+          <w:tcPr/>
+          <w:p>
+            <w:pPr>
+              <w:pStyle w:val="Compact"/>
+              <w:jc w:val="center"/>
+            </w:pPr>
+            <w:r>
+              <w:t xml:space="preserve">0.3948</w:t>
+            </w:r>
+          </w:p>
+        </w:tc>
+        <w:tc>
+          <w:tcPr/>
+          <w:p>
+            <w:pPr>
+              <w:pStyle w:val="Compact"/>
+              <w:jc w:val="center"/>
+            </w:pPr>
+            <w:r>
+              <w:t xml:space="preserve">0</w:t>
+            </w:r>
+          </w:p>
+        </w:tc>
+      </w:tr>
+      <w:tr>
+        <w:tc>
+          <w:tcPr/>
+          <w:p>
+            <w:pPr>
+              <w:pStyle w:val="Compact"/>
+              <w:jc w:val="center"/>
+            </w:pPr>
+            <w:r>
+              <w:t xml:space="preserve">9</w:t>
+            </w:r>
+          </w:p>
+        </w:tc>
+        <w:tc>
+          <w:tcPr/>
+          <w:p>
+            <w:pPr>
+              <w:pStyle w:val="Compact"/>
+              <w:jc w:val="center"/>
+            </w:pPr>
+            <w:r>
+              <w:t xml:space="preserve">Activin 50ng/ml 14days (n=5)</w:t>
+            </w:r>
+          </w:p>
+        </w:tc>
+        <w:tc>
+          <w:tcPr/>
+          <w:p>
+            <w:pPr>
+              <w:pStyle w:val="Compact"/>
+              <w:jc w:val="center"/>
+            </w:pPr>
+            <w:r>
+              <w:t xml:space="preserve">0.2011</w:t>
+            </w:r>
+          </w:p>
+        </w:tc>
+        <w:tc>
+          <w:tcPr/>
+          <w:p>
+            <w:pPr>
+              <w:pStyle w:val="Compact"/>
+              <w:jc w:val="center"/>
+            </w:pPr>
+            <w:r>
+              <w:t xml:space="preserve">0.1121</w:t>
+            </w:r>
+          </w:p>
+        </w:tc>
+      </w:tr>
+      <w:tr>
+        <w:tc>
+          <w:tcPr/>
+          <w:p>
+            <w:pPr>
+              <w:pStyle w:val="Compact"/>
+              <w:jc w:val="center"/>
+            </w:pPr>
+            <w:r>
+              <w:t xml:space="preserve">9</w:t>
+            </w:r>
+          </w:p>
+        </w:tc>
+        <w:tc>
+          <w:tcPr/>
+          <w:p>
+            <w:pPr>
+              <w:pStyle w:val="Compact"/>
+              <w:jc w:val="center"/>
+            </w:pPr>
+            <w:r>
+              <w:t xml:space="preserve">Activin 50ng/ml 2days (n=5)</w:t>
+            </w:r>
+          </w:p>
+        </w:tc>
+        <w:tc>
+          <w:tcPr/>
+          <w:p>
+            <w:pPr>
+              <w:pStyle w:val="Compact"/>
+              <w:jc w:val="center"/>
+            </w:pPr>
+            <w:r>
+              <w:t xml:space="preserve">0.2273</w:t>
+            </w:r>
+          </w:p>
+        </w:tc>
+        <w:tc>
+          <w:tcPr/>
+          <w:p>
+            <w:pPr>
+              <w:pStyle w:val="Compact"/>
+              <w:jc w:val="center"/>
+            </w:pPr>
+            <w:r>
+              <w:t xml:space="preserve">0.129</w:t>
+            </w:r>
+          </w:p>
+        </w:tc>
+      </w:tr>
+      <w:tr>
+        <w:tc>
+          <w:tcPr/>
+          <w:p>
+            <w:pPr>
+              <w:pStyle w:val="Compact"/>
+              <w:jc w:val="center"/>
+            </w:pPr>
+            <w:r>
+              <w:t xml:space="preserve">9</w:t>
+            </w:r>
+          </w:p>
+        </w:tc>
+        <w:tc>
+          <w:tcPr/>
+          <w:p>
+            <w:pPr>
+              <w:pStyle w:val="Compact"/>
+              <w:jc w:val="center"/>
+            </w:pPr>
+            <w:r>
+              <w:t xml:space="preserve">Control 14days (n=5)</w:t>
+            </w:r>
+          </w:p>
+        </w:tc>
+        <w:tc>
+          <w:tcPr/>
+          <w:p>
+            <w:pPr>
+              <w:pStyle w:val="Compact"/>
+              <w:jc w:val="center"/>
+            </w:pPr>
+            <w:r>
+              <w:t xml:space="preserve">0.3226</w:t>
+            </w:r>
+          </w:p>
+        </w:tc>
+        <w:tc>
+          <w:tcPr/>
+          <w:p>
+            <w:pPr>
+              <w:pStyle w:val="Compact"/>
+              <w:jc w:val="center"/>
+            </w:pPr>
+            <w:r>
+              <w:t xml:space="preserve">0.1672</w:t>
+            </w:r>
+          </w:p>
+        </w:tc>
+      </w:tr>
+      <w:tr>
+        <w:tc>
+          <w:tcPr/>
+          <w:p>
+            <w:pPr>
+              <w:pStyle w:val="Compact"/>
+              <w:jc w:val="center"/>
+            </w:pPr>
+            <w:r>
+              <w:t xml:space="preserve">9</w:t>
+            </w:r>
+          </w:p>
+        </w:tc>
+        <w:tc>
+          <w:tcPr/>
+          <w:p>
+            <w:pPr>
+              <w:pStyle w:val="Compact"/>
+              <w:jc w:val="center"/>
+            </w:pPr>
+            <w:r>
+              <w:t xml:space="preserve">Control 7days (n=1)</w:t>
+            </w:r>
+          </w:p>
+        </w:tc>
+        <w:tc>
+          <w:tcPr/>
+          <w:p>
+            <w:pPr>
+              <w:pStyle w:val="Compact"/>
+              <w:jc w:val="center"/>
+            </w:pPr>
+            <w:r>
+              <w:t xml:space="preserve">0.1613</w:t>
+            </w:r>
+          </w:p>
+        </w:tc>
+        <w:tc>
+          <w:tcPr/>
+          <w:p>
+            <w:pPr>
+              <w:pStyle w:val="Compact"/>
+              <w:jc w:val="center"/>
+            </w:pPr>
+            <w:r>
+              <w:t xml:space="preserve">0</w:t>
+            </w:r>
+          </w:p>
+        </w:tc>
+      </w:tr>
+      <w:tr>
+        <w:tc>
+          <w:tcPr/>
+          <w:p>
+            <w:pPr>
+              <w:pStyle w:val="Compact"/>
+              <w:jc w:val="center"/>
+            </w:pPr>
+            <w:r>
               <w:t xml:space="preserve">10</w:t>
             </w:r>
           </w:p>
@@ -2372,6 +2782,106 @@
               <w:jc w:val="center"/>
             </w:pPr>
             <w:r>
+              <w:t xml:space="preserve">Activin 50ng/ml 14days (n=5)</w:t>
+            </w:r>
+          </w:p>
+        </w:tc>
+        <w:tc>
+          <w:tcPr/>
+          <w:p>
+            <w:pPr>
+              <w:pStyle w:val="Compact"/>
+              <w:jc w:val="center"/>
+            </w:pPr>
+            <w:r>
+              <w:t xml:space="preserve">0.08703</w:t>
+            </w:r>
+          </w:p>
+        </w:tc>
+        <w:tc>
+          <w:tcPr/>
+          <w:p>
+            <w:pPr>
+              <w:pStyle w:val="Compact"/>
+              <w:jc w:val="center"/>
+            </w:pPr>
+            <w:r>
+              <w:t xml:space="preserve">0.02915</w:t>
+            </w:r>
+          </w:p>
+        </w:tc>
+      </w:tr>
+      <w:tr>
+        <w:tc>
+          <w:tcPr/>
+          <w:p>
+            <w:pPr>
+              <w:pStyle w:val="Compact"/>
+              <w:jc w:val="center"/>
+            </w:pPr>
+            <w:r>
+              <w:t xml:space="preserve">10</w:t>
+            </w:r>
+          </w:p>
+        </w:tc>
+        <w:tc>
+          <w:tcPr/>
+          <w:p>
+            <w:pPr>
+              <w:pStyle w:val="Compact"/>
+              <w:jc w:val="center"/>
+            </w:pPr>
+            <w:r>
+              <w:t xml:space="preserve">Activin 50ng/ml 2days (n=5)</w:t>
+            </w:r>
+          </w:p>
+        </w:tc>
+        <w:tc>
+          <w:tcPr/>
+          <w:p>
+            <w:pPr>
+              <w:pStyle w:val="Compact"/>
+              <w:jc w:val="center"/>
+            </w:pPr>
+            <w:r>
+              <w:t xml:space="preserve">0.2306</w:t>
+            </w:r>
+          </w:p>
+        </w:tc>
+        <w:tc>
+          <w:tcPr/>
+          <w:p>
+            <w:pPr>
+              <w:pStyle w:val="Compact"/>
+              <w:jc w:val="center"/>
+            </w:pPr>
+            <w:r>
+              <w:t xml:space="preserve">0.1209</w:t>
+            </w:r>
+          </w:p>
+        </w:tc>
+      </w:tr>
+      <w:tr>
+        <w:tc>
+          <w:tcPr/>
+          <w:p>
+            <w:pPr>
+              <w:pStyle w:val="Compact"/>
+              <w:jc w:val="center"/>
+            </w:pPr>
+            <w:r>
+              <w:t xml:space="preserve">10</w:t>
+            </w:r>
+          </w:p>
+        </w:tc>
+        <w:tc>
+          <w:tcPr/>
+          <w:p>
+            <w:pPr>
+              <w:pStyle w:val="Compact"/>
+              <w:jc w:val="center"/>
+            </w:pPr>
+            <w:r>
               <w:t xml:space="preserve">Control 14days (n=5)</w:t>
             </w:r>
           </w:p>
@@ -2397,14 +2907,64 @@
             </w:pPr>
             <w:r>
               <w:t xml:space="preserve">0.08223</w:t>
+            </w:r>
+          </w:p>
+        </w:tc>
+      </w:tr>
+      <w:tr>
+        <w:tc>
+          <w:tcPr/>
+          <w:p>
+            <w:pPr>
+              <w:pStyle w:val="Compact"/>
+              <w:jc w:val="center"/>
+            </w:pPr>
+            <w:r>
+              <w:t xml:space="preserve">10</w:t>
+            </w:r>
+          </w:p>
+        </w:tc>
+        <w:tc>
+          <w:tcPr/>
+          <w:p>
+            <w:pPr>
+              <w:pStyle w:val="Compact"/>
+              <w:jc w:val="center"/>
+            </w:pPr>
+            <w:r>
+              <w:t xml:space="preserve">Control 7days (n=1)</w:t>
+            </w:r>
+          </w:p>
+        </w:tc>
+        <w:tc>
+          <w:tcPr/>
+          <w:p>
+            <w:pPr>
+              <w:pStyle w:val="Compact"/>
+              <w:jc w:val="center"/>
+            </w:pPr>
+            <w:r>
+              <w:t xml:space="preserve">0.181</w:t>
+            </w:r>
+          </w:p>
+        </w:tc>
+        <w:tc>
+          <w:tcPr/>
+          <w:p>
+            <w:pPr>
+              <w:pStyle w:val="Compact"/>
+              <w:jc w:val="center"/>
+            </w:pPr>
+            <w:r>
+              <w:t xml:space="preserve">0</w:t>
             </w:r>
           </w:p>
         </w:tc>
       </w:tr>
     </w:tbl>
-    <w:bookmarkEnd w:id="51"/>
-    <w:bookmarkEnd w:id="52"/>
-    <w:bookmarkStart w:id="56" w:name="references"/>
+    <w:bookmarkEnd w:id="54"/>
+    <w:bookmarkEnd w:id="55"/>
+    <w:bookmarkStart w:id="59" w:name="references"/>
     <w:p>
       <w:pPr>
         <w:pStyle w:val="berschrift2"/>
@@ -2413,8 +2973,8 @@
         <w:t xml:space="preserve">References</w:t>
       </w:r>
     </w:p>
-    <w:bookmarkStart w:id="55" w:name="refs"/>
-    <w:bookmarkStart w:id="54" w:name="X4175f2d6a880cff244f25bc9442830b9798b728"/>
+    <w:bookmarkStart w:id="58" w:name="refs"/>
+    <w:bookmarkStart w:id="57" w:name="X4175f2d6a880cff244f25bc9442830b9798b728"/>
     <w:p>
       <w:pPr>
         <w:pStyle w:val="Literaturverzeichnis"/>
@@ -2434,7 +2994,7 @@
       <w:r>
         <w:t xml:space="preserve"> </w:t>
       </w:r>
-      <w:hyperlink r:id="rId53">
+      <w:hyperlink r:id="rId56">
         <w:r>
           <w:rPr>
             <w:rStyle w:val="Hyperlink"/>
@@ -2446,10 +3006,10 @@
         <w:t xml:space="preserve">.</w:t>
       </w:r>
     </w:p>
-    <w:bookmarkEnd w:id="54"/>
-    <w:bookmarkEnd w:id="55"/>
-    <w:bookmarkEnd w:id="56"/>
-    <w:bookmarkStart w:id="57" w:name="methods-section-to-copy"/>
+    <w:bookmarkEnd w:id="57"/>
+    <w:bookmarkEnd w:id="58"/>
+    <w:bookmarkEnd w:id="59"/>
+    <w:bookmarkStart w:id="60" w:name="methods-section-to-copy"/>
     <w:p>
       <w:pPr>
         <w:pStyle w:val="berschrift2"/>
@@ -2466,7 +3026,7 @@
         <w:t xml:space="preserve">TBA</w:t>
       </w:r>
     </w:p>
-    <w:bookmarkEnd w:id="57"/>
+    <w:bookmarkEnd w:id="60"/>
     <w:sectPr>
       <w:pgSz w:h="15840" w:w="12240"/>
       <w:pgMar w:bottom="1134" w:footer="720" w:gutter="0" w:header="720" w:left="1417" w:right="1417" w:top="1417"/>

</xml_diff>

<commit_message>
Fixed problem with bibliography generation
</commit_message>
<xml_diff>
--- a/Results/Mitosections/results_report_mitochondria_alcohol_mitosections.docx
+++ b/Results/Mitosections/results_report_mitochondria_alcohol_mitosections.docx
@@ -71,7 +71,7 @@
         <w:pStyle w:val="Datum"/>
       </w:pPr>
       <w:r>
-        <w:t xml:space="preserve">2023-04-12</w:t>
+        <w:t xml:space="preserve">2023-04-16</w:t>
       </w:r>
     </w:p>
     <w:bookmarkStart w:id="28" w:name="introduction"/>
@@ -86,14 +86,6 @@
     <w:p>
       <w:pPr>
         <w:pStyle w:val="FirstParagraph"/>
-      </w:pPr>
-      <w:r>
-        <w:t xml:space="preserve">[1]</w:t>
-      </w:r>
-    </w:p>
-    <w:p>
-      <w:pPr>
-        <w:pStyle w:val="Textkrper"/>
       </w:pPr>
       <w:r>
         <w:t xml:space="preserve">We analyzed the distribution of mitochondria in the soma of neurons. We used dissociated neuronal cultures that were treated under different conditions prior to fixation, staining and imaging (</w:t>
@@ -2989,7 +2981,40 @@
         <w:t xml:space="preserve">	</w:t>
       </w:r>
       <w:r>
-        <w:t xml:space="preserve">Cangkrama M, Liu H, Whipman J, Zubair M, Matsushita M, Di Filippo M, et al. A Protumorigenic mDia2-MIRO1 Axis Controls Mitochondrial Positioning and Function in Cancer-Associated Fibroblasts. Cancer Res 2022;82:3701–17.</w:t>
+        <w:t xml:space="preserve">Cangkrama M, Liu H, Whipman J, Zubair M, Matsushita M, Di Filippo M, et al. A</w:t>
+      </w:r>
+      <w:r>
+        <w:t xml:space="preserve"> </w:t>
+      </w:r>
+      <w:r>
+        <w:t xml:space="preserve">Protumorigenic mDia2-MIRO1 Axis Controls Mitochondrial Positioning</w:t>
+      </w:r>
+      <w:r>
+        <w:t xml:space="preserve"> </w:t>
+      </w:r>
+      <w:r>
+        <w:t xml:space="preserve">and</w:t>
+      </w:r>
+      <w:r>
+        <w:t xml:space="preserve"> </w:t>
+      </w:r>
+      <w:r>
+        <w:t xml:space="preserve">Function</w:t>
+      </w:r>
+      <w:r>
+        <w:t xml:space="preserve"> </w:t>
+      </w:r>
+      <w:r>
+        <w:t xml:space="preserve">in</w:t>
+      </w:r>
+      <w:r>
+        <w:t xml:space="preserve"> </w:t>
+      </w:r>
+      <w:r>
+        <w:t xml:space="preserve">Cancer-Associated Fibroblasts</w:t>
+      </w:r>
+      <w:r>
+        <w:t xml:space="preserve">. Cancer Res 2022;82:3701–17.</w:t>
       </w:r>
       <w:r>
         <w:t xml:space="preserve"> </w:t>

</xml_diff>

<commit_message>
Corrected typos Worked on statistical analysis: Anova between treatment conditions in each of the 10 sections, different plots
</commit_message>
<xml_diff>
--- a/Results/Mitosections/results_report_mitochondria_alcohol_mitosections.docx
+++ b/Results/Mitosections/results_report_mitochondria_alcohol_mitosections.docx
@@ -436,7 +436,7 @@
         <w:pStyle w:val="FirstParagraph"/>
       </w:pPr>
       <w:r>
-        <w:t xml:space="preserve">The original paper with this method</w:t>
+        <w:t xml:space="preserve">In the original paper with this method</w:t>
       </w:r>
       <w:r>
         <w:t xml:space="preserve"> </w:t>
@@ -445,7 +445,7 @@
         <w:t xml:space="preserve">[1]</w:t>
       </w:r>
       <w:r>
-        <w:t xml:space="preserve">, the authors normalized fluorescence intensities on the maximum intensity pixel of the given image. In my option, this is not the best solution, as there may be differences in the absolute fluorescence emission that stem from controllable sources (different fluorescence excitation intensity, different reaction times during staining) or uncontrollable sources (fluorophores not as efficient anymore due to light exposure during previous sample preparation, maybe even different fluorophore binding efficiency in different treatment conditions, imaging artefacts with unspecifically bound or unwashed fluorophores). I therefore normalized the fluorescence intensity values to the average of the 3 highest values of each cell’s profiles - which is a method not vulnerable to the described error sources.</w:t>
+        <w:t xml:space="preserve">, the authors normalized fluorescence intensities on the maximum intensity pixel of the given image. In my opinion, this is not the best solution, as there may be differences in the absolute fluorescence emission that stem from controllable sources (different fluorescence excitation intensity, different reaction times during staining) or uncontrollable sources (fluorophores not as efficient anymore due to light exposure during previous sample preparation, maybe even different fluorophore binding efficiency in different treatment conditions, imaging artefacts with unspecifically bound or unwashed fluorophores). I therefore normalized the fluorescence intensity values to the average of the 3 highest values of each cell’s profiles - which is a method not as vulnerable to the described error sources.</w:t>
       </w:r>
     </w:p>
     <w:p>
@@ -462,7 +462,7 @@
         <w:t xml:space="preserve">[1]</w:t>
       </w:r>
       <w:r>
-        <w:t xml:space="preserve">, one line was drawn per cell at the position of maximum soma extension from the nucleus. In neurons the overall somatic area outside of the nucleus is much less than in Cangkrama et al.’s cell type and neurons differ in shape from an even, round shape. We thus drew three different sections through the some. The first in the direction of maximum soma extension (just as the original paper), the other two about 45 degrees clockwise and 45 degrees counterclockwise to the first line.</w:t>
+        <w:t xml:space="preserve">, one line was drawn per cell at the position of maximum soma extension from the nucleus. In neurons the overall somatic area outside of the nucleus is much less than in Cangkrama et al.’s cell type and neurons differ in shape from an even, round shape. We thus drew three different sections through the soma. The first in the direction of maximum soma extension (just as the original paper), the other two about 45 degrees clockwise and 45 degrees counterclockwise to the first line.</w:t>
       </w:r>
     </w:p>
     <w:p>
@@ -470,7 +470,7 @@
         <w:pStyle w:val="Textkrper"/>
       </w:pPr>
       <w:r>
-        <w:t xml:space="preserve">For comparability with the previous study, I plotted here the results, using the first (maximum length) somatic profile only.</w:t>
+        <w:t xml:space="preserve">For comparability with the previous study, I plotted here the results, using the first (maximum length) somatic profiles only.</w:t>
       </w:r>
     </w:p>
     <w:p>
@@ -647,7 +647,7 @@
       </w:r>
     </w:p>
     <w:bookmarkEnd w:id="40"/>
-    <w:bookmarkStart w:id="55" w:name="statistical-comparison"/>
+    <w:bookmarkStart w:id="58" w:name="statistical-comparison"/>
     <w:p>
       <w:pPr>
         <w:pStyle w:val="berschrift2"/>
@@ -782,7 +782,7 @@
       </w:r>
     </w:p>
     <w:bookmarkEnd w:id="47"/>
-    <w:bookmarkStart w:id="54" w:name="idea2"/>
+    <w:bookmarkStart w:id="57" w:name="idea2"/>
     <w:p>
       <w:pPr>
         <w:pStyle w:val="berschrift3"/>
@@ -887,6 +887,51 @@
           </wp:inline>
         </w:drawing>
       </w:r>
+      <w:r>
+        <w:t xml:space="preserve"> </w:t>
+      </w:r>
+      <w:r>
+        <w:drawing>
+          <wp:inline>
+            <wp:extent cx="5969000" cy="8953500"/>
+            <wp:effectExtent b="0" l="0" r="0" t="0"/>
+            <wp:docPr descr="Statistical comparison of different conditions for each section" title="" id="55" name="Picture"/>
+            <a:graphic>
+              <a:graphicData uri="http://schemas.openxmlformats.org/drawingml/2006/picture">
+                <pic:pic>
+                  <pic:nvPicPr>
+                    <pic:cNvPr descr="results_report_mitochondria_alcohol_mitosections_files/figure-docx/separate_section_plots_stats-1.png" id="56" name="Picture"/>
+                    <pic:cNvPicPr>
+                      <a:picLocks noChangeArrowheads="1" noChangeAspect="1"/>
+                    </pic:cNvPicPr>
+                  </pic:nvPicPr>
+                  <pic:blipFill>
+                    <a:blip r:embed="rId54"/>
+                    <a:stretch>
+                      <a:fillRect/>
+                    </a:stretch>
+                  </pic:blipFill>
+                  <pic:spPr bwMode="auto">
+                    <a:xfrm>
+                      <a:off x="0" y="0"/>
+                      <a:ext cx="5969000" cy="8953500"/>
+                    </a:xfrm>
+                    <a:prstGeom prst="rect">
+                      <a:avLst/>
+                    </a:prstGeom>
+                    <a:noFill/>
+                    <a:ln w="9525">
+                      <a:noFill/>
+                      <a:headEnd/>
+                      <a:tailEnd/>
+                    </a:ln>
+                  </pic:spPr>
+                </pic:pic>
+              </a:graphicData>
+            </a:graphic>
+          </wp:inline>
+        </w:drawing>
+      </w:r>
     </w:p>
     <w:tbl>
       <w:tblPr>
@@ -2954,9 +2999,9 @@
         </w:tc>
       </w:tr>
     </w:tbl>
-    <w:bookmarkEnd w:id="54"/>
-    <w:bookmarkEnd w:id="55"/>
-    <w:bookmarkStart w:id="59" w:name="references"/>
+    <w:bookmarkEnd w:id="57"/>
+    <w:bookmarkEnd w:id="58"/>
+    <w:bookmarkStart w:id="62" w:name="references"/>
     <w:p>
       <w:pPr>
         <w:pStyle w:val="berschrift2"/>
@@ -2965,8 +3010,8 @@
         <w:t xml:space="preserve">References</w:t>
       </w:r>
     </w:p>
-    <w:bookmarkStart w:id="58" w:name="refs"/>
-    <w:bookmarkStart w:id="57" w:name="X4175f2d6a880cff244f25bc9442830b9798b728"/>
+    <w:bookmarkStart w:id="61" w:name="refs"/>
+    <w:bookmarkStart w:id="60" w:name="X4175f2d6a880cff244f25bc9442830b9798b728"/>
     <w:p>
       <w:pPr>
         <w:pStyle w:val="Literaturverzeichnis"/>
@@ -3019,7 +3064,7 @@
       <w:r>
         <w:t xml:space="preserve"> </w:t>
       </w:r>
-      <w:hyperlink r:id="rId56">
+      <w:hyperlink r:id="rId59">
         <w:r>
           <w:rPr>
             <w:rStyle w:val="Hyperlink"/>
@@ -3031,10 +3076,10 @@
         <w:t xml:space="preserve">.</w:t>
       </w:r>
     </w:p>
-    <w:bookmarkEnd w:id="57"/>
-    <w:bookmarkEnd w:id="58"/>
-    <w:bookmarkEnd w:id="59"/>
-    <w:bookmarkStart w:id="60" w:name="methods-section-to-copy"/>
+    <w:bookmarkEnd w:id="60"/>
+    <w:bookmarkEnd w:id="61"/>
+    <w:bookmarkEnd w:id="62"/>
+    <w:bookmarkStart w:id="63" w:name="methods-section-to-copy"/>
     <w:p>
       <w:pPr>
         <w:pStyle w:val="berschrift2"/>
@@ -3051,7 +3096,7 @@
         <w:t xml:space="preserve">TBA</w:t>
       </w:r>
     </w:p>
-    <w:bookmarkEnd w:id="60"/>
+    <w:bookmarkEnd w:id="63"/>
     <w:sectPr>
       <w:pgSz w:h="15840" w:w="12240"/>
       <w:pgMar w:bottom="1134" w:footer="720" w:gutter="0" w:header="720" w:left="1417" w:right="1417" w:top="1417"/>

</xml_diff>

<commit_message>
Created status report, analyzed more images
</commit_message>
<xml_diff>
--- a/Results/Mitosections/results_report_mitochondria_alcohol_mitosections.docx
+++ b/Results/Mitosections/results_report_mitochondria_alcohol_mitosections.docx
@@ -71,7 +71,7 @@
         <w:pStyle w:val="Datum"/>
       </w:pPr>
       <w:r>
-        <w:t xml:space="preserve">2023-04-16</w:t>
+        <w:t xml:space="preserve">2023-04-18</w:t>
       </w:r>
     </w:p>
     <w:bookmarkStart w:id="28" w:name="introduction"/>
@@ -126,7 +126,7 @@
       <w:r>
         <w:drawing>
           <wp:inline>
-            <wp:extent cx="5969000" cy="3581400"/>
+            <wp:extent cx="5969000" cy="5969000"/>
             <wp:effectExtent b="0" l="0" r="0" t="0"/>
             <wp:docPr descr="Thumbnails of all analyzed images" title="" id="22" name="Picture"/>
             <a:graphic>
@@ -147,7 +147,7 @@
                   <pic:spPr bwMode="auto">
                     <a:xfrm>
                       <a:off x="0" y="0"/>
-                      <a:ext cx="5969000" cy="3581400"/>
+                      <a:ext cx="5969000" cy="5969000"/>
                     </a:xfrm>
                     <a:prstGeom prst="rect">
                       <a:avLst/>
@@ -256,18 +256,18 @@
         <w:pStyle w:val="FirstParagraph"/>
       </w:pPr>
       <w:r>
-        <w:t xml:space="preserve">The number of analyzed images is currently 16 and is divided into different experimental conditions as follows:</w:t>
+        <w:t xml:space="preserve">The number of analyzed images is currently 46 and is divided into different experimental conditions as follows:</w:t>
       </w:r>
     </w:p>
     <w:tbl>
       <w:tblPr>
         <w:tblStyle w:val="Table"/>
-        <w:tblW w:type="pct" w:w="2014"/>
+        <w:tblW w:type="pct" w:w="2083"/>
         <w:tblLook w:firstRow="1" w:lastRow="0" w:firstColumn="0" w:lastColumn="0" w:noHBand="0" w:noVBand="0" w:val="0020"/>
       </w:tblPr>
       <w:tblGrid>
         <w:gridCol w:w="2750"/>
-        <w:gridCol w:w="440"/>
+        <w:gridCol w:w="550"/>
       </w:tblGrid>
       <w:tr>
         <w:trPr>
@@ -371,7 +371,7 @@
               <w:jc w:val="center"/>
             </w:pPr>
             <w:r>
-              <w:t xml:space="preserve">5</w:t>
+              <w:t xml:space="preserve">9</w:t>
             </w:r>
           </w:p>
         </w:tc>
@@ -397,7 +397,85 @@
               <w:jc w:val="center"/>
             </w:pPr>
             <w:r>
-              <w:t xml:space="preserve">1</w:t>
+              <w:t xml:space="preserve">10</w:t>
+            </w:r>
+          </w:p>
+        </w:tc>
+      </w:tr>
+      <w:tr>
+        <w:tc>
+          <w:tcPr/>
+          <w:p>
+            <w:pPr>
+              <w:pStyle w:val="Compact"/>
+              <w:jc w:val="center"/>
+            </w:pPr>
+            <w:r>
+              <w:t xml:space="preserve">Folistatin 50ng/ml 14d</w:t>
+            </w:r>
+          </w:p>
+        </w:tc>
+        <w:tc>
+          <w:tcPr/>
+          <w:p>
+            <w:pPr>
+              <w:pStyle w:val="Compact"/>
+              <w:jc w:val="center"/>
+            </w:pPr>
+            <w:r>
+              <w:t xml:space="preserve">2</w:t>
+            </w:r>
+          </w:p>
+        </w:tc>
+      </w:tr>
+      <w:tr>
+        <w:tc>
+          <w:tcPr/>
+          <w:p>
+            <w:pPr>
+              <w:pStyle w:val="Compact"/>
+              <w:jc w:val="center"/>
+            </w:pPr>
+            <w:r>
+              <w:t xml:space="preserve">Folistatin 50ng/ml 7d</w:t>
+            </w:r>
+          </w:p>
+        </w:tc>
+        <w:tc>
+          <w:tcPr/>
+          <w:p>
+            <w:pPr>
+              <w:pStyle w:val="Compact"/>
+              <w:jc w:val="center"/>
+            </w:pPr>
+            <w:r>
+              <w:t xml:space="preserve">11</w:t>
+            </w:r>
+          </w:p>
+        </w:tc>
+      </w:tr>
+      <w:tr>
+        <w:tc>
+          <w:tcPr/>
+          <w:p>
+            <w:pPr>
+              <w:pStyle w:val="Compact"/>
+              <w:jc w:val="center"/>
+            </w:pPr>
+            <w:r>
+              <w:t xml:space="preserve">SMIFH2 10µM 14d</w:t>
+            </w:r>
+          </w:p>
+        </w:tc>
+        <w:tc>
+          <w:tcPr/>
+          <w:p>
+            <w:pPr>
+              <w:pStyle w:val="Compact"/>
+              <w:jc w:val="center"/>
+            </w:pPr>
+            <w:r>
+              <w:t xml:space="preserve">4</w:t>
             </w:r>
           </w:p>
         </w:tc>
@@ -936,14 +1014,14 @@
     <w:tbl>
       <w:tblPr>
         <w:tblStyle w:val="Table"/>
-        <w:tblW w:type="pct" w:w="4236"/>
+        <w:tblW w:type="pct" w:w="4375"/>
         <w:tblLook w:firstRow="1" w:lastRow="0" w:firstColumn="0" w:lastColumn="0" w:noHBand="0" w:noVBand="0" w:val="0020"/>
       </w:tblPr>
       <w:tblGrid>
         <w:gridCol w:w="1100"/>
         <w:gridCol w:w="3410"/>
         <w:gridCol w:w="1100"/>
-        <w:gridCol w:w="1100"/>
+        <w:gridCol w:w="1320"/>
       </w:tblGrid>
       <w:tr>
         <w:trPr>
@@ -1119,31 +1197,31 @@
               <w:jc w:val="center"/>
             </w:pPr>
             <w:r>
-              <w:t xml:space="preserve">Control 14days (n=5)</w:t>
-            </w:r>
-          </w:p>
-        </w:tc>
-        <w:tc>
-          <w:tcPr/>
-          <w:p>
-            <w:pPr>
-              <w:pStyle w:val="Compact"/>
-              <w:jc w:val="center"/>
-            </w:pPr>
-            <w:r>
-              <w:t xml:space="preserve">0.5815</w:t>
-            </w:r>
-          </w:p>
-        </w:tc>
-        <w:tc>
-          <w:tcPr/>
-          <w:p>
-            <w:pPr>
-              <w:pStyle w:val="Compact"/>
-              <w:jc w:val="center"/>
-            </w:pPr>
-            <w:r>
-              <w:t xml:space="preserve">0.112</w:t>
+              <w:t xml:space="preserve">Control 14days (n=9)</w:t>
+            </w:r>
+          </w:p>
+        </w:tc>
+        <w:tc>
+          <w:tcPr/>
+          <w:p>
+            <w:pPr>
+              <w:pStyle w:val="Compact"/>
+              <w:jc w:val="center"/>
+            </w:pPr>
+            <w:r>
+              <w:t xml:space="preserve">0.6367</w:t>
+            </w:r>
+          </w:p>
+        </w:tc>
+        <w:tc>
+          <w:tcPr/>
+          <w:p>
+            <w:pPr>
+              <w:pStyle w:val="Compact"/>
+              <w:jc w:val="center"/>
+            </w:pPr>
+            <w:r>
+              <w:t xml:space="preserve">0.09831</w:t>
             </w:r>
           </w:p>
         </w:tc>
@@ -1169,31 +1247,181 @@
               <w:jc w:val="center"/>
             </w:pPr>
             <w:r>
-              <w:t xml:space="preserve">Control 7days (n=1)</w:t>
-            </w:r>
-          </w:p>
-        </w:tc>
-        <w:tc>
-          <w:tcPr/>
-          <w:p>
-            <w:pPr>
-              <w:pStyle w:val="Compact"/>
-              <w:jc w:val="center"/>
-            </w:pPr>
-            <w:r>
-              <w:t xml:space="preserve">0.6897</w:t>
-            </w:r>
-          </w:p>
-        </w:tc>
-        <w:tc>
-          <w:tcPr/>
-          <w:p>
-            <w:pPr>
-              <w:pStyle w:val="Compact"/>
-              <w:jc w:val="center"/>
-            </w:pPr>
-            <w:r>
-              <w:t xml:space="preserve">0</w:t>
+              <w:t xml:space="preserve">Control 7days (n=10)</w:t>
+            </w:r>
+          </w:p>
+        </w:tc>
+        <w:tc>
+          <w:tcPr/>
+          <w:p>
+            <w:pPr>
+              <w:pStyle w:val="Compact"/>
+              <w:jc w:val="center"/>
+            </w:pPr>
+            <w:r>
+              <w:t xml:space="preserve">0.5241</w:t>
+            </w:r>
+          </w:p>
+        </w:tc>
+        <w:tc>
+          <w:tcPr/>
+          <w:p>
+            <w:pPr>
+              <w:pStyle w:val="Compact"/>
+              <w:jc w:val="center"/>
+            </w:pPr>
+            <w:r>
+              <w:t xml:space="preserve">0.1681</w:t>
+            </w:r>
+          </w:p>
+        </w:tc>
+      </w:tr>
+      <w:tr>
+        <w:tc>
+          <w:tcPr/>
+          <w:p>
+            <w:pPr>
+              <w:pStyle w:val="Compact"/>
+              <w:jc w:val="center"/>
+            </w:pPr>
+            <w:r>
+              <w:t xml:space="preserve">1</w:t>
+            </w:r>
+          </w:p>
+        </w:tc>
+        <w:tc>
+          <w:tcPr/>
+          <w:p>
+            <w:pPr>
+              <w:pStyle w:val="Compact"/>
+              <w:jc w:val="center"/>
+            </w:pPr>
+            <w:r>
+              <w:t xml:space="preserve">Folistatin 50ng/ml 14d (n=2)</w:t>
+            </w:r>
+          </w:p>
+        </w:tc>
+        <w:tc>
+          <w:tcPr/>
+          <w:p>
+            <w:pPr>
+              <w:pStyle w:val="Compact"/>
+              <w:jc w:val="center"/>
+            </w:pPr>
+            <w:r>
+              <w:t xml:space="preserve">0.8109</w:t>
+            </w:r>
+          </w:p>
+        </w:tc>
+        <w:tc>
+          <w:tcPr/>
+          <w:p>
+            <w:pPr>
+              <w:pStyle w:val="Compact"/>
+              <w:jc w:val="center"/>
+            </w:pPr>
+            <w:r>
+              <w:t xml:space="preserve">0.06097</w:t>
+            </w:r>
+          </w:p>
+        </w:tc>
+      </w:tr>
+      <w:tr>
+        <w:tc>
+          <w:tcPr/>
+          <w:p>
+            <w:pPr>
+              <w:pStyle w:val="Compact"/>
+              <w:jc w:val="center"/>
+            </w:pPr>
+            <w:r>
+              <w:t xml:space="preserve">1</w:t>
+            </w:r>
+          </w:p>
+        </w:tc>
+        <w:tc>
+          <w:tcPr/>
+          <w:p>
+            <w:pPr>
+              <w:pStyle w:val="Compact"/>
+              <w:jc w:val="center"/>
+            </w:pPr>
+            <w:r>
+              <w:t xml:space="preserve">Folistatin 50ng/ml 7d (n=11)</w:t>
+            </w:r>
+          </w:p>
+        </w:tc>
+        <w:tc>
+          <w:tcPr/>
+          <w:p>
+            <w:pPr>
+              <w:pStyle w:val="Compact"/>
+              <w:jc w:val="center"/>
+            </w:pPr>
+            <w:r>
+              <w:t xml:space="preserve">0.603</w:t>
+            </w:r>
+          </w:p>
+        </w:tc>
+        <w:tc>
+          <w:tcPr/>
+          <w:p>
+            <w:pPr>
+              <w:pStyle w:val="Compact"/>
+              <w:jc w:val="center"/>
+            </w:pPr>
+            <w:r>
+              <w:t xml:space="preserve">0.121</w:t>
+            </w:r>
+          </w:p>
+        </w:tc>
+      </w:tr>
+      <w:tr>
+        <w:tc>
+          <w:tcPr/>
+          <w:p>
+            <w:pPr>
+              <w:pStyle w:val="Compact"/>
+              <w:jc w:val="center"/>
+            </w:pPr>
+            <w:r>
+              <w:t xml:space="preserve">1</w:t>
+            </w:r>
+          </w:p>
+        </w:tc>
+        <w:tc>
+          <w:tcPr/>
+          <w:p>
+            <w:pPr>
+              <w:pStyle w:val="Compact"/>
+              <w:jc w:val="center"/>
+            </w:pPr>
+            <w:r>
+              <w:t xml:space="preserve">SMIFH2 10µM 14d (n=4)</w:t>
+            </w:r>
+          </w:p>
+        </w:tc>
+        <w:tc>
+          <w:tcPr/>
+          <w:p>
+            <w:pPr>
+              <w:pStyle w:val="Compact"/>
+              <w:jc w:val="center"/>
+            </w:pPr>
+            <w:r>
+              <w:t xml:space="preserve">0.8216</w:t>
+            </w:r>
+          </w:p>
+        </w:tc>
+        <w:tc>
+          <w:tcPr/>
+          <w:p>
+            <w:pPr>
+              <w:pStyle w:val="Compact"/>
+              <w:jc w:val="center"/>
+            </w:pPr>
+            <w:r>
+              <w:t xml:space="preserve">0.03789</w:t>
             </w:r>
           </w:p>
         </w:tc>
@@ -1319,31 +1547,31 @@
               <w:jc w:val="center"/>
             </w:pPr>
             <w:r>
-              <w:t xml:space="preserve">Control 14days (n=5)</w:t>
-            </w:r>
-          </w:p>
-        </w:tc>
-        <w:tc>
-          <w:tcPr/>
-          <w:p>
-            <w:pPr>
-              <w:pStyle w:val="Compact"/>
-              <w:jc w:val="center"/>
-            </w:pPr>
-            <w:r>
-              <w:t xml:space="preserve">0.6363</w:t>
-            </w:r>
-          </w:p>
-        </w:tc>
-        <w:tc>
-          <w:tcPr/>
-          <w:p>
-            <w:pPr>
-              <w:pStyle w:val="Compact"/>
-              <w:jc w:val="center"/>
-            </w:pPr>
-            <w:r>
-              <w:t xml:space="preserve">0.1068</w:t>
+              <w:t xml:space="preserve">Control 14days (n=9)</w:t>
+            </w:r>
+          </w:p>
+        </w:tc>
+        <w:tc>
+          <w:tcPr/>
+          <w:p>
+            <w:pPr>
+              <w:pStyle w:val="Compact"/>
+              <w:jc w:val="center"/>
+            </w:pPr>
+            <w:r>
+              <w:t xml:space="preserve">0.6749</w:t>
+            </w:r>
+          </w:p>
+        </w:tc>
+        <w:tc>
+          <w:tcPr/>
+          <w:p>
+            <w:pPr>
+              <w:pStyle w:val="Compact"/>
+              <w:jc w:val="center"/>
+            </w:pPr>
+            <w:r>
+              <w:t xml:space="preserve">0.1082</w:t>
             </w:r>
           </w:p>
         </w:tc>
@@ -1369,31 +1597,181 @@
               <w:jc w:val="center"/>
             </w:pPr>
             <w:r>
-              <w:t xml:space="preserve">Control 7days (n=1)</w:t>
-            </w:r>
-          </w:p>
-        </w:tc>
-        <w:tc>
-          <w:tcPr/>
-          <w:p>
-            <w:pPr>
-              <w:pStyle w:val="Compact"/>
-              <w:jc w:val="center"/>
-            </w:pPr>
-            <w:r>
-              <w:t xml:space="preserve">0.7328</w:t>
-            </w:r>
-          </w:p>
-        </w:tc>
-        <w:tc>
-          <w:tcPr/>
-          <w:p>
-            <w:pPr>
-              <w:pStyle w:val="Compact"/>
-              <w:jc w:val="center"/>
-            </w:pPr>
-            <w:r>
-              <w:t xml:space="preserve">0</w:t>
+              <w:t xml:space="preserve">Control 7days (n=10)</w:t>
+            </w:r>
+          </w:p>
+        </w:tc>
+        <w:tc>
+          <w:tcPr/>
+          <w:p>
+            <w:pPr>
+              <w:pStyle w:val="Compact"/>
+              <w:jc w:val="center"/>
+            </w:pPr>
+            <w:r>
+              <w:t xml:space="preserve">0.5322</w:t>
+            </w:r>
+          </w:p>
+        </w:tc>
+        <w:tc>
+          <w:tcPr/>
+          <w:p>
+            <w:pPr>
+              <w:pStyle w:val="Compact"/>
+              <w:jc w:val="center"/>
+            </w:pPr>
+            <w:r>
+              <w:t xml:space="preserve">0.1947</w:t>
+            </w:r>
+          </w:p>
+        </w:tc>
+      </w:tr>
+      <w:tr>
+        <w:tc>
+          <w:tcPr/>
+          <w:p>
+            <w:pPr>
+              <w:pStyle w:val="Compact"/>
+              <w:jc w:val="center"/>
+            </w:pPr>
+            <w:r>
+              <w:t xml:space="preserve">2</w:t>
+            </w:r>
+          </w:p>
+        </w:tc>
+        <w:tc>
+          <w:tcPr/>
+          <w:p>
+            <w:pPr>
+              <w:pStyle w:val="Compact"/>
+              <w:jc w:val="center"/>
+            </w:pPr>
+            <w:r>
+              <w:t xml:space="preserve">Folistatin 50ng/ml 14d (n=2)</w:t>
+            </w:r>
+          </w:p>
+        </w:tc>
+        <w:tc>
+          <w:tcPr/>
+          <w:p>
+            <w:pPr>
+              <w:pStyle w:val="Compact"/>
+              <w:jc w:val="center"/>
+            </w:pPr>
+            <w:r>
+              <w:t xml:space="preserve">0.7512</w:t>
+            </w:r>
+          </w:p>
+        </w:tc>
+        <w:tc>
+          <w:tcPr/>
+          <w:p>
+            <w:pPr>
+              <w:pStyle w:val="Compact"/>
+              <w:jc w:val="center"/>
+            </w:pPr>
+            <w:r>
+              <w:t xml:space="preserve">0.00719</w:t>
+            </w:r>
+          </w:p>
+        </w:tc>
+      </w:tr>
+      <w:tr>
+        <w:tc>
+          <w:tcPr/>
+          <w:p>
+            <w:pPr>
+              <w:pStyle w:val="Compact"/>
+              <w:jc w:val="center"/>
+            </w:pPr>
+            <w:r>
+              <w:t xml:space="preserve">2</w:t>
+            </w:r>
+          </w:p>
+        </w:tc>
+        <w:tc>
+          <w:tcPr/>
+          <w:p>
+            <w:pPr>
+              <w:pStyle w:val="Compact"/>
+              <w:jc w:val="center"/>
+            </w:pPr>
+            <w:r>
+              <w:t xml:space="preserve">Folistatin 50ng/ml 7d (n=11)</w:t>
+            </w:r>
+          </w:p>
+        </w:tc>
+        <w:tc>
+          <w:tcPr/>
+          <w:p>
+            <w:pPr>
+              <w:pStyle w:val="Compact"/>
+              <w:jc w:val="center"/>
+            </w:pPr>
+            <w:r>
+              <w:t xml:space="preserve">0.7085</w:t>
+            </w:r>
+          </w:p>
+        </w:tc>
+        <w:tc>
+          <w:tcPr/>
+          <w:p>
+            <w:pPr>
+              <w:pStyle w:val="Compact"/>
+              <w:jc w:val="center"/>
+            </w:pPr>
+            <w:r>
+              <w:t xml:space="preserve">0.09249</w:t>
+            </w:r>
+          </w:p>
+        </w:tc>
+      </w:tr>
+      <w:tr>
+        <w:tc>
+          <w:tcPr/>
+          <w:p>
+            <w:pPr>
+              <w:pStyle w:val="Compact"/>
+              <w:jc w:val="center"/>
+            </w:pPr>
+            <w:r>
+              <w:t xml:space="preserve">2</w:t>
+            </w:r>
+          </w:p>
+        </w:tc>
+        <w:tc>
+          <w:tcPr/>
+          <w:p>
+            <w:pPr>
+              <w:pStyle w:val="Compact"/>
+              <w:jc w:val="center"/>
+            </w:pPr>
+            <w:r>
+              <w:t xml:space="preserve">SMIFH2 10µM 14d (n=4)</w:t>
+            </w:r>
+          </w:p>
+        </w:tc>
+        <w:tc>
+          <w:tcPr/>
+          <w:p>
+            <w:pPr>
+              <w:pStyle w:val="Compact"/>
+              <w:jc w:val="center"/>
+            </w:pPr>
+            <w:r>
+              <w:t xml:space="preserve">0.8057</w:t>
+            </w:r>
+          </w:p>
+        </w:tc>
+        <w:tc>
+          <w:tcPr/>
+          <w:p>
+            <w:pPr>
+              <w:pStyle w:val="Compact"/>
+              <w:jc w:val="center"/>
+            </w:pPr>
+            <w:r>
+              <w:t xml:space="preserve">0.09063</w:t>
             </w:r>
           </w:p>
         </w:tc>
@@ -1519,31 +1897,31 @@
               <w:jc w:val="center"/>
             </w:pPr>
             <w:r>
-              <w:t xml:space="preserve">Control 14days (n=5)</w:t>
-            </w:r>
-          </w:p>
-        </w:tc>
-        <w:tc>
-          <w:tcPr/>
-          <w:p>
-            <w:pPr>
-              <w:pStyle w:val="Compact"/>
-              <w:jc w:val="center"/>
-            </w:pPr>
-            <w:r>
-              <w:t xml:space="preserve">0.6464</w:t>
-            </w:r>
-          </w:p>
-        </w:tc>
-        <w:tc>
-          <w:tcPr/>
-          <w:p>
-            <w:pPr>
-              <w:pStyle w:val="Compact"/>
-              <w:jc w:val="center"/>
-            </w:pPr>
-            <w:r>
-              <w:t xml:space="preserve">0.1258</w:t>
+              <w:t xml:space="preserve">Control 14days (n=9)</w:t>
+            </w:r>
+          </w:p>
+        </w:tc>
+        <w:tc>
+          <w:tcPr/>
+          <w:p>
+            <w:pPr>
+              <w:pStyle w:val="Compact"/>
+              <w:jc w:val="center"/>
+            </w:pPr>
+            <w:r>
+              <w:t xml:space="preserve">0.6863</w:t>
+            </w:r>
+          </w:p>
+        </w:tc>
+        <w:tc>
+          <w:tcPr/>
+          <w:p>
+            <w:pPr>
+              <w:pStyle w:val="Compact"/>
+              <w:jc w:val="center"/>
+            </w:pPr>
+            <w:r>
+              <w:t xml:space="preserve">0.1165</w:t>
             </w:r>
           </w:p>
         </w:tc>
@@ -1569,31 +1947,181 @@
               <w:jc w:val="center"/>
             </w:pPr>
             <w:r>
-              <w:t xml:space="preserve">Control 7days (n=1)</w:t>
-            </w:r>
-          </w:p>
-        </w:tc>
-        <w:tc>
-          <w:tcPr/>
-          <w:p>
-            <w:pPr>
-              <w:pStyle w:val="Compact"/>
-              <w:jc w:val="center"/>
-            </w:pPr>
-            <w:r>
-              <w:t xml:space="preserve">0.5733</w:t>
-            </w:r>
-          </w:p>
-        </w:tc>
-        <w:tc>
-          <w:tcPr/>
-          <w:p>
-            <w:pPr>
-              <w:pStyle w:val="Compact"/>
-              <w:jc w:val="center"/>
-            </w:pPr>
-            <w:r>
-              <w:t xml:space="preserve">0</w:t>
+              <w:t xml:space="preserve">Control 7days (n=10)</w:t>
+            </w:r>
+          </w:p>
+        </w:tc>
+        <w:tc>
+          <w:tcPr/>
+          <w:p>
+            <w:pPr>
+              <w:pStyle w:val="Compact"/>
+              <w:jc w:val="center"/>
+            </w:pPr>
+            <w:r>
+              <w:t xml:space="preserve">0.5417</w:t>
+            </w:r>
+          </w:p>
+        </w:tc>
+        <w:tc>
+          <w:tcPr/>
+          <w:p>
+            <w:pPr>
+              <w:pStyle w:val="Compact"/>
+              <w:jc w:val="center"/>
+            </w:pPr>
+            <w:r>
+              <w:t xml:space="preserve">0.1773</w:t>
+            </w:r>
+          </w:p>
+        </w:tc>
+      </w:tr>
+      <w:tr>
+        <w:tc>
+          <w:tcPr/>
+          <w:p>
+            <w:pPr>
+              <w:pStyle w:val="Compact"/>
+              <w:jc w:val="center"/>
+            </w:pPr>
+            <w:r>
+              <w:t xml:space="preserve">3</w:t>
+            </w:r>
+          </w:p>
+        </w:tc>
+        <w:tc>
+          <w:tcPr/>
+          <w:p>
+            <w:pPr>
+              <w:pStyle w:val="Compact"/>
+              <w:jc w:val="center"/>
+            </w:pPr>
+            <w:r>
+              <w:t xml:space="preserve">Folistatin 50ng/ml 14d (n=2)</w:t>
+            </w:r>
+          </w:p>
+        </w:tc>
+        <w:tc>
+          <w:tcPr/>
+          <w:p>
+            <w:pPr>
+              <w:pStyle w:val="Compact"/>
+              <w:jc w:val="center"/>
+            </w:pPr>
+            <w:r>
+              <w:t xml:space="preserve">0.7335</w:t>
+            </w:r>
+          </w:p>
+        </w:tc>
+        <w:tc>
+          <w:tcPr/>
+          <w:p>
+            <w:pPr>
+              <w:pStyle w:val="Compact"/>
+              <w:jc w:val="center"/>
+            </w:pPr>
+            <w:r>
+              <w:t xml:space="preserve">8.277e-05</w:t>
+            </w:r>
+          </w:p>
+        </w:tc>
+      </w:tr>
+      <w:tr>
+        <w:tc>
+          <w:tcPr/>
+          <w:p>
+            <w:pPr>
+              <w:pStyle w:val="Compact"/>
+              <w:jc w:val="center"/>
+            </w:pPr>
+            <w:r>
+              <w:t xml:space="preserve">3</w:t>
+            </w:r>
+          </w:p>
+        </w:tc>
+        <w:tc>
+          <w:tcPr/>
+          <w:p>
+            <w:pPr>
+              <w:pStyle w:val="Compact"/>
+              <w:jc w:val="center"/>
+            </w:pPr>
+            <w:r>
+              <w:t xml:space="preserve">Folistatin 50ng/ml 7d (n=11)</w:t>
+            </w:r>
+          </w:p>
+        </w:tc>
+        <w:tc>
+          <w:tcPr/>
+          <w:p>
+            <w:pPr>
+              <w:pStyle w:val="Compact"/>
+              <w:jc w:val="center"/>
+            </w:pPr>
+            <w:r>
+              <w:t xml:space="preserve">0.6585</w:t>
+            </w:r>
+          </w:p>
+        </w:tc>
+        <w:tc>
+          <w:tcPr/>
+          <w:p>
+            <w:pPr>
+              <w:pStyle w:val="Compact"/>
+              <w:jc w:val="center"/>
+            </w:pPr>
+            <w:r>
+              <w:t xml:space="preserve">0.09682</w:t>
+            </w:r>
+          </w:p>
+        </w:tc>
+      </w:tr>
+      <w:tr>
+        <w:tc>
+          <w:tcPr/>
+          <w:p>
+            <w:pPr>
+              <w:pStyle w:val="Compact"/>
+              <w:jc w:val="center"/>
+            </w:pPr>
+            <w:r>
+              <w:t xml:space="preserve">3</w:t>
+            </w:r>
+          </w:p>
+        </w:tc>
+        <w:tc>
+          <w:tcPr/>
+          <w:p>
+            <w:pPr>
+              <w:pStyle w:val="Compact"/>
+              <w:jc w:val="center"/>
+            </w:pPr>
+            <w:r>
+              <w:t xml:space="preserve">SMIFH2 10µM 14d (n=4)</w:t>
+            </w:r>
+          </w:p>
+        </w:tc>
+        <w:tc>
+          <w:tcPr/>
+          <w:p>
+            <w:pPr>
+              <w:pStyle w:val="Compact"/>
+              <w:jc w:val="center"/>
+            </w:pPr>
+            <w:r>
+              <w:t xml:space="preserve">0.728</w:t>
+            </w:r>
+          </w:p>
+        </w:tc>
+        <w:tc>
+          <w:tcPr/>
+          <w:p>
+            <w:pPr>
+              <w:pStyle w:val="Compact"/>
+              <w:jc w:val="center"/>
+            </w:pPr>
+            <w:r>
+              <w:t xml:space="preserve">0.1386</w:t>
             </w:r>
           </w:p>
         </w:tc>
@@ -1719,31 +2247,31 @@
               <w:jc w:val="center"/>
             </w:pPr>
             <w:r>
-              <w:t xml:space="preserve">Control 14days (n=5)</w:t>
-            </w:r>
-          </w:p>
-        </w:tc>
-        <w:tc>
-          <w:tcPr/>
-          <w:p>
-            <w:pPr>
-              <w:pStyle w:val="Compact"/>
-              <w:jc w:val="center"/>
-            </w:pPr>
-            <w:r>
-              <w:t xml:space="preserve">0.6256</w:t>
-            </w:r>
-          </w:p>
-        </w:tc>
-        <w:tc>
-          <w:tcPr/>
-          <w:p>
-            <w:pPr>
-              <w:pStyle w:val="Compact"/>
-              <w:jc w:val="center"/>
-            </w:pPr>
-            <w:r>
-              <w:t xml:space="preserve">0.1254</w:t>
+              <w:t xml:space="preserve">Control 14days (n=9)</w:t>
+            </w:r>
+          </w:p>
+        </w:tc>
+        <w:tc>
+          <w:tcPr/>
+          <w:p>
+            <w:pPr>
+              <w:pStyle w:val="Compact"/>
+              <w:jc w:val="center"/>
+            </w:pPr>
+            <w:r>
+              <w:t xml:space="preserve">0.665</w:t>
+            </w:r>
+          </w:p>
+        </w:tc>
+        <w:tc>
+          <w:tcPr/>
+          <w:p>
+            <w:pPr>
+              <w:pStyle w:val="Compact"/>
+              <w:jc w:val="center"/>
+            </w:pPr>
+            <w:r>
+              <w:t xml:space="preserve">0.1153</w:t>
             </w:r>
           </w:p>
         </w:tc>
@@ -1769,31 +2297,181 @@
               <w:jc w:val="center"/>
             </w:pPr>
             <w:r>
-              <w:t xml:space="preserve">Control 7days (n=1)</w:t>
-            </w:r>
-          </w:p>
-        </w:tc>
-        <w:tc>
-          <w:tcPr/>
-          <w:p>
-            <w:pPr>
-              <w:pStyle w:val="Compact"/>
-              <w:jc w:val="center"/>
-            </w:pPr>
-            <w:r>
-              <w:t xml:space="preserve">0.5603</w:t>
-            </w:r>
-          </w:p>
-        </w:tc>
-        <w:tc>
-          <w:tcPr/>
-          <w:p>
-            <w:pPr>
-              <w:pStyle w:val="Compact"/>
-              <w:jc w:val="center"/>
-            </w:pPr>
-            <w:r>
-              <w:t xml:space="preserve">0</w:t>
+              <w:t xml:space="preserve">Control 7days (n=10)</w:t>
+            </w:r>
+          </w:p>
+        </w:tc>
+        <w:tc>
+          <w:tcPr/>
+          <w:p>
+            <w:pPr>
+              <w:pStyle w:val="Compact"/>
+              <w:jc w:val="center"/>
+            </w:pPr>
+            <w:r>
+              <w:t xml:space="preserve">0.4856</w:t>
+            </w:r>
+          </w:p>
+        </w:tc>
+        <w:tc>
+          <w:tcPr/>
+          <w:p>
+            <w:pPr>
+              <w:pStyle w:val="Compact"/>
+              <w:jc w:val="center"/>
+            </w:pPr>
+            <w:r>
+              <w:t xml:space="preserve">0.151</w:t>
+            </w:r>
+          </w:p>
+        </w:tc>
+      </w:tr>
+      <w:tr>
+        <w:tc>
+          <w:tcPr/>
+          <w:p>
+            <w:pPr>
+              <w:pStyle w:val="Compact"/>
+              <w:jc w:val="center"/>
+            </w:pPr>
+            <w:r>
+              <w:t xml:space="preserve">4</w:t>
+            </w:r>
+          </w:p>
+        </w:tc>
+        <w:tc>
+          <w:tcPr/>
+          <w:p>
+            <w:pPr>
+              <w:pStyle w:val="Compact"/>
+              <w:jc w:val="center"/>
+            </w:pPr>
+            <w:r>
+              <w:t xml:space="preserve">Folistatin 50ng/ml 14d (n=2)</w:t>
+            </w:r>
+          </w:p>
+        </w:tc>
+        <w:tc>
+          <w:tcPr/>
+          <w:p>
+            <w:pPr>
+              <w:pStyle w:val="Compact"/>
+              <w:jc w:val="center"/>
+            </w:pPr>
+            <w:r>
+              <w:t xml:space="preserve">0.781</w:t>
+            </w:r>
+          </w:p>
+        </w:tc>
+        <w:tc>
+          <w:tcPr/>
+          <w:p>
+            <w:pPr>
+              <w:pStyle w:val="Compact"/>
+              <w:jc w:val="center"/>
+            </w:pPr>
+            <w:r>
+              <w:t xml:space="preserve">0.02785</w:t>
+            </w:r>
+          </w:p>
+        </w:tc>
+      </w:tr>
+      <w:tr>
+        <w:tc>
+          <w:tcPr/>
+          <w:p>
+            <w:pPr>
+              <w:pStyle w:val="Compact"/>
+              <w:jc w:val="center"/>
+            </w:pPr>
+            <w:r>
+              <w:t xml:space="preserve">4</w:t>
+            </w:r>
+          </w:p>
+        </w:tc>
+        <w:tc>
+          <w:tcPr/>
+          <w:p>
+            <w:pPr>
+              <w:pStyle w:val="Compact"/>
+              <w:jc w:val="center"/>
+            </w:pPr>
+            <w:r>
+              <w:t xml:space="preserve">Folistatin 50ng/ml 7d (n=11)</w:t>
+            </w:r>
+          </w:p>
+        </w:tc>
+        <w:tc>
+          <w:tcPr/>
+          <w:p>
+            <w:pPr>
+              <w:pStyle w:val="Compact"/>
+              <w:jc w:val="center"/>
+            </w:pPr>
+            <w:r>
+              <w:t xml:space="preserve">0.6567</w:t>
+            </w:r>
+          </w:p>
+        </w:tc>
+        <w:tc>
+          <w:tcPr/>
+          <w:p>
+            <w:pPr>
+              <w:pStyle w:val="Compact"/>
+              <w:jc w:val="center"/>
+            </w:pPr>
+            <w:r>
+              <w:t xml:space="preserve">0.08411</w:t>
+            </w:r>
+          </w:p>
+        </w:tc>
+      </w:tr>
+      <w:tr>
+        <w:tc>
+          <w:tcPr/>
+          <w:p>
+            <w:pPr>
+              <w:pStyle w:val="Compact"/>
+              <w:jc w:val="center"/>
+            </w:pPr>
+            <w:r>
+              <w:t xml:space="preserve">4</w:t>
+            </w:r>
+          </w:p>
+        </w:tc>
+        <w:tc>
+          <w:tcPr/>
+          <w:p>
+            <w:pPr>
+              <w:pStyle w:val="Compact"/>
+              <w:jc w:val="center"/>
+            </w:pPr>
+            <w:r>
+              <w:t xml:space="preserve">SMIFH2 10µM 14d (n=4)</w:t>
+            </w:r>
+          </w:p>
+        </w:tc>
+        <w:tc>
+          <w:tcPr/>
+          <w:p>
+            <w:pPr>
+              <w:pStyle w:val="Compact"/>
+              <w:jc w:val="center"/>
+            </w:pPr>
+            <w:r>
+              <w:t xml:space="preserve">0.6628</w:t>
+            </w:r>
+          </w:p>
+        </w:tc>
+        <w:tc>
+          <w:tcPr/>
+          <w:p>
+            <w:pPr>
+              <w:pStyle w:val="Compact"/>
+              <w:jc w:val="center"/>
+            </w:pPr>
+            <w:r>
+              <w:t xml:space="preserve">0.1091</w:t>
             </w:r>
           </w:p>
         </w:tc>
@@ -1919,31 +2597,31 @@
               <w:jc w:val="center"/>
             </w:pPr>
             <w:r>
-              <w:t xml:space="preserve">Control 14days (n=5)</w:t>
-            </w:r>
-          </w:p>
-        </w:tc>
-        <w:tc>
-          <w:tcPr/>
-          <w:p>
-            <w:pPr>
-              <w:pStyle w:val="Compact"/>
-              <w:jc w:val="center"/>
-            </w:pPr>
-            <w:r>
-              <w:t xml:space="preserve">0.5461</w:t>
-            </w:r>
-          </w:p>
-        </w:tc>
-        <w:tc>
-          <w:tcPr/>
-          <w:p>
-            <w:pPr>
-              <w:pStyle w:val="Compact"/>
-              <w:jc w:val="center"/>
-            </w:pPr>
-            <w:r>
-              <w:t xml:space="preserve">0.1919</w:t>
+              <w:t xml:space="preserve">Control 14days (n=9)</w:t>
+            </w:r>
+          </w:p>
+        </w:tc>
+        <w:tc>
+          <w:tcPr/>
+          <w:p>
+            <w:pPr>
+              <w:pStyle w:val="Compact"/>
+              <w:jc w:val="center"/>
+            </w:pPr>
+            <w:r>
+              <w:t xml:space="preserve">0.6013</w:t>
+            </w:r>
+          </w:p>
+        </w:tc>
+        <w:tc>
+          <w:tcPr/>
+          <w:p>
+            <w:pPr>
+              <w:pStyle w:val="Compact"/>
+              <w:jc w:val="center"/>
+            </w:pPr>
+            <w:r>
+              <w:t xml:space="preserve">0.1564</w:t>
             </w:r>
           </w:p>
         </w:tc>
@@ -1969,31 +2647,181 @@
               <w:jc w:val="center"/>
             </w:pPr>
             <w:r>
-              <w:t xml:space="preserve">Control 7days (n=1)</w:t>
-            </w:r>
-          </w:p>
-        </w:tc>
-        <w:tc>
-          <w:tcPr/>
-          <w:p>
-            <w:pPr>
-              <w:pStyle w:val="Compact"/>
-              <w:jc w:val="center"/>
-            </w:pPr>
-            <w:r>
-              <w:t xml:space="preserve">0.6897</w:t>
-            </w:r>
-          </w:p>
-        </w:tc>
-        <w:tc>
-          <w:tcPr/>
-          <w:p>
-            <w:pPr>
-              <w:pStyle w:val="Compact"/>
-              <w:jc w:val="center"/>
-            </w:pPr>
-            <w:r>
-              <w:t xml:space="preserve">0</w:t>
+              <w:t xml:space="preserve">Control 7days (n=10)</w:t>
+            </w:r>
+          </w:p>
+        </w:tc>
+        <w:tc>
+          <w:tcPr/>
+          <w:p>
+            <w:pPr>
+              <w:pStyle w:val="Compact"/>
+              <w:jc w:val="center"/>
+            </w:pPr>
+            <w:r>
+              <w:t xml:space="preserve">0.504</w:t>
+            </w:r>
+          </w:p>
+        </w:tc>
+        <w:tc>
+          <w:tcPr/>
+          <w:p>
+            <w:pPr>
+              <w:pStyle w:val="Compact"/>
+              <w:jc w:val="center"/>
+            </w:pPr>
+            <w:r>
+              <w:t xml:space="preserve">0.1224</w:t>
+            </w:r>
+          </w:p>
+        </w:tc>
+      </w:tr>
+      <w:tr>
+        <w:tc>
+          <w:tcPr/>
+          <w:p>
+            <w:pPr>
+              <w:pStyle w:val="Compact"/>
+              <w:jc w:val="center"/>
+            </w:pPr>
+            <w:r>
+              <w:t xml:space="preserve">5</w:t>
+            </w:r>
+          </w:p>
+        </w:tc>
+        <w:tc>
+          <w:tcPr/>
+          <w:p>
+            <w:pPr>
+              <w:pStyle w:val="Compact"/>
+              <w:jc w:val="center"/>
+            </w:pPr>
+            <w:r>
+              <w:t xml:space="preserve">Folistatin 50ng/ml 14d (n=2)</w:t>
+            </w:r>
+          </w:p>
+        </w:tc>
+        <w:tc>
+          <w:tcPr/>
+          <w:p>
+            <w:pPr>
+              <w:pStyle w:val="Compact"/>
+              <w:jc w:val="center"/>
+            </w:pPr>
+            <w:r>
+              <w:t xml:space="preserve">0.7408</w:t>
+            </w:r>
+          </w:p>
+        </w:tc>
+        <w:tc>
+          <w:tcPr/>
+          <w:p>
+            <w:pPr>
+              <w:pStyle w:val="Compact"/>
+              <w:jc w:val="center"/>
+            </w:pPr>
+            <w:r>
+              <w:t xml:space="preserve">0.009714</w:t>
+            </w:r>
+          </w:p>
+        </w:tc>
+      </w:tr>
+      <w:tr>
+        <w:tc>
+          <w:tcPr/>
+          <w:p>
+            <w:pPr>
+              <w:pStyle w:val="Compact"/>
+              <w:jc w:val="center"/>
+            </w:pPr>
+            <w:r>
+              <w:t xml:space="preserve">5</w:t>
+            </w:r>
+          </w:p>
+        </w:tc>
+        <w:tc>
+          <w:tcPr/>
+          <w:p>
+            <w:pPr>
+              <w:pStyle w:val="Compact"/>
+              <w:jc w:val="center"/>
+            </w:pPr>
+            <w:r>
+              <w:t xml:space="preserve">Folistatin 50ng/ml 7d (n=11)</w:t>
+            </w:r>
+          </w:p>
+        </w:tc>
+        <w:tc>
+          <w:tcPr/>
+          <w:p>
+            <w:pPr>
+              <w:pStyle w:val="Compact"/>
+              <w:jc w:val="center"/>
+            </w:pPr>
+            <w:r>
+              <w:t xml:space="preserve">0.6067</w:t>
+            </w:r>
+          </w:p>
+        </w:tc>
+        <w:tc>
+          <w:tcPr/>
+          <w:p>
+            <w:pPr>
+              <w:pStyle w:val="Compact"/>
+              <w:jc w:val="center"/>
+            </w:pPr>
+            <w:r>
+              <w:t xml:space="preserve">0.1108</w:t>
+            </w:r>
+          </w:p>
+        </w:tc>
+      </w:tr>
+      <w:tr>
+        <w:tc>
+          <w:tcPr/>
+          <w:p>
+            <w:pPr>
+              <w:pStyle w:val="Compact"/>
+              <w:jc w:val="center"/>
+            </w:pPr>
+            <w:r>
+              <w:t xml:space="preserve">5</w:t>
+            </w:r>
+          </w:p>
+        </w:tc>
+        <w:tc>
+          <w:tcPr/>
+          <w:p>
+            <w:pPr>
+              <w:pStyle w:val="Compact"/>
+              <w:jc w:val="center"/>
+            </w:pPr>
+            <w:r>
+              <w:t xml:space="preserve">SMIFH2 10µM 14d (n=4)</w:t>
+            </w:r>
+          </w:p>
+        </w:tc>
+        <w:tc>
+          <w:tcPr/>
+          <w:p>
+            <w:pPr>
+              <w:pStyle w:val="Compact"/>
+              <w:jc w:val="center"/>
+            </w:pPr>
+            <w:r>
+              <w:t xml:space="preserve">0.6116</w:t>
+            </w:r>
+          </w:p>
+        </w:tc>
+        <w:tc>
+          <w:tcPr/>
+          <w:p>
+            <w:pPr>
+              <w:pStyle w:val="Compact"/>
+              <w:jc w:val="center"/>
+            </w:pPr>
+            <w:r>
+              <w:t xml:space="preserve">0.1356</w:t>
             </w:r>
           </w:p>
         </w:tc>
@@ -2119,31 +2947,31 @@
               <w:jc w:val="center"/>
             </w:pPr>
             <w:r>
-              <w:t xml:space="preserve">Control 14days (n=5)</w:t>
-            </w:r>
-          </w:p>
-        </w:tc>
-        <w:tc>
-          <w:tcPr/>
-          <w:p>
-            <w:pPr>
-              <w:pStyle w:val="Compact"/>
-              <w:jc w:val="center"/>
-            </w:pPr>
-            <w:r>
-              <w:t xml:space="preserve">0.4624</w:t>
-            </w:r>
-          </w:p>
-        </w:tc>
-        <w:tc>
-          <w:tcPr/>
-          <w:p>
-            <w:pPr>
-              <w:pStyle w:val="Compact"/>
-              <w:jc w:val="center"/>
-            </w:pPr>
-            <w:r>
-              <w:t xml:space="preserve">0.1765</w:t>
+              <w:t xml:space="preserve">Control 14days (n=9)</w:t>
+            </w:r>
+          </w:p>
+        </w:tc>
+        <w:tc>
+          <w:tcPr/>
+          <w:p>
+            <w:pPr>
+              <w:pStyle w:val="Compact"/>
+              <w:jc w:val="center"/>
+            </w:pPr>
+            <w:r>
+              <w:t xml:space="preserve">0.5492</w:t>
+            </w:r>
+          </w:p>
+        </w:tc>
+        <w:tc>
+          <w:tcPr/>
+          <w:p>
+            <w:pPr>
+              <w:pStyle w:val="Compact"/>
+              <w:jc w:val="center"/>
+            </w:pPr>
+            <w:r>
+              <w:t xml:space="preserve">0.1763</w:t>
             </w:r>
           </w:p>
         </w:tc>
@@ -2169,31 +2997,181 @@
               <w:jc w:val="center"/>
             </w:pPr>
             <w:r>
-              <w:t xml:space="preserve">Control 7days (n=1)</w:t>
-            </w:r>
-          </w:p>
-        </w:tc>
-        <w:tc>
-          <w:tcPr/>
-          <w:p>
-            <w:pPr>
-              <w:pStyle w:val="Compact"/>
-              <w:jc w:val="center"/>
-            </w:pPr>
-            <w:r>
-              <w:t xml:space="preserve">0.6342</w:t>
-            </w:r>
-          </w:p>
-        </w:tc>
-        <w:tc>
-          <w:tcPr/>
-          <w:p>
-            <w:pPr>
-              <w:pStyle w:val="Compact"/>
-              <w:jc w:val="center"/>
-            </w:pPr>
-            <w:r>
-              <w:t xml:space="preserve">0</w:t>
+              <w:t xml:space="preserve">Control 7days (n=10)</w:t>
+            </w:r>
+          </w:p>
+        </w:tc>
+        <w:tc>
+          <w:tcPr/>
+          <w:p>
+            <w:pPr>
+              <w:pStyle w:val="Compact"/>
+              <w:jc w:val="center"/>
+            </w:pPr>
+            <w:r>
+              <w:t xml:space="preserve">0.4754</w:t>
+            </w:r>
+          </w:p>
+        </w:tc>
+        <w:tc>
+          <w:tcPr/>
+          <w:p>
+            <w:pPr>
+              <w:pStyle w:val="Compact"/>
+              <w:jc w:val="center"/>
+            </w:pPr>
+            <w:r>
+              <w:t xml:space="preserve">0.0994</w:t>
+            </w:r>
+          </w:p>
+        </w:tc>
+      </w:tr>
+      <w:tr>
+        <w:tc>
+          <w:tcPr/>
+          <w:p>
+            <w:pPr>
+              <w:pStyle w:val="Compact"/>
+              <w:jc w:val="center"/>
+            </w:pPr>
+            <w:r>
+              <w:t xml:space="preserve">6</w:t>
+            </w:r>
+          </w:p>
+        </w:tc>
+        <w:tc>
+          <w:tcPr/>
+          <w:p>
+            <w:pPr>
+              <w:pStyle w:val="Compact"/>
+              <w:jc w:val="center"/>
+            </w:pPr>
+            <w:r>
+              <w:t xml:space="preserve">Folistatin 50ng/ml 14d (n=2)</w:t>
+            </w:r>
+          </w:p>
+        </w:tc>
+        <w:tc>
+          <w:tcPr/>
+          <w:p>
+            <w:pPr>
+              <w:pStyle w:val="Compact"/>
+              <w:jc w:val="center"/>
+            </w:pPr>
+            <w:r>
+              <w:t xml:space="preserve">0.7148</w:t>
+            </w:r>
+          </w:p>
+        </w:tc>
+        <w:tc>
+          <w:tcPr/>
+          <w:p>
+            <w:pPr>
+              <w:pStyle w:val="Compact"/>
+              <w:jc w:val="center"/>
+            </w:pPr>
+            <w:r>
+              <w:t xml:space="preserve">0.02615</w:t>
+            </w:r>
+          </w:p>
+        </w:tc>
+      </w:tr>
+      <w:tr>
+        <w:tc>
+          <w:tcPr/>
+          <w:p>
+            <w:pPr>
+              <w:pStyle w:val="Compact"/>
+              <w:jc w:val="center"/>
+            </w:pPr>
+            <w:r>
+              <w:t xml:space="preserve">6</w:t>
+            </w:r>
+          </w:p>
+        </w:tc>
+        <w:tc>
+          <w:tcPr/>
+          <w:p>
+            <w:pPr>
+              <w:pStyle w:val="Compact"/>
+              <w:jc w:val="center"/>
+            </w:pPr>
+            <w:r>
+              <w:t xml:space="preserve">Folistatin 50ng/ml 7d (n=11)</w:t>
+            </w:r>
+          </w:p>
+        </w:tc>
+        <w:tc>
+          <w:tcPr/>
+          <w:p>
+            <w:pPr>
+              <w:pStyle w:val="Compact"/>
+              <w:jc w:val="center"/>
+            </w:pPr>
+            <w:r>
+              <w:t xml:space="preserve">0.533</w:t>
+            </w:r>
+          </w:p>
+        </w:tc>
+        <w:tc>
+          <w:tcPr/>
+          <w:p>
+            <w:pPr>
+              <w:pStyle w:val="Compact"/>
+              <w:jc w:val="center"/>
+            </w:pPr>
+            <w:r>
+              <w:t xml:space="preserve">0.1631</w:t>
+            </w:r>
+          </w:p>
+        </w:tc>
+      </w:tr>
+      <w:tr>
+        <w:tc>
+          <w:tcPr/>
+          <w:p>
+            <w:pPr>
+              <w:pStyle w:val="Compact"/>
+              <w:jc w:val="center"/>
+            </w:pPr>
+            <w:r>
+              <w:t xml:space="preserve">6</w:t>
+            </w:r>
+          </w:p>
+        </w:tc>
+        <w:tc>
+          <w:tcPr/>
+          <w:p>
+            <w:pPr>
+              <w:pStyle w:val="Compact"/>
+              <w:jc w:val="center"/>
+            </w:pPr>
+            <w:r>
+              <w:t xml:space="preserve">SMIFH2 10µM 14d (n=4)</w:t>
+            </w:r>
+          </w:p>
+        </w:tc>
+        <w:tc>
+          <w:tcPr/>
+          <w:p>
+            <w:pPr>
+              <w:pStyle w:val="Compact"/>
+              <w:jc w:val="center"/>
+            </w:pPr>
+            <w:r>
+              <w:t xml:space="preserve">0.6212</w:t>
+            </w:r>
+          </w:p>
+        </w:tc>
+        <w:tc>
+          <w:tcPr/>
+          <w:p>
+            <w:pPr>
+              <w:pStyle w:val="Compact"/>
+              <w:jc w:val="center"/>
+            </w:pPr>
+            <w:r>
+              <w:t xml:space="preserve">0.0688</w:t>
             </w:r>
           </w:p>
         </w:tc>
@@ -2319,31 +3297,31 @@
               <w:jc w:val="center"/>
             </w:pPr>
             <w:r>
-              <w:t xml:space="preserve">Control 14days (n=5)</w:t>
-            </w:r>
-          </w:p>
-        </w:tc>
-        <w:tc>
-          <w:tcPr/>
-          <w:p>
-            <w:pPr>
-              <w:pStyle w:val="Compact"/>
-              <w:jc w:val="center"/>
-            </w:pPr>
-            <w:r>
-              <w:t xml:space="preserve">0.4713</w:t>
-            </w:r>
-          </w:p>
-        </w:tc>
-        <w:tc>
-          <w:tcPr/>
-          <w:p>
-            <w:pPr>
-              <w:pStyle w:val="Compact"/>
-              <w:jc w:val="center"/>
-            </w:pPr>
-            <w:r>
-              <w:t xml:space="preserve">0.1801</w:t>
+              <w:t xml:space="preserve">Control 14days (n=9)</w:t>
+            </w:r>
+          </w:p>
+        </w:tc>
+        <w:tc>
+          <w:tcPr/>
+          <w:p>
+            <w:pPr>
+              <w:pStyle w:val="Compact"/>
+              <w:jc w:val="center"/>
+            </w:pPr>
+            <w:r>
+              <w:t xml:space="preserve">0.5385</w:t>
+            </w:r>
+          </w:p>
+        </w:tc>
+        <w:tc>
+          <w:tcPr/>
+          <w:p>
+            <w:pPr>
+              <w:pStyle w:val="Compact"/>
+              <w:jc w:val="center"/>
+            </w:pPr>
+            <w:r>
+              <w:t xml:space="preserve">0.1711</w:t>
             </w:r>
           </w:p>
         </w:tc>
@@ -2369,31 +3347,181 @@
               <w:jc w:val="center"/>
             </w:pPr>
             <w:r>
-              <w:t xml:space="preserve">Control 7days (n=1)</w:t>
-            </w:r>
-          </w:p>
-        </w:tc>
-        <w:tc>
-          <w:tcPr/>
-          <w:p>
-            <w:pPr>
-              <w:pStyle w:val="Compact"/>
-              <w:jc w:val="center"/>
-            </w:pPr>
-            <w:r>
-              <w:t xml:space="preserve">0.5293</w:t>
-            </w:r>
-          </w:p>
-        </w:tc>
-        <w:tc>
-          <w:tcPr/>
-          <w:p>
-            <w:pPr>
-              <w:pStyle w:val="Compact"/>
-              <w:jc w:val="center"/>
-            </w:pPr>
-            <w:r>
-              <w:t xml:space="preserve">0</w:t>
+              <w:t xml:space="preserve">Control 7days (n=10)</w:t>
+            </w:r>
+          </w:p>
+        </w:tc>
+        <w:tc>
+          <w:tcPr/>
+          <w:p>
+            <w:pPr>
+              <w:pStyle w:val="Compact"/>
+              <w:jc w:val="center"/>
+            </w:pPr>
+            <w:r>
+              <w:t xml:space="preserve">0.4225</w:t>
+            </w:r>
+          </w:p>
+        </w:tc>
+        <w:tc>
+          <w:tcPr/>
+          <w:p>
+            <w:pPr>
+              <w:pStyle w:val="Compact"/>
+              <w:jc w:val="center"/>
+            </w:pPr>
+            <w:r>
+              <w:t xml:space="preserve">0.1302</w:t>
+            </w:r>
+          </w:p>
+        </w:tc>
+      </w:tr>
+      <w:tr>
+        <w:tc>
+          <w:tcPr/>
+          <w:p>
+            <w:pPr>
+              <w:pStyle w:val="Compact"/>
+              <w:jc w:val="center"/>
+            </w:pPr>
+            <w:r>
+              <w:t xml:space="preserve">7</w:t>
+            </w:r>
+          </w:p>
+        </w:tc>
+        <w:tc>
+          <w:tcPr/>
+          <w:p>
+            <w:pPr>
+              <w:pStyle w:val="Compact"/>
+              <w:jc w:val="center"/>
+            </w:pPr>
+            <w:r>
+              <w:t xml:space="preserve">Folistatin 50ng/ml 14d (n=2)</w:t>
+            </w:r>
+          </w:p>
+        </w:tc>
+        <w:tc>
+          <w:tcPr/>
+          <w:p>
+            <w:pPr>
+              <w:pStyle w:val="Compact"/>
+              <w:jc w:val="center"/>
+            </w:pPr>
+            <w:r>
+              <w:t xml:space="preserve">0.6071</w:t>
+            </w:r>
+          </w:p>
+        </w:tc>
+        <w:tc>
+          <w:tcPr/>
+          <w:p>
+            <w:pPr>
+              <w:pStyle w:val="Compact"/>
+              <w:jc w:val="center"/>
+            </w:pPr>
+            <w:r>
+              <w:t xml:space="preserve">0.03077</w:t>
+            </w:r>
+          </w:p>
+        </w:tc>
+      </w:tr>
+      <w:tr>
+        <w:tc>
+          <w:tcPr/>
+          <w:p>
+            <w:pPr>
+              <w:pStyle w:val="Compact"/>
+              <w:jc w:val="center"/>
+            </w:pPr>
+            <w:r>
+              <w:t xml:space="preserve">7</w:t>
+            </w:r>
+          </w:p>
+        </w:tc>
+        <w:tc>
+          <w:tcPr/>
+          <w:p>
+            <w:pPr>
+              <w:pStyle w:val="Compact"/>
+              <w:jc w:val="center"/>
+            </w:pPr>
+            <w:r>
+              <w:t xml:space="preserve">Folistatin 50ng/ml 7d (n=11)</w:t>
+            </w:r>
+          </w:p>
+        </w:tc>
+        <w:tc>
+          <w:tcPr/>
+          <w:p>
+            <w:pPr>
+              <w:pStyle w:val="Compact"/>
+              <w:jc w:val="center"/>
+            </w:pPr>
+            <w:r>
+              <w:t xml:space="preserve">0.5005</w:t>
+            </w:r>
+          </w:p>
+        </w:tc>
+        <w:tc>
+          <w:tcPr/>
+          <w:p>
+            <w:pPr>
+              <w:pStyle w:val="Compact"/>
+              <w:jc w:val="center"/>
+            </w:pPr>
+            <w:r>
+              <w:t xml:space="preserve">0.1271</w:t>
+            </w:r>
+          </w:p>
+        </w:tc>
+      </w:tr>
+      <w:tr>
+        <w:tc>
+          <w:tcPr/>
+          <w:p>
+            <w:pPr>
+              <w:pStyle w:val="Compact"/>
+              <w:jc w:val="center"/>
+            </w:pPr>
+            <w:r>
+              <w:t xml:space="preserve">7</w:t>
+            </w:r>
+          </w:p>
+        </w:tc>
+        <w:tc>
+          <w:tcPr/>
+          <w:p>
+            <w:pPr>
+              <w:pStyle w:val="Compact"/>
+              <w:jc w:val="center"/>
+            </w:pPr>
+            <w:r>
+              <w:t xml:space="preserve">SMIFH2 10µM 14d (n=4)</w:t>
+            </w:r>
+          </w:p>
+        </w:tc>
+        <w:tc>
+          <w:tcPr/>
+          <w:p>
+            <w:pPr>
+              <w:pStyle w:val="Compact"/>
+              <w:jc w:val="center"/>
+            </w:pPr>
+            <w:r>
+              <w:t xml:space="preserve">0.492</w:t>
+            </w:r>
+          </w:p>
+        </w:tc>
+        <w:tc>
+          <w:tcPr/>
+          <w:p>
+            <w:pPr>
+              <w:pStyle w:val="Compact"/>
+              <w:jc w:val="center"/>
+            </w:pPr>
+            <w:r>
+              <w:t xml:space="preserve">0.08463</w:t>
             </w:r>
           </w:p>
         </w:tc>
@@ -2519,31 +3647,31 @@
               <w:jc w:val="center"/>
             </w:pPr>
             <w:r>
-              <w:t xml:space="preserve">Control 14days (n=5)</w:t>
-            </w:r>
-          </w:p>
-        </w:tc>
-        <w:tc>
-          <w:tcPr/>
-          <w:p>
-            <w:pPr>
-              <w:pStyle w:val="Compact"/>
-              <w:jc w:val="center"/>
-            </w:pPr>
-            <w:r>
-              <w:t xml:space="preserve">0.3819</w:t>
-            </w:r>
-          </w:p>
-        </w:tc>
-        <w:tc>
-          <w:tcPr/>
-          <w:p>
-            <w:pPr>
-              <w:pStyle w:val="Compact"/>
-              <w:jc w:val="center"/>
-            </w:pPr>
-            <w:r>
-              <w:t xml:space="preserve">0.1656</w:t>
+              <w:t xml:space="preserve">Control 14days (n=9)</w:t>
+            </w:r>
+          </w:p>
+        </w:tc>
+        <w:tc>
+          <w:tcPr/>
+          <w:p>
+            <w:pPr>
+              <w:pStyle w:val="Compact"/>
+              <w:jc w:val="center"/>
+            </w:pPr>
+            <w:r>
+              <w:t xml:space="preserve">0.4453</w:t>
+            </w:r>
+          </w:p>
+        </w:tc>
+        <w:tc>
+          <w:tcPr/>
+          <w:p>
+            <w:pPr>
+              <w:pStyle w:val="Compact"/>
+              <w:jc w:val="center"/>
+            </w:pPr>
+            <w:r>
+              <w:t xml:space="preserve">0.1535</w:t>
             </w:r>
           </w:p>
         </w:tc>
@@ -2569,31 +3697,181 @@
               <w:jc w:val="center"/>
             </w:pPr>
             <w:r>
-              <w:t xml:space="preserve">Control 7days (n=1)</w:t>
-            </w:r>
-          </w:p>
-        </w:tc>
-        <w:tc>
-          <w:tcPr/>
-          <w:p>
-            <w:pPr>
-              <w:pStyle w:val="Compact"/>
-              <w:jc w:val="center"/>
-            </w:pPr>
-            <w:r>
-              <w:t xml:space="preserve">0.3948</w:t>
-            </w:r>
-          </w:p>
-        </w:tc>
-        <w:tc>
-          <w:tcPr/>
-          <w:p>
-            <w:pPr>
-              <w:pStyle w:val="Compact"/>
-              <w:jc w:val="center"/>
-            </w:pPr>
-            <w:r>
-              <w:t xml:space="preserve">0</w:t>
+              <w:t xml:space="preserve">Control 7days (n=10)</w:t>
+            </w:r>
+          </w:p>
+        </w:tc>
+        <w:tc>
+          <w:tcPr/>
+          <w:p>
+            <w:pPr>
+              <w:pStyle w:val="Compact"/>
+              <w:jc w:val="center"/>
+            </w:pPr>
+            <w:r>
+              <w:t xml:space="preserve">0.3669</w:t>
+            </w:r>
+          </w:p>
+        </w:tc>
+        <w:tc>
+          <w:tcPr/>
+          <w:p>
+            <w:pPr>
+              <w:pStyle w:val="Compact"/>
+              <w:jc w:val="center"/>
+            </w:pPr>
+            <w:r>
+              <w:t xml:space="preserve">0.1187</w:t>
+            </w:r>
+          </w:p>
+        </w:tc>
+      </w:tr>
+      <w:tr>
+        <w:tc>
+          <w:tcPr/>
+          <w:p>
+            <w:pPr>
+              <w:pStyle w:val="Compact"/>
+              <w:jc w:val="center"/>
+            </w:pPr>
+            <w:r>
+              <w:t xml:space="preserve">8</w:t>
+            </w:r>
+          </w:p>
+        </w:tc>
+        <w:tc>
+          <w:tcPr/>
+          <w:p>
+            <w:pPr>
+              <w:pStyle w:val="Compact"/>
+              <w:jc w:val="center"/>
+            </w:pPr>
+            <w:r>
+              <w:t xml:space="preserve">Folistatin 50ng/ml 14d (n=2)</w:t>
+            </w:r>
+          </w:p>
+        </w:tc>
+        <w:tc>
+          <w:tcPr/>
+          <w:p>
+            <w:pPr>
+              <w:pStyle w:val="Compact"/>
+              <w:jc w:val="center"/>
+            </w:pPr>
+            <w:r>
+              <w:t xml:space="preserve">0.6051</w:t>
+            </w:r>
+          </w:p>
+        </w:tc>
+        <w:tc>
+          <w:tcPr/>
+          <w:p>
+            <w:pPr>
+              <w:pStyle w:val="Compact"/>
+              <w:jc w:val="center"/>
+            </w:pPr>
+            <w:r>
+              <w:t xml:space="preserve">0.0802</w:t>
+            </w:r>
+          </w:p>
+        </w:tc>
+      </w:tr>
+      <w:tr>
+        <w:tc>
+          <w:tcPr/>
+          <w:p>
+            <w:pPr>
+              <w:pStyle w:val="Compact"/>
+              <w:jc w:val="center"/>
+            </w:pPr>
+            <w:r>
+              <w:t xml:space="preserve">8</w:t>
+            </w:r>
+          </w:p>
+        </w:tc>
+        <w:tc>
+          <w:tcPr/>
+          <w:p>
+            <w:pPr>
+              <w:pStyle w:val="Compact"/>
+              <w:jc w:val="center"/>
+            </w:pPr>
+            <w:r>
+              <w:t xml:space="preserve">Folistatin 50ng/ml 7d (n=11)</w:t>
+            </w:r>
+          </w:p>
+        </w:tc>
+        <w:tc>
+          <w:tcPr/>
+          <w:p>
+            <w:pPr>
+              <w:pStyle w:val="Compact"/>
+              <w:jc w:val="center"/>
+            </w:pPr>
+            <w:r>
+              <w:t xml:space="preserve">0.4466</w:t>
+            </w:r>
+          </w:p>
+        </w:tc>
+        <w:tc>
+          <w:tcPr/>
+          <w:p>
+            <w:pPr>
+              <w:pStyle w:val="Compact"/>
+              <w:jc w:val="center"/>
+            </w:pPr>
+            <w:r>
+              <w:t xml:space="preserve">0.1297</w:t>
+            </w:r>
+          </w:p>
+        </w:tc>
+      </w:tr>
+      <w:tr>
+        <w:tc>
+          <w:tcPr/>
+          <w:p>
+            <w:pPr>
+              <w:pStyle w:val="Compact"/>
+              <w:jc w:val="center"/>
+            </w:pPr>
+            <w:r>
+              <w:t xml:space="preserve">8</w:t>
+            </w:r>
+          </w:p>
+        </w:tc>
+        <w:tc>
+          <w:tcPr/>
+          <w:p>
+            <w:pPr>
+              <w:pStyle w:val="Compact"/>
+              <w:jc w:val="center"/>
+            </w:pPr>
+            <w:r>
+              <w:t xml:space="preserve">SMIFH2 10µM 14d (n=4)</w:t>
+            </w:r>
+          </w:p>
+        </w:tc>
+        <w:tc>
+          <w:tcPr/>
+          <w:p>
+            <w:pPr>
+              <w:pStyle w:val="Compact"/>
+              <w:jc w:val="center"/>
+            </w:pPr>
+            <w:r>
+              <w:t xml:space="preserve">0.4492</w:t>
+            </w:r>
+          </w:p>
+        </w:tc>
+        <w:tc>
+          <w:tcPr/>
+          <w:p>
+            <w:pPr>
+              <w:pStyle w:val="Compact"/>
+              <w:jc w:val="center"/>
+            </w:pPr>
+            <w:r>
+              <w:t xml:space="preserve">0.09618</w:t>
             </w:r>
           </w:p>
         </w:tc>
@@ -2719,31 +3997,31 @@
               <w:jc w:val="center"/>
             </w:pPr>
             <w:r>
-              <w:t xml:space="preserve">Control 14days (n=5)</w:t>
-            </w:r>
-          </w:p>
-        </w:tc>
-        <w:tc>
-          <w:tcPr/>
-          <w:p>
-            <w:pPr>
-              <w:pStyle w:val="Compact"/>
-              <w:jc w:val="center"/>
-            </w:pPr>
-            <w:r>
-              <w:t xml:space="preserve">0.3226</w:t>
-            </w:r>
-          </w:p>
-        </w:tc>
-        <w:tc>
-          <w:tcPr/>
-          <w:p>
-            <w:pPr>
-              <w:pStyle w:val="Compact"/>
-              <w:jc w:val="center"/>
-            </w:pPr>
-            <w:r>
-              <w:t xml:space="preserve">0.1672</w:t>
+              <w:t xml:space="preserve">Control 14days (n=9)</w:t>
+            </w:r>
+          </w:p>
+        </w:tc>
+        <w:tc>
+          <w:tcPr/>
+          <w:p>
+            <w:pPr>
+              <w:pStyle w:val="Compact"/>
+              <w:jc w:val="center"/>
+            </w:pPr>
+            <w:r>
+              <w:t xml:space="preserve">0.3633</w:t>
+            </w:r>
+          </w:p>
+        </w:tc>
+        <w:tc>
+          <w:tcPr/>
+          <w:p>
+            <w:pPr>
+              <w:pStyle w:val="Compact"/>
+              <w:jc w:val="center"/>
+            </w:pPr>
+            <w:r>
+              <w:t xml:space="preserve">0.1463</w:t>
             </w:r>
           </w:p>
         </w:tc>
@@ -2769,31 +4047,181 @@
               <w:jc w:val="center"/>
             </w:pPr>
             <w:r>
-              <w:t xml:space="preserve">Control 7days (n=1)</w:t>
-            </w:r>
-          </w:p>
-        </w:tc>
-        <w:tc>
-          <w:tcPr/>
-          <w:p>
-            <w:pPr>
-              <w:pStyle w:val="Compact"/>
-              <w:jc w:val="center"/>
-            </w:pPr>
-            <w:r>
-              <w:t xml:space="preserve">0.1613</w:t>
-            </w:r>
-          </w:p>
-        </w:tc>
-        <w:tc>
-          <w:tcPr/>
-          <w:p>
-            <w:pPr>
-              <w:pStyle w:val="Compact"/>
-              <w:jc w:val="center"/>
-            </w:pPr>
-            <w:r>
-              <w:t xml:space="preserve">0</w:t>
+              <w:t xml:space="preserve">Control 7days (n=10)</w:t>
+            </w:r>
+          </w:p>
+        </w:tc>
+        <w:tc>
+          <w:tcPr/>
+          <w:p>
+            <w:pPr>
+              <w:pStyle w:val="Compact"/>
+              <w:jc w:val="center"/>
+            </w:pPr>
+            <w:r>
+              <w:t xml:space="preserve">0.3</w:t>
+            </w:r>
+          </w:p>
+        </w:tc>
+        <w:tc>
+          <w:tcPr/>
+          <w:p>
+            <w:pPr>
+              <w:pStyle w:val="Compact"/>
+              <w:jc w:val="center"/>
+            </w:pPr>
+            <w:r>
+              <w:t xml:space="preserve">0.14</w:t>
+            </w:r>
+          </w:p>
+        </w:tc>
+      </w:tr>
+      <w:tr>
+        <w:tc>
+          <w:tcPr/>
+          <w:p>
+            <w:pPr>
+              <w:pStyle w:val="Compact"/>
+              <w:jc w:val="center"/>
+            </w:pPr>
+            <w:r>
+              <w:t xml:space="preserve">9</w:t>
+            </w:r>
+          </w:p>
+        </w:tc>
+        <w:tc>
+          <w:tcPr/>
+          <w:p>
+            <w:pPr>
+              <w:pStyle w:val="Compact"/>
+              <w:jc w:val="center"/>
+            </w:pPr>
+            <w:r>
+              <w:t xml:space="preserve">Folistatin 50ng/ml 14d (n=2)</w:t>
+            </w:r>
+          </w:p>
+        </w:tc>
+        <w:tc>
+          <w:tcPr/>
+          <w:p>
+            <w:pPr>
+              <w:pStyle w:val="Compact"/>
+              <w:jc w:val="center"/>
+            </w:pPr>
+            <w:r>
+              <w:t xml:space="preserve">0.4558</w:t>
+            </w:r>
+          </w:p>
+        </w:tc>
+        <w:tc>
+          <w:tcPr/>
+          <w:p>
+            <w:pPr>
+              <w:pStyle w:val="Compact"/>
+              <w:jc w:val="center"/>
+            </w:pPr>
+            <w:r>
+              <w:t xml:space="preserve">0.08312</w:t>
+            </w:r>
+          </w:p>
+        </w:tc>
+      </w:tr>
+      <w:tr>
+        <w:tc>
+          <w:tcPr/>
+          <w:p>
+            <w:pPr>
+              <w:pStyle w:val="Compact"/>
+              <w:jc w:val="center"/>
+            </w:pPr>
+            <w:r>
+              <w:t xml:space="preserve">9</w:t>
+            </w:r>
+          </w:p>
+        </w:tc>
+        <w:tc>
+          <w:tcPr/>
+          <w:p>
+            <w:pPr>
+              <w:pStyle w:val="Compact"/>
+              <w:jc w:val="center"/>
+            </w:pPr>
+            <w:r>
+              <w:t xml:space="preserve">Folistatin 50ng/ml 7d (n=11)</w:t>
+            </w:r>
+          </w:p>
+        </w:tc>
+        <w:tc>
+          <w:tcPr/>
+          <w:p>
+            <w:pPr>
+              <w:pStyle w:val="Compact"/>
+              <w:jc w:val="center"/>
+            </w:pPr>
+            <w:r>
+              <w:t xml:space="preserve">0.3408</w:t>
+            </w:r>
+          </w:p>
+        </w:tc>
+        <w:tc>
+          <w:tcPr/>
+          <w:p>
+            <w:pPr>
+              <w:pStyle w:val="Compact"/>
+              <w:jc w:val="center"/>
+            </w:pPr>
+            <w:r>
+              <w:t xml:space="preserve">0.09633</w:t>
+            </w:r>
+          </w:p>
+        </w:tc>
+      </w:tr>
+      <w:tr>
+        <w:tc>
+          <w:tcPr/>
+          <w:p>
+            <w:pPr>
+              <w:pStyle w:val="Compact"/>
+              <w:jc w:val="center"/>
+            </w:pPr>
+            <w:r>
+              <w:t xml:space="preserve">9</w:t>
+            </w:r>
+          </w:p>
+        </w:tc>
+        <w:tc>
+          <w:tcPr/>
+          <w:p>
+            <w:pPr>
+              <w:pStyle w:val="Compact"/>
+              <w:jc w:val="center"/>
+            </w:pPr>
+            <w:r>
+              <w:t xml:space="preserve">SMIFH2 10µM 14d (n=4)</w:t>
+            </w:r>
+          </w:p>
+        </w:tc>
+        <w:tc>
+          <w:tcPr/>
+          <w:p>
+            <w:pPr>
+              <w:pStyle w:val="Compact"/>
+              <w:jc w:val="center"/>
+            </w:pPr>
+            <w:r>
+              <w:t xml:space="preserve">0.3504</w:t>
+            </w:r>
+          </w:p>
+        </w:tc>
+        <w:tc>
+          <w:tcPr/>
+          <w:p>
+            <w:pPr>
+              <w:pStyle w:val="Compact"/>
+              <w:jc w:val="center"/>
+            </w:pPr>
+            <w:r>
+              <w:t xml:space="preserve">0.05462</w:t>
             </w:r>
           </w:p>
         </w:tc>
@@ -2919,31 +4347,31 @@
               <w:jc w:val="center"/>
             </w:pPr>
             <w:r>
-              <w:t xml:space="preserve">Control 14days (n=5)</w:t>
-            </w:r>
-          </w:p>
-        </w:tc>
-        <w:tc>
-          <w:tcPr/>
-          <w:p>
-            <w:pPr>
-              <w:pStyle w:val="Compact"/>
-              <w:jc w:val="center"/>
-            </w:pPr>
-            <w:r>
-              <w:t xml:space="preserve">0.1504</w:t>
-            </w:r>
-          </w:p>
-        </w:tc>
-        <w:tc>
-          <w:tcPr/>
-          <w:p>
-            <w:pPr>
-              <w:pStyle w:val="Compact"/>
-              <w:jc w:val="center"/>
-            </w:pPr>
-            <w:r>
-              <w:t xml:space="preserve">0.08223</w:t>
+              <w:t xml:space="preserve">Control 14days (n=9)</w:t>
+            </w:r>
+          </w:p>
+        </w:tc>
+        <w:tc>
+          <w:tcPr/>
+          <w:p>
+            <w:pPr>
+              <w:pStyle w:val="Compact"/>
+              <w:jc w:val="center"/>
+            </w:pPr>
+            <w:r>
+              <w:t xml:space="preserve">0.1647</w:t>
+            </w:r>
+          </w:p>
+        </w:tc>
+        <w:tc>
+          <w:tcPr/>
+          <w:p>
+            <w:pPr>
+              <w:pStyle w:val="Compact"/>
+              <w:jc w:val="center"/>
+            </w:pPr>
+            <w:r>
+              <w:t xml:space="preserve">0.07225</w:t>
             </w:r>
           </w:p>
         </w:tc>
@@ -2969,31 +4397,181 @@
               <w:jc w:val="center"/>
             </w:pPr>
             <w:r>
-              <w:t xml:space="preserve">Control 7days (n=1)</w:t>
-            </w:r>
-          </w:p>
-        </w:tc>
-        <w:tc>
-          <w:tcPr/>
-          <w:p>
-            <w:pPr>
-              <w:pStyle w:val="Compact"/>
-              <w:jc w:val="center"/>
-            </w:pPr>
-            <w:r>
-              <w:t xml:space="preserve">0.181</w:t>
-            </w:r>
-          </w:p>
-        </w:tc>
-        <w:tc>
-          <w:tcPr/>
-          <w:p>
-            <w:pPr>
-              <w:pStyle w:val="Compact"/>
-              <w:jc w:val="center"/>
-            </w:pPr>
-            <w:r>
-              <w:t xml:space="preserve">0</w:t>
+              <w:t xml:space="preserve">Control 7days (n=10)</w:t>
+            </w:r>
+          </w:p>
+        </w:tc>
+        <w:tc>
+          <w:tcPr/>
+          <w:p>
+            <w:pPr>
+              <w:pStyle w:val="Compact"/>
+              <w:jc w:val="center"/>
+            </w:pPr>
+            <w:r>
+              <w:t xml:space="preserve">0.1844</w:t>
+            </w:r>
+          </w:p>
+        </w:tc>
+        <w:tc>
+          <w:tcPr/>
+          <w:p>
+            <w:pPr>
+              <w:pStyle w:val="Compact"/>
+              <w:jc w:val="center"/>
+            </w:pPr>
+            <w:r>
+              <w:t xml:space="preserve">0.1108</w:t>
+            </w:r>
+          </w:p>
+        </w:tc>
+      </w:tr>
+      <w:tr>
+        <w:tc>
+          <w:tcPr/>
+          <w:p>
+            <w:pPr>
+              <w:pStyle w:val="Compact"/>
+              <w:jc w:val="center"/>
+            </w:pPr>
+            <w:r>
+              <w:t xml:space="preserve">10</w:t>
+            </w:r>
+          </w:p>
+        </w:tc>
+        <w:tc>
+          <w:tcPr/>
+          <w:p>
+            <w:pPr>
+              <w:pStyle w:val="Compact"/>
+              <w:jc w:val="center"/>
+            </w:pPr>
+            <w:r>
+              <w:t xml:space="preserve">Folistatin 50ng/ml 14d (n=2)</w:t>
+            </w:r>
+          </w:p>
+        </w:tc>
+        <w:tc>
+          <w:tcPr/>
+          <w:p>
+            <w:pPr>
+              <w:pStyle w:val="Compact"/>
+              <w:jc w:val="center"/>
+            </w:pPr>
+            <w:r>
+              <w:t xml:space="preserve">0.2537</w:t>
+            </w:r>
+          </w:p>
+        </w:tc>
+        <w:tc>
+          <w:tcPr/>
+          <w:p>
+            <w:pPr>
+              <w:pStyle w:val="Compact"/>
+              <w:jc w:val="center"/>
+            </w:pPr>
+            <w:r>
+              <w:t xml:space="preserve">0.002749</w:t>
+            </w:r>
+          </w:p>
+        </w:tc>
+      </w:tr>
+      <w:tr>
+        <w:tc>
+          <w:tcPr/>
+          <w:p>
+            <w:pPr>
+              <w:pStyle w:val="Compact"/>
+              <w:jc w:val="center"/>
+            </w:pPr>
+            <w:r>
+              <w:t xml:space="preserve">10</w:t>
+            </w:r>
+          </w:p>
+        </w:tc>
+        <w:tc>
+          <w:tcPr/>
+          <w:p>
+            <w:pPr>
+              <w:pStyle w:val="Compact"/>
+              <w:jc w:val="center"/>
+            </w:pPr>
+            <w:r>
+              <w:t xml:space="preserve">Folistatin 50ng/ml 7d (n=11)</w:t>
+            </w:r>
+          </w:p>
+        </w:tc>
+        <w:tc>
+          <w:tcPr/>
+          <w:p>
+            <w:pPr>
+              <w:pStyle w:val="Compact"/>
+              <w:jc w:val="center"/>
+            </w:pPr>
+            <w:r>
+              <w:t xml:space="preserve">0.2201</w:t>
+            </w:r>
+          </w:p>
+        </w:tc>
+        <w:tc>
+          <w:tcPr/>
+          <w:p>
+            <w:pPr>
+              <w:pStyle w:val="Compact"/>
+              <w:jc w:val="center"/>
+            </w:pPr>
+            <w:r>
+              <w:t xml:space="preserve">0.08443</w:t>
+            </w:r>
+          </w:p>
+        </w:tc>
+      </w:tr>
+      <w:tr>
+        <w:tc>
+          <w:tcPr/>
+          <w:p>
+            <w:pPr>
+              <w:pStyle w:val="Compact"/>
+              <w:jc w:val="center"/>
+            </w:pPr>
+            <w:r>
+              <w:t xml:space="preserve">10</w:t>
+            </w:r>
+          </w:p>
+        </w:tc>
+        <w:tc>
+          <w:tcPr/>
+          <w:p>
+            <w:pPr>
+              <w:pStyle w:val="Compact"/>
+              <w:jc w:val="center"/>
+            </w:pPr>
+            <w:r>
+              <w:t xml:space="preserve">SMIFH2 10µM 14d (n=4)</w:t>
+            </w:r>
+          </w:p>
+        </w:tc>
+        <w:tc>
+          <w:tcPr/>
+          <w:p>
+            <w:pPr>
+              <w:pStyle w:val="Compact"/>
+              <w:jc w:val="center"/>
+            </w:pPr>
+            <w:r>
+              <w:t xml:space="preserve">0.1615</w:t>
+            </w:r>
+          </w:p>
+        </w:tc>
+        <w:tc>
+          <w:tcPr/>
+          <w:p>
+            <w:pPr>
+              <w:pStyle w:val="Compact"/>
+              <w:jc w:val="center"/>
+            </w:pPr>
+            <w:r>
+              <w:t xml:space="preserve">0.05758</w:t>
             </w:r>
           </w:p>
         </w:tc>

</xml_diff>